<commit_message>
docs(audit): rapport AUD-SEC-2026-10-05 v1.2, corrections deployees en production
AUD-05, AUD-07 et AUD-10 verifies en production (commit 3ef4f49).

Co-Authored-By: Claude Opus 5.5 (1M context) <noreply@anthropic.com>
</commit_message>
<xml_diff>
--- a/docs/audit/Rapport_audit_securite_ONEPRINT_2026-10-05.docx
+++ b/docs/audit/Rapport_audit_securite_ONEPRINT_2026-10-05.docx
@@ -258,7 +258,7 @@
                 <w:sz w:val="19"/>
                 <w:szCs w:val="19"/>
               </w:rPr>
-              <w:t>1.1 (ajout des actions réalisées et de leur conformité)</w:t>
+              <w:t>1.2 (corrections de code déployées en production)</w:t>
             </w:r>
           </w:p>
         </w:tc>
@@ -498,7 +498,7 @@
                 <w:sz w:val="19"/>
                 <w:szCs w:val="19"/>
               </w:rPr>
-              <w:t>Corrections base et authentification appliquées et vérifiées ; corrections code validées en local, à déployer</w:t>
+              <w:t>Corrections base, authentification et code appliquées, déployées et vérifiées en production</w:t>
             </w:r>
           </w:p>
         </w:tc>
@@ -527,7 +527,7 @@
     <w:sdt>
       <w:sdtPr>
         <w:alias w:val="Sommaire"/>
-        <w:id w:val="1566527545"/>
+        <w:id w:val="-61789822"/>
       </w:sdtPr>
       <w:sdtEndPr/>
       <w:sdtContent>
@@ -555,7 +555,7 @@
           <w:r>
             <w:fldChar w:fldCharType="separate"/>
           </w:r>
-          <w:hyperlink w:anchor="_Toc242107999" w:history="1">
+          <w:hyperlink w:anchor="_Toc242114127" w:history="1">
             <w:r>
               <w:rPr>
                 <w:rStyle w:val="Lienhypertexte"/>
@@ -579,7 +579,7 @@
               <w:rPr>
                 <w:noProof/>
               </w:rPr>
-              <w:instrText xml:space="preserve"> PAGEREF _Toc242107999 \h </w:instrText>
+              <w:instrText xml:space="preserve"> PAGEREF _Toc242114127 \h </w:instrText>
             </w:r>
             <w:r>
               <w:rPr>
@@ -621,7 +621,7 @@
               <w14:ligatures w14:val="standardContextual"/>
             </w:rPr>
           </w:pPr>
-          <w:hyperlink w:anchor="_Toc242108000" w:history="1">
+          <w:hyperlink w:anchor="_Toc242114128" w:history="1">
             <w:r>
               <w:rPr>
                 <w:rStyle w:val="Lienhypertexte"/>
@@ -645,7 +645,7 @@
               <w:rPr>
                 <w:noProof/>
               </w:rPr>
-              <w:instrText xml:space="preserve"> PAGEREF _Toc242108000 \h </w:instrText>
+              <w:instrText xml:space="preserve"> PAGEREF _Toc242114128 \h </w:instrText>
             </w:r>
             <w:r>
               <w:rPr>
@@ -687,7 +687,7 @@
               <w14:ligatures w14:val="standardContextual"/>
             </w:rPr>
           </w:pPr>
-          <w:hyperlink w:anchor="_Toc242108001" w:history="1">
+          <w:hyperlink w:anchor="_Toc242114129" w:history="1">
             <w:r>
               <w:rPr>
                 <w:rStyle w:val="Lienhypertexte"/>
@@ -711,7 +711,7 @@
               <w:rPr>
                 <w:noProof/>
               </w:rPr>
-              <w:instrText xml:space="preserve"> PAGEREF _Toc242108001 \h </w:instrText>
+              <w:instrText xml:space="preserve"> PAGEREF _Toc242114129 \h </w:instrText>
             </w:r>
             <w:r>
               <w:rPr>
@@ -753,7 +753,7 @@
               <w14:ligatures w14:val="standardContextual"/>
             </w:rPr>
           </w:pPr>
-          <w:hyperlink w:anchor="_Toc242108002" w:history="1">
+          <w:hyperlink w:anchor="_Toc242114130" w:history="1">
             <w:r>
               <w:rPr>
                 <w:rStyle w:val="Lienhypertexte"/>
@@ -777,7 +777,7 @@
               <w:rPr>
                 <w:noProof/>
               </w:rPr>
-              <w:instrText xml:space="preserve"> PAGEREF _Toc242108002 \h </w:instrText>
+              <w:instrText xml:space="preserve"> PAGEREF _Toc242114130 \h </w:instrText>
             </w:r>
             <w:r>
               <w:rPr>
@@ -819,7 +819,7 @@
               <w14:ligatures w14:val="standardContextual"/>
             </w:rPr>
           </w:pPr>
-          <w:hyperlink w:anchor="_Toc242108003" w:history="1">
+          <w:hyperlink w:anchor="_Toc242114131" w:history="1">
             <w:r>
               <w:rPr>
                 <w:rStyle w:val="Lienhypertexte"/>
@@ -843,7 +843,7 @@
               <w:rPr>
                 <w:noProof/>
               </w:rPr>
-              <w:instrText xml:space="preserve"> PAGEREF _Toc242108003 \h </w:instrText>
+              <w:instrText xml:space="preserve"> PAGEREF _Toc242114131 \h </w:instrText>
             </w:r>
             <w:r>
               <w:rPr>
@@ -885,7 +885,7 @@
               <w14:ligatures w14:val="standardContextual"/>
             </w:rPr>
           </w:pPr>
-          <w:hyperlink w:anchor="_Toc242108004" w:history="1">
+          <w:hyperlink w:anchor="_Toc242114132" w:history="1">
             <w:r>
               <w:rPr>
                 <w:rStyle w:val="Lienhypertexte"/>
@@ -909,7 +909,7 @@
               <w:rPr>
                 <w:noProof/>
               </w:rPr>
-              <w:instrText xml:space="preserve"> PAGEREF _Toc242108004 \h </w:instrText>
+              <w:instrText xml:space="preserve"> PAGEREF _Toc242114132 \h </w:instrText>
             </w:r>
             <w:r>
               <w:rPr>
@@ -951,7 +951,7 @@
               <w14:ligatures w14:val="standardContextual"/>
             </w:rPr>
           </w:pPr>
-          <w:hyperlink w:anchor="_Toc242108005" w:history="1">
+          <w:hyperlink w:anchor="_Toc242114133" w:history="1">
             <w:r>
               <w:rPr>
                 <w:rStyle w:val="Lienhypertexte"/>
@@ -975,7 +975,7 @@
               <w:rPr>
                 <w:noProof/>
               </w:rPr>
-              <w:instrText xml:space="preserve"> PAGEREF _Toc242108005 \h </w:instrText>
+              <w:instrText xml:space="preserve"> PAGEREF _Toc242114133 \h </w:instrText>
             </w:r>
             <w:r>
               <w:rPr>
@@ -1017,7 +1017,7 @@
               <w14:ligatures w14:val="standardContextual"/>
             </w:rPr>
           </w:pPr>
-          <w:hyperlink w:anchor="_Toc242108006" w:history="1">
+          <w:hyperlink w:anchor="_Toc242114134" w:history="1">
             <w:r>
               <w:rPr>
                 <w:rStyle w:val="Lienhypertexte"/>
@@ -1041,7 +1041,7 @@
               <w:rPr>
                 <w:noProof/>
               </w:rPr>
-              <w:instrText xml:space="preserve"> PAGEREF _Toc242108006 \h </w:instrText>
+              <w:instrText xml:space="preserve"> PAGEREF _Toc242114134 \h </w:instrText>
             </w:r>
             <w:r>
               <w:rPr>
@@ -1083,7 +1083,7 @@
               <w14:ligatures w14:val="standardContextual"/>
             </w:rPr>
           </w:pPr>
-          <w:hyperlink w:anchor="_Toc242108007" w:history="1">
+          <w:hyperlink w:anchor="_Toc242114135" w:history="1">
             <w:r>
               <w:rPr>
                 <w:rStyle w:val="Lienhypertexte"/>
@@ -1107,7 +1107,7 @@
               <w:rPr>
                 <w:noProof/>
               </w:rPr>
-              <w:instrText xml:space="preserve"> PAGEREF _Toc242108007 \h </w:instrText>
+              <w:instrText xml:space="preserve"> PAGEREF _Toc242114135 \h </w:instrText>
             </w:r>
             <w:r>
               <w:rPr>
@@ -1149,7 +1149,7 @@
               <w14:ligatures w14:val="standardContextual"/>
             </w:rPr>
           </w:pPr>
-          <w:hyperlink w:anchor="_Toc242108008" w:history="1">
+          <w:hyperlink w:anchor="_Toc242114136" w:history="1">
             <w:r>
               <w:rPr>
                 <w:rStyle w:val="Lienhypertexte"/>
@@ -1173,7 +1173,7 @@
               <w:rPr>
                 <w:noProof/>
               </w:rPr>
-              <w:instrText xml:space="preserve"> PAGEREF _Toc242108008 \h </w:instrText>
+              <w:instrText xml:space="preserve"> PAGEREF _Toc242114136 \h </w:instrText>
             </w:r>
             <w:r>
               <w:rPr>
@@ -1215,7 +1215,7 @@
               <w14:ligatures w14:val="standardContextual"/>
             </w:rPr>
           </w:pPr>
-          <w:hyperlink w:anchor="_Toc242108009" w:history="1">
+          <w:hyperlink w:anchor="_Toc242114137" w:history="1">
             <w:r>
               <w:rPr>
                 <w:rStyle w:val="Lienhypertexte"/>
@@ -1239,7 +1239,7 @@
               <w:rPr>
                 <w:noProof/>
               </w:rPr>
-              <w:instrText xml:space="preserve"> PAGEREF _Toc242108009 \h </w:instrText>
+              <w:instrText xml:space="preserve"> PAGEREF _Toc242114137 \h </w:instrText>
             </w:r>
             <w:r>
               <w:rPr>
@@ -1281,7 +1281,7 @@
               <w14:ligatures w14:val="standardContextual"/>
             </w:rPr>
           </w:pPr>
-          <w:hyperlink w:anchor="_Toc242108010" w:history="1">
+          <w:hyperlink w:anchor="_Toc242114138" w:history="1">
             <w:r>
               <w:rPr>
                 <w:rStyle w:val="Lienhypertexte"/>
@@ -1305,7 +1305,7 @@
               <w:rPr>
                 <w:noProof/>
               </w:rPr>
-              <w:instrText xml:space="preserve"> PAGEREF _Toc242108010 \h </w:instrText>
+              <w:instrText xml:space="preserve"> PAGEREF _Toc242114138 \h </w:instrText>
             </w:r>
             <w:r>
               <w:rPr>
@@ -1347,7 +1347,7 @@
               <w14:ligatures w14:val="standardContextual"/>
             </w:rPr>
           </w:pPr>
-          <w:hyperlink w:anchor="_Toc242108011" w:history="1">
+          <w:hyperlink w:anchor="_Toc242114139" w:history="1">
             <w:r>
               <w:rPr>
                 <w:rStyle w:val="Lienhypertexte"/>
@@ -1371,7 +1371,7 @@
               <w:rPr>
                 <w:noProof/>
               </w:rPr>
-              <w:instrText xml:space="preserve"> PAGEREF _Toc242108011 \h </w:instrText>
+              <w:instrText xml:space="preserve"> PAGEREF _Toc242114139 \h </w:instrText>
             </w:r>
             <w:r>
               <w:rPr>
@@ -1413,7 +1413,7 @@
               <w14:ligatures w14:val="standardContextual"/>
             </w:rPr>
           </w:pPr>
-          <w:hyperlink w:anchor="_Toc242108012" w:history="1">
+          <w:hyperlink w:anchor="_Toc242114140" w:history="1">
             <w:r>
               <w:rPr>
                 <w:rStyle w:val="Lienhypertexte"/>
@@ -1437,7 +1437,7 @@
               <w:rPr>
                 <w:noProof/>
               </w:rPr>
-              <w:instrText xml:space="preserve"> PAGEREF _Toc242108012 \h </w:instrText>
+              <w:instrText xml:space="preserve"> PAGEREF _Toc242114140 \h </w:instrText>
             </w:r>
             <w:r>
               <w:rPr>
@@ -1479,7 +1479,7 @@
               <w14:ligatures w14:val="standardContextual"/>
             </w:rPr>
           </w:pPr>
-          <w:hyperlink w:anchor="_Toc242108013" w:history="1">
+          <w:hyperlink w:anchor="_Toc242114141" w:history="1">
             <w:r>
               <w:rPr>
                 <w:rStyle w:val="Lienhypertexte"/>
@@ -1503,7 +1503,7 @@
               <w:rPr>
                 <w:noProof/>
               </w:rPr>
-              <w:instrText xml:space="preserve"> PAGEREF _Toc242108013 \h </w:instrText>
+              <w:instrText xml:space="preserve"> PAGEREF _Toc242114141 \h </w:instrText>
             </w:r>
             <w:r>
               <w:rPr>
@@ -1545,7 +1545,7 @@
               <w14:ligatures w14:val="standardContextual"/>
             </w:rPr>
           </w:pPr>
-          <w:hyperlink w:anchor="_Toc242108014" w:history="1">
+          <w:hyperlink w:anchor="_Toc242114142" w:history="1">
             <w:r>
               <w:rPr>
                 <w:rStyle w:val="Lienhypertexte"/>
@@ -1569,7 +1569,7 @@
               <w:rPr>
                 <w:noProof/>
               </w:rPr>
-              <w:instrText xml:space="preserve"> PAGEREF _Toc242108014 \h </w:instrText>
+              <w:instrText xml:space="preserve"> PAGEREF _Toc242114142 \h </w:instrText>
             </w:r>
             <w:r>
               <w:rPr>
@@ -1611,7 +1611,7 @@
               <w14:ligatures w14:val="standardContextual"/>
             </w:rPr>
           </w:pPr>
-          <w:hyperlink w:anchor="_Toc242108015" w:history="1">
+          <w:hyperlink w:anchor="_Toc242114143" w:history="1">
             <w:r>
               <w:rPr>
                 <w:rStyle w:val="Lienhypertexte"/>
@@ -1635,7 +1635,7 @@
               <w:rPr>
                 <w:noProof/>
               </w:rPr>
-              <w:instrText xml:space="preserve"> PAGEREF _Toc242108015 \h </w:instrText>
+              <w:instrText xml:space="preserve"> PAGEREF _Toc242114143 \h </w:instrText>
             </w:r>
             <w:r>
               <w:rPr>
@@ -1677,7 +1677,7 @@
               <w14:ligatures w14:val="standardContextual"/>
             </w:rPr>
           </w:pPr>
-          <w:hyperlink w:anchor="_Toc242108016" w:history="1">
+          <w:hyperlink w:anchor="_Toc242114144" w:history="1">
             <w:r>
               <w:rPr>
                 <w:rStyle w:val="Lienhypertexte"/>
@@ -1701,7 +1701,7 @@
               <w:rPr>
                 <w:noProof/>
               </w:rPr>
-              <w:instrText xml:space="preserve"> PAGEREF _Toc242108016 \h </w:instrText>
+              <w:instrText xml:space="preserve"> PAGEREF _Toc242114144 \h </w:instrText>
             </w:r>
             <w:r>
               <w:rPr>
@@ -1743,7 +1743,7 @@
               <w14:ligatures w14:val="standardContextual"/>
             </w:rPr>
           </w:pPr>
-          <w:hyperlink w:anchor="_Toc242108017" w:history="1">
+          <w:hyperlink w:anchor="_Toc242114145" w:history="1">
             <w:r>
               <w:rPr>
                 <w:rStyle w:val="Lienhypertexte"/>
@@ -1767,7 +1767,7 @@
               <w:rPr>
                 <w:noProof/>
               </w:rPr>
-              <w:instrText xml:space="preserve"> PAGEREF _Toc242108017 \h </w:instrText>
+              <w:instrText xml:space="preserve"> PAGEREF _Toc242114145 \h </w:instrText>
             </w:r>
             <w:r>
               <w:rPr>
@@ -1809,7 +1809,7 @@
               <w14:ligatures w14:val="standardContextual"/>
             </w:rPr>
           </w:pPr>
-          <w:hyperlink w:anchor="_Toc242108018" w:history="1">
+          <w:hyperlink w:anchor="_Toc242114146" w:history="1">
             <w:r>
               <w:rPr>
                 <w:rStyle w:val="Lienhypertexte"/>
@@ -1833,7 +1833,7 @@
               <w:rPr>
                 <w:noProof/>
               </w:rPr>
-              <w:instrText xml:space="preserve"> PAGEREF _Toc242108018 \h </w:instrText>
+              <w:instrText xml:space="preserve"> PAGEREF _Toc242114146 \h </w:instrText>
             </w:r>
             <w:r>
               <w:rPr>
@@ -1876,7 +1876,7 @@
       <w:pPr>
         <w:pStyle w:val="Titre1"/>
       </w:pPr>
-      <w:bookmarkStart w:id="0" w:name="_Toc242107999"/>
+      <w:bookmarkStart w:id="0" w:name="_Toc242114127"/>
       <w:r>
         <w:t>1. Objet et périmètre</w:t>
       </w:r>
@@ -2009,7 +2009,7 @@
       <w:pPr>
         <w:pStyle w:val="Titre1"/>
       </w:pPr>
-      <w:bookmarkStart w:id="1" w:name="_Toc242108000"/>
+      <w:bookmarkStart w:id="1" w:name="_Toc242114128"/>
       <w:r>
         <w:t>2. Méthode</w:t>
       </w:r>
@@ -2035,7 +2035,7 @@
       <w:pPr>
         <w:pStyle w:val="Titre1"/>
       </w:pPr>
-      <w:bookmarkStart w:id="2" w:name="_Toc242108001"/>
+      <w:bookmarkStart w:id="2" w:name="_Toc242114129"/>
       <w:r>
         <w:t>3. Synthèse</w:t>
       </w:r>
@@ -2790,7 +2790,7 @@
                 <w:sz w:val="19"/>
                 <w:szCs w:val="19"/>
               </w:rPr>
-              <w:t>Corrigé, à déployer</w:t>
+              <w:t>Corrigé</w:t>
             </w:r>
           </w:p>
         </w:tc>
@@ -3390,7 +3390,7 @@
                 <w:sz w:val="19"/>
                 <w:szCs w:val="19"/>
               </w:rPr>
-              <w:t>Corrigé, à déployer</w:t>
+              <w:t>Corrigé</w:t>
             </w:r>
           </w:p>
         </w:tc>
@@ -3406,7 +3406,7 @@
         <w:spacing w:after="120"/>
       </w:pPr>
       <w:r>
-        <w:t>Bilan : 10 constats. 6 corrigés, 2 corrigés dans le code et à déployer, 1 partiellement corrigé (AUD-07, domaine à confirmer), 1 risque accepté (AUD-02).</w:t>
+        <w:t>Bilan : 10 constats. 8 corrigés, 1 partiellement corrigé (AUD-07, domaine à confirmer), 1 risque accepté (AUD-02).</w:t>
       </w:r>
     </w:p>
     <w:p>
@@ -3418,7 +3418,7 @@
       <w:pPr>
         <w:pStyle w:val="Titre1"/>
       </w:pPr>
-      <w:bookmarkStart w:id="3" w:name="_Toc242108002"/>
+      <w:bookmarkStart w:id="3" w:name="_Toc242114130"/>
       <w:r>
         <w:t>4. Constats et actions correctives</w:t>
       </w:r>
@@ -3428,7 +3428,7 @@
       <w:pPr>
         <w:pStyle w:val="Titre2"/>
       </w:pPr>
-      <w:bookmarkStart w:id="4" w:name="_Toc242108003"/>
+      <w:bookmarkStart w:id="4" w:name="_Toc242114131"/>
       <w:r>
         <w:t>AUD-01 : Modification du workflow devis/commande par le client</w:t>
       </w:r>
@@ -3920,7 +3920,7 @@
       <w:pPr>
         <w:pStyle w:val="Titre2"/>
       </w:pPr>
-      <w:bookmarkStart w:id="5" w:name="_Toc242108004"/>
+      <w:bookmarkStart w:id="5" w:name="_Toc242114132"/>
       <w:r>
         <w:t>AUD-02 : Tarification calculée côté navigateur</w:t>
       </w:r>
@@ -4412,7 +4412,7 @@
       <w:pPr>
         <w:pStyle w:val="Titre2"/>
       </w:pPr>
-      <w:bookmarkStart w:id="6" w:name="_Toc242108005"/>
+      <w:bookmarkStart w:id="6" w:name="_Toc242114133"/>
       <w:r>
         <w:t>AUD-03 : Suppression de la fiche client par le client</w:t>
       </w:r>
@@ -4904,7 +4904,7 @@
       <w:pPr>
         <w:pStyle w:val="Titre2"/>
       </w:pPr>
-      <w:bookmarkStart w:id="7" w:name="_Toc242108006"/>
+      <w:bookmarkStart w:id="7" w:name="_Toc242114134"/>
       <w:r>
         <w:t>AUD-04 : Chemins de fichiers Storage non contrôlés</w:t>
       </w:r>
@@ -5396,7 +5396,7 @@
       <w:pPr>
         <w:pStyle w:val="Titre2"/>
       </w:pPr>
-      <w:bookmarkStart w:id="8" w:name="_Toc242108007"/>
+      <w:bookmarkStart w:id="8" w:name="_Toc242114135"/>
       <w:r>
         <w:t>AUD-05 : Absence de limitation sur la route d'email de commande</w:t>
       </w:r>
@@ -5806,7 +5806,7 @@
                 <w:sz w:val="19"/>
                 <w:szCs w:val="19"/>
               </w:rPr>
-              <w:t>Compilation et vérification TypeScript OK. Appel non authentifié refusé (401) sur serveur local.</w:t>
+              <w:t>Compilation et vérification TypeScript OK. Déployé en production le 05/10/2026 (commit 3ef4f49, déploiement Vercel réussi) : appel non authentifié refusé (401) sur https://oneortho-print3d.vercel.app.</w:t>
             </w:r>
           </w:p>
         </w:tc>
@@ -5873,7 +5873,7 @@
                 <w:sz w:val="19"/>
                 <w:szCs w:val="19"/>
               </w:rPr>
-              <w:t>Corrigé, à déployer</w:t>
+              <w:t>Corrigé</w:t>
             </w:r>
           </w:p>
         </w:tc>
@@ -5888,7 +5888,7 @@
       <w:pPr>
         <w:pStyle w:val="Titre2"/>
       </w:pPr>
-      <w:bookmarkStart w:id="9" w:name="_Toc242108008"/>
+      <w:bookmarkStart w:id="9" w:name="_Toc242114136"/>
       <w:r>
         <w:t>AUD-06 : Bucket Storage sans restriction de type ni de taille</w:t>
       </w:r>
@@ -6380,7 +6380,7 @@
       <w:pPr>
         <w:pStyle w:val="Titre2"/>
       </w:pPr>
-      <w:bookmarkStart w:id="10" w:name="_Toc242108009"/>
+      <w:bookmarkStart w:id="10" w:name="_Toc242114137"/>
       <w:r>
         <w:t>AUD-07 : En-têtes HTTP de sécurité absents</w:t>
       </w:r>
@@ -6790,7 +6790,7 @@
                 <w:sz w:val="19"/>
                 <w:szCs w:val="19"/>
               </w:rPr>
-              <w:t>4 en-têtes présents sur la réponse de /panier (serveur de production local).</w:t>
+              <w:t>Déployé en production le 05/10/2026 (commit 3ef4f49, déploiement Vercel réussi) : les 4 en-têtes sont présents sur https://oneortho-print3d.vercel.app/panier. frame-ancestors en attente du domaine OneOrtho.</w:t>
             </w:r>
           </w:p>
         </w:tc>
@@ -6872,7 +6872,7 @@
       <w:pPr>
         <w:pStyle w:val="Titre2"/>
       </w:pPr>
-      <w:bookmarkStart w:id="11" w:name="_Toc242108010"/>
+      <w:bookmarkStart w:id="11" w:name="_Toc242114138"/>
       <w:r>
         <w:t>AUD-08 : Alertes de l'advisor Supabase et privilèges</w:t>
       </w:r>
@@ -7364,7 +7364,7 @@
       <w:pPr>
         <w:pStyle w:val="Titre2"/>
       </w:pPr>
-      <w:bookmarkStart w:id="12" w:name="_Toc242108011"/>
+      <w:bookmarkStart w:id="12" w:name="_Toc242114139"/>
       <w:r>
         <w:t>AUD-09 : Plusieurs commandes possibles sur un même devis</w:t>
       </w:r>
@@ -7856,7 +7856,7 @@
       <w:pPr>
         <w:pStyle w:val="Titre2"/>
       </w:pPr>
-      <w:bookmarkStart w:id="13" w:name="_Toc242108012"/>
+      <w:bookmarkStart w:id="13" w:name="_Toc242114140"/>
       <w:r>
         <w:t>AUD-10 : Dépendances vulnérables</w:t>
       </w:r>
@@ -8266,7 +8266,7 @@
                 <w:sz w:val="19"/>
                 <w:szCs w:val="19"/>
               </w:rPr>
-              <w:t>npm audit : 0 vulnérabilité. npm run build : compilation, TypeScript et génération des 14 routes OK.</w:t>
+              <w:t>npm audit : 0 vulnérabilité. npm run build : compilation, TypeScript et génération des 14 routes OK. Déployé en production le 05/10/2026 (commit 3ef4f49, déploiement Vercel réussi).</w:t>
             </w:r>
           </w:p>
         </w:tc>
@@ -8333,7 +8333,7 @@
                 <w:sz w:val="19"/>
                 <w:szCs w:val="19"/>
               </w:rPr>
-              <w:t>Corrigé, à déployer</w:t>
+              <w:t>Corrigé</w:t>
             </w:r>
           </w:p>
         </w:tc>
@@ -8348,7 +8348,7 @@
       <w:pPr>
         <w:pStyle w:val="Titre1"/>
       </w:pPr>
-      <w:bookmarkStart w:id="14" w:name="_Toc242108013"/>
+      <w:bookmarkStart w:id="14" w:name="_Toc242114141"/>
       <w:r>
         <w:t>5. Points vérifiés conformes</w:t>
       </w:r>
@@ -8449,7 +8449,7 @@
       <w:pPr>
         <w:pStyle w:val="Titre1"/>
       </w:pPr>
-      <w:bookmarkStart w:id="15" w:name="_Toc242108014"/>
+      <w:bookmarkStart w:id="15" w:name="_Toc242114142"/>
       <w:r>
         <w:t>6. Actions réalisées et conformité</w:t>
       </w:r>
@@ -8929,7 +8929,7 @@
                 <w:sz w:val="19"/>
                 <w:szCs w:val="19"/>
               </w:rPr>
-              <w:t>Conforme en local : compilation et TypeScript OK, appel non authentifié refusé (401). À déployer.</w:t>
+              <w:t>Conforme en production : appel non authentifié refusé (401) sur oneortho-print3d.vercel.app (commit 3ef4f49).</w:t>
             </w:r>
           </w:p>
         </w:tc>
@@ -9016,7 +9016,7 @@
                 <w:sz w:val="19"/>
                 <w:szCs w:val="19"/>
               </w:rPr>
-              <w:t>Conforme en local : en-têtes présents sur serveur de production local. À déployer.</w:t>
+              <w:t>Conforme en production : 4 en-têtes présents sur oneortho-print3d.vercel.app (commit 3ef4f49).</w:t>
             </w:r>
           </w:p>
         </w:tc>
@@ -9103,7 +9103,7 @@
                 <w:sz w:val="19"/>
                 <w:szCs w:val="19"/>
               </w:rPr>
-              <w:t>Conforme : npm audit 0 vulnérabilité, build de production OK. À déployer.</w:t>
+              <w:t>Conforme en production : npm audit 0 vulnérabilité, build Vercel réussi (commit 3ef4f49).</w:t>
             </w:r>
           </w:p>
         </w:tc>
@@ -9200,7 +9200,7 @@
       <w:pPr>
         <w:pStyle w:val="Titre1"/>
       </w:pPr>
-      <w:bookmarkStart w:id="16" w:name="_Toc242108015"/>
+      <w:bookmarkStart w:id="16" w:name="_Toc242114143"/>
       <w:r>
         <w:t>7. Actions restantes</w:t>
       </w:r>
@@ -9358,92 +9358,6 @@
                 <w:sz w:val="19"/>
                 <w:szCs w:val="19"/>
               </w:rPr>
-              <w:t>AUD-05/07/10</w:t>
-            </w:r>
-          </w:p>
-        </w:tc>
-        <w:tc>
-          <w:tcPr>
-            <w:tcW w:w="5338" w:type="dxa"/>
-            <w:tcBorders>
-              <w:top w:val="single" w:sz="4" w:space="0" w:color="E2DED2"/>
-              <w:left w:val="single" w:sz="4" w:space="0" w:color="E2DED2"/>
-              <w:bottom w:val="single" w:sz="4" w:space="0" w:color="E2DED2"/>
-              <w:right w:val="single" w:sz="4" w:space="0" w:color="E2DED2"/>
-            </w:tcBorders>
-            <w:tcMar>
-              <w:top w:w="70" w:type="dxa"/>
-              <w:left w:w="110" w:type="dxa"/>
-              <w:bottom w:w="70" w:type="dxa"/>
-              <w:right w:w="110" w:type="dxa"/>
-            </w:tcMar>
-          </w:tcPr>
-          <w:p>
-            <w:r>
-              <w:rPr>
-                <w:sz w:val="19"/>
-                <w:szCs w:val="19"/>
-              </w:rPr>
-              <w:t>Commiter et déployer les corrections de code (route email, en-têtes, mise à jour Next.js).</w:t>
-            </w:r>
-          </w:p>
-        </w:tc>
-        <w:tc>
-          <w:tcPr>
-            <w:tcW w:w="3000" w:type="dxa"/>
-            <w:tcBorders>
-              <w:top w:val="single" w:sz="4" w:space="0" w:color="E2DED2"/>
-              <w:left w:val="single" w:sz="4" w:space="0" w:color="E2DED2"/>
-              <w:bottom w:val="single" w:sz="4" w:space="0" w:color="E2DED2"/>
-              <w:right w:val="single" w:sz="4" w:space="0" w:color="E2DED2"/>
-            </w:tcBorders>
-            <w:tcMar>
-              <w:top w:w="70" w:type="dxa"/>
-              <w:left w:w="110" w:type="dxa"/>
-              <w:bottom w:w="70" w:type="dxa"/>
-              <w:right w:w="110" w:type="dxa"/>
-            </w:tcMar>
-          </w:tcPr>
-          <w:p>
-            <w:r>
-              <w:rPr>
-                <w:sz w:val="19"/>
-                <w:szCs w:val="19"/>
-              </w:rPr>
-              <w:t>À attribuer</w:t>
-            </w:r>
-          </w:p>
-        </w:tc>
-      </w:tr>
-      <w:tr>
-        <w:tblPrEx>
-          <w:tblCellMar>
-            <w:top w:w="0" w:type="dxa"/>
-            <w:bottom w:w="0" w:type="dxa"/>
-          </w:tblCellMar>
-        </w:tblPrEx>
-        <w:tc>
-          <w:tcPr>
-            <w:tcW w:w="1300" w:type="dxa"/>
-            <w:tcBorders>
-              <w:top w:val="single" w:sz="4" w:space="0" w:color="E2DED2"/>
-              <w:left w:val="single" w:sz="4" w:space="0" w:color="E2DED2"/>
-              <w:bottom w:val="single" w:sz="4" w:space="0" w:color="E2DED2"/>
-              <w:right w:val="single" w:sz="4" w:space="0" w:color="E2DED2"/>
-            </w:tcBorders>
-            <w:tcMar>
-              <w:top w:w="70" w:type="dxa"/>
-              <w:left w:w="110" w:type="dxa"/>
-              <w:bottom w:w="70" w:type="dxa"/>
-              <w:right w:w="110" w:type="dxa"/>
-            </w:tcMar>
-          </w:tcPr>
-          <w:p>
-            <w:r>
-              <w:rPr>
-                <w:sz w:val="19"/>
-                <w:szCs w:val="19"/>
-              </w:rPr>
               <w:t>AUD-07</w:t>
             </w:r>
           </w:p>
@@ -9855,7 +9769,7 @@
       <w:pPr>
         <w:pStyle w:val="Titre1"/>
       </w:pPr>
-      <w:bookmarkStart w:id="17" w:name="_Toc242108016"/>
+      <w:bookmarkStart w:id="17" w:name="_Toc242114144"/>
       <w:r>
         <w:t>Annexe A. Fichiers modifiés</w:t>
       </w:r>
@@ -10269,14 +10183,14 @@
         <w:spacing w:after="120"/>
       </w:pPr>
       <w:r>
-        <w:t>Les deux migrations ont été exécutées en une seule fois (script consolidé) dans le SQL Editor Supabase le 05/10/2026.</w:t>
+        <w:t>Les deux migrations ont été exécutées en une seule fois (script consolidé) dans le SQL Editor Supabase le 05/10/2026. L'ensemble des fichiers est versionné dans le commit 3ef4f49 (branche main), déployé en production sur Vercel le 05/10/2026.</w:t>
       </w:r>
     </w:p>
     <w:p>
       <w:pPr>
         <w:pStyle w:val="Titre1"/>
       </w:pPr>
-      <w:bookmarkStart w:id="18" w:name="_Toc242108017"/>
+      <w:bookmarkStart w:id="18" w:name="_Toc242114145"/>
       <w:r>
         <w:t>Annexe B. Script de test des politiques RLS</w:t>
       </w:r>
@@ -10579,7 +10493,7 @@
       <w:pPr>
         <w:pStyle w:val="Titre1"/>
       </w:pPr>
-      <w:bookmarkStart w:id="19" w:name="_Toc242108018"/>
+      <w:bookmarkStart w:id="19" w:name="_Toc242114146"/>
       <w:r>
         <w:t>Annexe C. État des politiques RLS après correction</w:t>
       </w:r>
@@ -11666,7 +11580,7 @@
         <w:sz w:val="16"/>
         <w:szCs w:val="16"/>
       </w:rPr>
-      <w:t>AUD-SEC-2026-10-05 · v1.1</w:t>
+      <w:t>AUD-SEC-2026-10-05 · v1.2</w:t>
     </w:r>
   </w:p>
 </w:hdr>
@@ -11675,10 +11589,10 @@
 <file path=word/numbering.xml><?xml version="1.0" encoding="utf-8"?>
 <w:numbering xmlns:wpc="http://schemas.microsoft.com/office/word/2010/wordprocessingCanvas" xmlns:cx="http://schemas.microsoft.com/office/drawing/2014/chartex" xmlns:cx1="http://schemas.microsoft.com/office/drawing/2015/9/8/chartex" xmlns:cx2="http://schemas.microsoft.com/office/drawing/2015/10/21/chartex" xmlns:cx3="http://schemas.microsoft.com/office/drawing/2016/5/9/chartex" xmlns:cx4="http://schemas.microsoft.com/office/drawing/2016/5/10/chartex" xmlns:cx5="http://schemas.microsoft.com/office/drawing/2016/5/11/chartex" xmlns:cx6="http://schemas.microsoft.com/office/drawing/2016/5/12/chartex" xmlns:cx7="http://schemas.microsoft.com/office/drawing/2016/5/13/chartex" xmlns:cx8="http://schemas.microsoft.com/office/drawing/2016/5/14/chartex" xmlns:mc="http://schemas.openxmlformats.org/markup-compatibility/2006" xmlns:aink="http://schemas.microsoft.com/office/drawing/2016/ink" xmlns:am3d="http://schemas.microsoft.com/office/drawing/2017/model3d" xmlns:o="urn:schemas-microsoft-com:office:office" xmlns:oel="http://schemas.microsoft.com/office/2019/extlst" xmlns:r="http://schemas.openxmlformats.org/officeDocument/2006/relationships" xmlns:m="http://schemas.openxmlformats.org/officeDocument/2006/math" xmlns:v="urn:schemas-microsoft-com:vml" xmlns:wp14="http://schemas.microsoft.com/office/word/2010/wordprocessingDrawing" xmlns:wp="http://schemas.openxmlformats.org/drawingml/2006/wordprocessingDrawing" xmlns:w10="urn:schemas-microsoft-com:office:word" xmlns:w="http://schemas.openxmlformats.org/wordprocessingml/2006/main" xmlns:w14="http://schemas.microsoft.com/office/word/2010/wordml" xmlns:w15="http://schemas.microsoft.com/office/word/2012/wordml" xmlns:w16cex="http://schemas.microsoft.com/office/word/2018/wordml/cex" xmlns:w16cid="http://schemas.microsoft.com/office/word/2016/wordml/cid" xmlns:w16="http://schemas.microsoft.com/office/word/2018/wordml" xmlns:w16du="http://schemas.microsoft.com/office/word/2023/wordml/word16du" xmlns:w16sdtdh="http://schemas.microsoft.com/office/word/2020/wordml/sdtdatahash" xmlns:w16sdtfl="http://schemas.microsoft.com/office/word/2024/wordml/sdtformatlock" xmlns:w16se="http://schemas.microsoft.com/office/word/2015/wordml/symex" xmlns:wpg="http://schemas.microsoft.com/office/word/2010/wordprocessingGroup" xmlns:wpi="http://schemas.microsoft.com/office/word/2010/wordprocessingInk" xmlns:wne="http://schemas.microsoft.com/office/word/2006/wordml" xmlns:wps="http://schemas.microsoft.com/office/word/2010/wordprocessingShape" mc:Ignorable="w14 w15 w16se w16cid w16 w16cex w16sdtdh w16sdtfl w16du wp14">
   <w:abstractNum w:abstractNumId="0" w15:restartNumberingAfterBreak="0">
-    <w:nsid w:val="0B9B6159"/>
+    <w:nsid w:val="2D514710"/>
     <w:multiLevelType w:val="hybridMultilevel"/>
-    <w:tmpl w:val="A47A7264"/>
-    <w:lvl w:ilvl="0" w:tplc="CEE811A8" w:tentative="1">
+    <w:tmpl w:val="B0B2477C"/>
+    <w:lvl w:ilvl="0" w:tplc="AF865474" w:tentative="1">
       <w:start w:val="1"/>
       <w:numFmt w:val="bullet"/>
       <w:lvlText w:val="●"/>
@@ -11687,7 +11601,7 @@
         <w:ind w:left="720" w:hanging="360"/>
       </w:pPr>
     </w:lvl>
-    <w:lvl w:ilvl="1" w:tplc="BF360618" w:tentative="1">
+    <w:lvl w:ilvl="1" w:tplc="6216594C" w:tentative="1">
       <w:start w:val="1"/>
       <w:numFmt w:val="bullet"/>
       <w:lvlText w:val="○"/>
@@ -11696,7 +11610,7 @@
         <w:ind w:left="1440" w:hanging="360"/>
       </w:pPr>
     </w:lvl>
-    <w:lvl w:ilvl="2" w:tplc="3404E8D0" w:tentative="1">
+    <w:lvl w:ilvl="2" w:tplc="1BD05902" w:tentative="1">
       <w:start w:val="1"/>
       <w:numFmt w:val="bullet"/>
       <w:lvlText w:val="■"/>
@@ -11705,7 +11619,7 @@
         <w:ind w:left="2160" w:hanging="360"/>
       </w:pPr>
     </w:lvl>
-    <w:lvl w:ilvl="3" w:tplc="3A1A816E" w:tentative="1">
+    <w:lvl w:ilvl="3" w:tplc="272C3F22" w:tentative="1">
       <w:start w:val="1"/>
       <w:numFmt w:val="bullet"/>
       <w:lvlText w:val="●"/>
@@ -11714,7 +11628,7 @@
         <w:ind w:left="2880" w:hanging="360"/>
       </w:pPr>
     </w:lvl>
-    <w:lvl w:ilvl="4" w:tplc="B75009E4" w:tentative="1">
+    <w:lvl w:ilvl="4" w:tplc="84321006" w:tentative="1">
       <w:start w:val="1"/>
       <w:numFmt w:val="bullet"/>
       <w:lvlText w:val="○"/>
@@ -11723,7 +11637,7 @@
         <w:ind w:left="3600" w:hanging="360"/>
       </w:pPr>
     </w:lvl>
-    <w:lvl w:ilvl="5" w:tplc="C082D930" w:tentative="1">
+    <w:lvl w:ilvl="5" w:tplc="00680C6C" w:tentative="1">
       <w:start w:val="1"/>
       <w:numFmt w:val="bullet"/>
       <w:lvlText w:val="■"/>
@@ -11732,7 +11646,7 @@
         <w:ind w:left="4320" w:hanging="360"/>
       </w:pPr>
     </w:lvl>
-    <w:lvl w:ilvl="6" w:tplc="A1721240" w:tentative="1">
+    <w:lvl w:ilvl="6" w:tplc="FAA4FBAC" w:tentative="1">
       <w:start w:val="1"/>
       <w:numFmt w:val="bullet"/>
       <w:lvlText w:val="●"/>
@@ -11741,7 +11655,7 @@
         <w:ind w:left="5040" w:hanging="360"/>
       </w:pPr>
     </w:lvl>
-    <w:lvl w:ilvl="7" w:tplc="873C92A8" w:tentative="1">
+    <w:lvl w:ilvl="7" w:tplc="B846C386" w:tentative="1">
       <w:start w:val="1"/>
       <w:numFmt w:val="bullet"/>
       <w:lvlText w:val="●"/>
@@ -11750,7 +11664,7 @@
         <w:ind w:left="5760" w:hanging="360"/>
       </w:pPr>
     </w:lvl>
-    <w:lvl w:ilvl="8" w:tplc="CB5C25E2" w:tentative="1">
+    <w:lvl w:ilvl="8" w:tplc="6548E20A" w:tentative="1">
       <w:start w:val="1"/>
       <w:numFmt w:val="bullet"/>
       <w:lvlText w:val="●"/>
@@ -11761,10 +11675,10 @@
     </w:lvl>
   </w:abstractNum>
   <w:abstractNum w:abstractNumId="1" w15:restartNumberingAfterBreak="0">
-    <w:nsid w:val="286323D1"/>
+    <w:nsid w:val="432356B6"/>
     <w:multiLevelType w:val="hybridMultilevel"/>
-    <w:tmpl w:val="75526958"/>
-    <w:lvl w:ilvl="0" w:tplc="B3FA1E30">
+    <w:tmpl w:val="B090185E"/>
+    <w:lvl w:ilvl="0" w:tplc="45368B5A">
       <w:start w:val="1"/>
       <w:numFmt w:val="bullet"/>
       <w:lvlText w:val="•"/>
@@ -11773,54 +11687,54 @@
         <w:ind w:left="540" w:hanging="270"/>
       </w:pPr>
     </w:lvl>
-    <w:lvl w:ilvl="1" w:tplc="89D2D4B2">
+    <w:lvl w:ilvl="1" w:tplc="71AE819E">
       <w:numFmt w:val="decimal"/>
       <w:lvlText w:val=""/>
       <w:lvlJc w:val="left"/>
     </w:lvl>
-    <w:lvl w:ilvl="2" w:tplc="481E2222">
+    <w:lvl w:ilvl="2" w:tplc="FDDCA060">
       <w:numFmt w:val="decimal"/>
       <w:lvlText w:val=""/>
       <w:lvlJc w:val="left"/>
     </w:lvl>
-    <w:lvl w:ilvl="3" w:tplc="E634F9B6">
+    <w:lvl w:ilvl="3" w:tplc="006221C8">
       <w:numFmt w:val="decimal"/>
       <w:lvlText w:val=""/>
       <w:lvlJc w:val="left"/>
     </w:lvl>
-    <w:lvl w:ilvl="4" w:tplc="4350D0C4">
+    <w:lvl w:ilvl="4" w:tplc="5EB4B09C">
       <w:numFmt w:val="decimal"/>
       <w:lvlText w:val=""/>
       <w:lvlJc w:val="left"/>
     </w:lvl>
-    <w:lvl w:ilvl="5" w:tplc="7340F74A">
+    <w:lvl w:ilvl="5" w:tplc="DF484F92">
       <w:numFmt w:val="decimal"/>
       <w:lvlText w:val=""/>
       <w:lvlJc w:val="left"/>
     </w:lvl>
-    <w:lvl w:ilvl="6" w:tplc="553A0AF4">
+    <w:lvl w:ilvl="6" w:tplc="EE34FF82">
       <w:numFmt w:val="decimal"/>
       <w:lvlText w:val=""/>
       <w:lvlJc w:val="left"/>
     </w:lvl>
-    <w:lvl w:ilvl="7" w:tplc="A7AE3884">
+    <w:lvl w:ilvl="7" w:tplc="BBB21494">
       <w:numFmt w:val="decimal"/>
       <w:lvlText w:val=""/>
       <w:lvlJc w:val="left"/>
     </w:lvl>
-    <w:lvl w:ilvl="8" w:tplc="82F446D6">
+    <w:lvl w:ilvl="8" w:tplc="F1FA9890">
       <w:numFmt w:val="decimal"/>
       <w:lvlText w:val=""/>
       <w:lvlJc w:val="left"/>
     </w:lvl>
   </w:abstractNum>
-  <w:num w:numId="1" w16cid:durableId="1880312537">
+  <w:num w:numId="1" w16cid:durableId="1536964226">
     <w:abstractNumId w:val="0"/>
     <w:lvlOverride w:ilvl="0">
       <w:startOverride w:val="1"/>
     </w:lvlOverride>
   </w:num>
-  <w:num w:numId="2" w16cid:durableId="1349864369">
+  <w:num w:numId="2" w16cid:durableId="632251331">
     <w:abstractNumId w:val="1"/>
     <w:lvlOverride w:ilvl="0">
       <w:startOverride w:val="1"/>
@@ -12450,7 +12364,7 @@
     <w:autoRedefine/>
     <w:uiPriority w:val="39"/>
     <w:unhideWhenUsed/>
-    <w:rsid w:val="009D2A45"/>
+    <w:rsid w:val="000E3827"/>
     <w:pPr>
       <w:spacing w:after="100"/>
     </w:pPr>
@@ -12462,7 +12376,7 @@
     <w:autoRedefine/>
     <w:uiPriority w:val="39"/>
     <w:unhideWhenUsed/>
-    <w:rsid w:val="009D2A45"/>
+    <w:rsid w:val="000E3827"/>
     <w:pPr>
       <w:spacing w:after="100"/>
       <w:ind w:left="200"/>

</xml_diff>

<commit_message>
fix(configurateur): echappement du nom de fichier STL, rapport d'audit v1.3
- nom du fichier STL echappe avant insertion dans la liste des pieces (escHtml)
- rapport AUD-SEC-2026-10-05 v1.3 : detail des controles conformes et bonnes pratiques

Co-Authored-By: Claude Opus 5.5 (1M context) <noreply@anthropic.com>
</commit_message>
<xml_diff>
--- a/docs/audit/Rapport_audit_securite_ONEPRINT_2026-10-05.docx
+++ b/docs/audit/Rapport_audit_securite_ONEPRINT_2026-10-05.docx
@@ -258,7 +258,7 @@
                 <w:sz w:val="19"/>
                 <w:szCs w:val="19"/>
               </w:rPr>
-              <w:t>1.2 (corrections de code déployées en production)</w:t>
+              <w:t>1.3 (ajout du détail des contrôles conformes et bonnes pratiques)</w:t>
             </w:r>
           </w:p>
         </w:tc>
@@ -527,7 +527,7 @@
     <w:sdt>
       <w:sdtPr>
         <w:alias w:val="Sommaire"/>
-        <w:id w:val="-61789822"/>
+        <w:id w:val="1152246255"/>
       </w:sdtPr>
       <w:sdtEndPr/>
       <w:sdtContent>
@@ -555,7 +555,7 @@
           <w:r>
             <w:fldChar w:fldCharType="separate"/>
           </w:r>
-          <w:hyperlink w:anchor="_Toc242114127" w:history="1">
+          <w:hyperlink w:anchor="_Toc242125769" w:history="1">
             <w:r>
               <w:rPr>
                 <w:rStyle w:val="Lienhypertexte"/>
@@ -579,7 +579,7 @@
               <w:rPr>
                 <w:noProof/>
               </w:rPr>
-              <w:instrText xml:space="preserve"> PAGEREF _Toc242114127 \h </w:instrText>
+              <w:instrText xml:space="preserve"> PAGEREF _Toc242125769 \h </w:instrText>
             </w:r>
             <w:r>
               <w:rPr>
@@ -621,7 +621,7 @@
               <w14:ligatures w14:val="standardContextual"/>
             </w:rPr>
           </w:pPr>
-          <w:hyperlink w:anchor="_Toc242114128" w:history="1">
+          <w:hyperlink w:anchor="_Toc242125770" w:history="1">
             <w:r>
               <w:rPr>
                 <w:rStyle w:val="Lienhypertexte"/>
@@ -645,7 +645,7 @@
               <w:rPr>
                 <w:noProof/>
               </w:rPr>
-              <w:instrText xml:space="preserve"> PAGEREF _Toc242114128 \h </w:instrText>
+              <w:instrText xml:space="preserve"> PAGEREF _Toc242125770 \h </w:instrText>
             </w:r>
             <w:r>
               <w:rPr>
@@ -687,7 +687,7 @@
               <w14:ligatures w14:val="standardContextual"/>
             </w:rPr>
           </w:pPr>
-          <w:hyperlink w:anchor="_Toc242114129" w:history="1">
+          <w:hyperlink w:anchor="_Toc242125771" w:history="1">
             <w:r>
               <w:rPr>
                 <w:rStyle w:val="Lienhypertexte"/>
@@ -711,7 +711,7 @@
               <w:rPr>
                 <w:noProof/>
               </w:rPr>
-              <w:instrText xml:space="preserve"> PAGEREF _Toc242114129 \h </w:instrText>
+              <w:instrText xml:space="preserve"> PAGEREF _Toc242125771 \h </w:instrText>
             </w:r>
             <w:r>
               <w:rPr>
@@ -753,7 +753,7 @@
               <w14:ligatures w14:val="standardContextual"/>
             </w:rPr>
           </w:pPr>
-          <w:hyperlink w:anchor="_Toc242114130" w:history="1">
+          <w:hyperlink w:anchor="_Toc242125772" w:history="1">
             <w:r>
               <w:rPr>
                 <w:rStyle w:val="Lienhypertexte"/>
@@ -777,7 +777,7 @@
               <w:rPr>
                 <w:noProof/>
               </w:rPr>
-              <w:instrText xml:space="preserve"> PAGEREF _Toc242114130 \h </w:instrText>
+              <w:instrText xml:space="preserve"> PAGEREF _Toc242125772 \h </w:instrText>
             </w:r>
             <w:r>
               <w:rPr>
@@ -819,7 +819,7 @@
               <w14:ligatures w14:val="standardContextual"/>
             </w:rPr>
           </w:pPr>
-          <w:hyperlink w:anchor="_Toc242114131" w:history="1">
+          <w:hyperlink w:anchor="_Toc242125773" w:history="1">
             <w:r>
               <w:rPr>
                 <w:rStyle w:val="Lienhypertexte"/>
@@ -843,7 +843,7 @@
               <w:rPr>
                 <w:noProof/>
               </w:rPr>
-              <w:instrText xml:space="preserve"> PAGEREF _Toc242114131 \h </w:instrText>
+              <w:instrText xml:space="preserve"> PAGEREF _Toc242125773 \h </w:instrText>
             </w:r>
             <w:r>
               <w:rPr>
@@ -885,7 +885,7 @@
               <w14:ligatures w14:val="standardContextual"/>
             </w:rPr>
           </w:pPr>
-          <w:hyperlink w:anchor="_Toc242114132" w:history="1">
+          <w:hyperlink w:anchor="_Toc242125774" w:history="1">
             <w:r>
               <w:rPr>
                 <w:rStyle w:val="Lienhypertexte"/>
@@ -909,7 +909,7 @@
               <w:rPr>
                 <w:noProof/>
               </w:rPr>
-              <w:instrText xml:space="preserve"> PAGEREF _Toc242114132 \h </w:instrText>
+              <w:instrText xml:space="preserve"> PAGEREF _Toc242125774 \h </w:instrText>
             </w:r>
             <w:r>
               <w:rPr>
@@ -951,7 +951,7 @@
               <w14:ligatures w14:val="standardContextual"/>
             </w:rPr>
           </w:pPr>
-          <w:hyperlink w:anchor="_Toc242114133" w:history="1">
+          <w:hyperlink w:anchor="_Toc242125775" w:history="1">
             <w:r>
               <w:rPr>
                 <w:rStyle w:val="Lienhypertexte"/>
@@ -975,7 +975,7 @@
               <w:rPr>
                 <w:noProof/>
               </w:rPr>
-              <w:instrText xml:space="preserve"> PAGEREF _Toc242114133 \h </w:instrText>
+              <w:instrText xml:space="preserve"> PAGEREF _Toc242125775 \h </w:instrText>
             </w:r>
             <w:r>
               <w:rPr>
@@ -1017,7 +1017,7 @@
               <w14:ligatures w14:val="standardContextual"/>
             </w:rPr>
           </w:pPr>
-          <w:hyperlink w:anchor="_Toc242114134" w:history="1">
+          <w:hyperlink w:anchor="_Toc242125776" w:history="1">
             <w:r>
               <w:rPr>
                 <w:rStyle w:val="Lienhypertexte"/>
@@ -1041,7 +1041,7 @@
               <w:rPr>
                 <w:noProof/>
               </w:rPr>
-              <w:instrText xml:space="preserve"> PAGEREF _Toc242114134 \h </w:instrText>
+              <w:instrText xml:space="preserve"> PAGEREF _Toc242125776 \h </w:instrText>
             </w:r>
             <w:r>
               <w:rPr>
@@ -1083,7 +1083,7 @@
               <w14:ligatures w14:val="standardContextual"/>
             </w:rPr>
           </w:pPr>
-          <w:hyperlink w:anchor="_Toc242114135" w:history="1">
+          <w:hyperlink w:anchor="_Toc242125777" w:history="1">
             <w:r>
               <w:rPr>
                 <w:rStyle w:val="Lienhypertexte"/>
@@ -1107,7 +1107,7 @@
               <w:rPr>
                 <w:noProof/>
               </w:rPr>
-              <w:instrText xml:space="preserve"> PAGEREF _Toc242114135 \h </w:instrText>
+              <w:instrText xml:space="preserve"> PAGEREF _Toc242125777 \h </w:instrText>
             </w:r>
             <w:r>
               <w:rPr>
@@ -1149,7 +1149,7 @@
               <w14:ligatures w14:val="standardContextual"/>
             </w:rPr>
           </w:pPr>
-          <w:hyperlink w:anchor="_Toc242114136" w:history="1">
+          <w:hyperlink w:anchor="_Toc242125778" w:history="1">
             <w:r>
               <w:rPr>
                 <w:rStyle w:val="Lienhypertexte"/>
@@ -1173,7 +1173,7 @@
               <w:rPr>
                 <w:noProof/>
               </w:rPr>
-              <w:instrText xml:space="preserve"> PAGEREF _Toc242114136 \h </w:instrText>
+              <w:instrText xml:space="preserve"> PAGEREF _Toc242125778 \h </w:instrText>
             </w:r>
             <w:r>
               <w:rPr>
@@ -1215,7 +1215,7 @@
               <w14:ligatures w14:val="standardContextual"/>
             </w:rPr>
           </w:pPr>
-          <w:hyperlink w:anchor="_Toc242114137" w:history="1">
+          <w:hyperlink w:anchor="_Toc242125779" w:history="1">
             <w:r>
               <w:rPr>
                 <w:rStyle w:val="Lienhypertexte"/>
@@ -1239,7 +1239,7 @@
               <w:rPr>
                 <w:noProof/>
               </w:rPr>
-              <w:instrText xml:space="preserve"> PAGEREF _Toc242114137 \h </w:instrText>
+              <w:instrText xml:space="preserve"> PAGEREF _Toc242125779 \h </w:instrText>
             </w:r>
             <w:r>
               <w:rPr>
@@ -1281,7 +1281,7 @@
               <w14:ligatures w14:val="standardContextual"/>
             </w:rPr>
           </w:pPr>
-          <w:hyperlink w:anchor="_Toc242114138" w:history="1">
+          <w:hyperlink w:anchor="_Toc242125780" w:history="1">
             <w:r>
               <w:rPr>
                 <w:rStyle w:val="Lienhypertexte"/>
@@ -1305,7 +1305,7 @@
               <w:rPr>
                 <w:noProof/>
               </w:rPr>
-              <w:instrText xml:space="preserve"> PAGEREF _Toc242114138 \h </w:instrText>
+              <w:instrText xml:space="preserve"> PAGEREF _Toc242125780 \h </w:instrText>
             </w:r>
             <w:r>
               <w:rPr>
@@ -1347,7 +1347,7 @@
               <w14:ligatures w14:val="standardContextual"/>
             </w:rPr>
           </w:pPr>
-          <w:hyperlink w:anchor="_Toc242114139" w:history="1">
+          <w:hyperlink w:anchor="_Toc242125781" w:history="1">
             <w:r>
               <w:rPr>
                 <w:rStyle w:val="Lienhypertexte"/>
@@ -1371,7 +1371,7 @@
               <w:rPr>
                 <w:noProof/>
               </w:rPr>
-              <w:instrText xml:space="preserve"> PAGEREF _Toc242114139 \h </w:instrText>
+              <w:instrText xml:space="preserve"> PAGEREF _Toc242125781 \h </w:instrText>
             </w:r>
             <w:r>
               <w:rPr>
@@ -1413,7 +1413,7 @@
               <w14:ligatures w14:val="standardContextual"/>
             </w:rPr>
           </w:pPr>
-          <w:hyperlink w:anchor="_Toc242114140" w:history="1">
+          <w:hyperlink w:anchor="_Toc242125782" w:history="1">
             <w:r>
               <w:rPr>
                 <w:rStyle w:val="Lienhypertexte"/>
@@ -1437,7 +1437,7 @@
               <w:rPr>
                 <w:noProof/>
               </w:rPr>
-              <w:instrText xml:space="preserve"> PAGEREF _Toc242114140 \h </w:instrText>
+              <w:instrText xml:space="preserve"> PAGEREF _Toc242125782 \h </w:instrText>
             </w:r>
             <w:r>
               <w:rPr>
@@ -1479,13 +1479,13 @@
               <w14:ligatures w14:val="standardContextual"/>
             </w:rPr>
           </w:pPr>
-          <w:hyperlink w:anchor="_Toc242114141" w:history="1">
+          <w:hyperlink w:anchor="_Toc242125783" w:history="1">
             <w:r>
               <w:rPr>
                 <w:rStyle w:val="Lienhypertexte"/>
                 <w:noProof/>
               </w:rPr>
-              <w:t>5. Points vérifiés conformes</w:t>
+              <w:t>5. Points vérifiés conformes et bonnes pratiques</w:t>
             </w:r>
             <w:r>
               <w:rPr>
@@ -1503,7 +1503,7 @@
               <w:rPr>
                 <w:noProof/>
               </w:rPr>
-              <w:instrText xml:space="preserve"> PAGEREF _Toc242114141 \h </w:instrText>
+              <w:instrText xml:space="preserve"> PAGEREF _Toc242125783 \h </w:instrText>
             </w:r>
             <w:r>
               <w:rPr>
@@ -1545,7 +1545,7 @@
               <w14:ligatures w14:val="standardContextual"/>
             </w:rPr>
           </w:pPr>
-          <w:hyperlink w:anchor="_Toc242114142" w:history="1">
+          <w:hyperlink w:anchor="_Toc242125784" w:history="1">
             <w:r>
               <w:rPr>
                 <w:rStyle w:val="Lienhypertexte"/>
@@ -1569,7 +1569,7 @@
               <w:rPr>
                 <w:noProof/>
               </w:rPr>
-              <w:instrText xml:space="preserve"> PAGEREF _Toc242114142 \h </w:instrText>
+              <w:instrText xml:space="preserve"> PAGEREF _Toc242125784 \h </w:instrText>
             </w:r>
             <w:r>
               <w:rPr>
@@ -1586,7 +1586,7 @@
               <w:rPr>
                 <w:noProof/>
               </w:rPr>
-              <w:t>7</w:t>
+              <w:t>9</w:t>
             </w:r>
             <w:r>
               <w:rPr>
@@ -1611,7 +1611,7 @@
               <w14:ligatures w14:val="standardContextual"/>
             </w:rPr>
           </w:pPr>
-          <w:hyperlink w:anchor="_Toc242114143" w:history="1">
+          <w:hyperlink w:anchor="_Toc242125785" w:history="1">
             <w:r>
               <w:rPr>
                 <w:rStyle w:val="Lienhypertexte"/>
@@ -1635,7 +1635,7 @@
               <w:rPr>
                 <w:noProof/>
               </w:rPr>
-              <w:instrText xml:space="preserve"> PAGEREF _Toc242114143 \h </w:instrText>
+              <w:instrText xml:space="preserve"> PAGEREF _Toc242125785 \h </w:instrText>
             </w:r>
             <w:r>
               <w:rPr>
@@ -1652,7 +1652,7 @@
               <w:rPr>
                 <w:noProof/>
               </w:rPr>
-              <w:t>7</w:t>
+              <w:t>9</w:t>
             </w:r>
             <w:r>
               <w:rPr>
@@ -1677,7 +1677,7 @@
               <w14:ligatures w14:val="standardContextual"/>
             </w:rPr>
           </w:pPr>
-          <w:hyperlink w:anchor="_Toc242114144" w:history="1">
+          <w:hyperlink w:anchor="_Toc242125786" w:history="1">
             <w:r>
               <w:rPr>
                 <w:rStyle w:val="Lienhypertexte"/>
@@ -1701,7 +1701,7 @@
               <w:rPr>
                 <w:noProof/>
               </w:rPr>
-              <w:instrText xml:space="preserve"> PAGEREF _Toc242114144 \h </w:instrText>
+              <w:instrText xml:space="preserve"> PAGEREF _Toc242125786 \h </w:instrText>
             </w:r>
             <w:r>
               <w:rPr>
@@ -1718,7 +1718,7 @@
               <w:rPr>
                 <w:noProof/>
               </w:rPr>
-              <w:t>9</w:t>
+              <w:t>10</w:t>
             </w:r>
             <w:r>
               <w:rPr>
@@ -1743,7 +1743,7 @@
               <w14:ligatures w14:val="standardContextual"/>
             </w:rPr>
           </w:pPr>
-          <w:hyperlink w:anchor="_Toc242114145" w:history="1">
+          <w:hyperlink w:anchor="_Toc242125787" w:history="1">
             <w:r>
               <w:rPr>
                 <w:rStyle w:val="Lienhypertexte"/>
@@ -1767,7 +1767,7 @@
               <w:rPr>
                 <w:noProof/>
               </w:rPr>
-              <w:instrText xml:space="preserve"> PAGEREF _Toc242114145 \h </w:instrText>
+              <w:instrText xml:space="preserve"> PAGEREF _Toc242125787 \h </w:instrText>
             </w:r>
             <w:r>
               <w:rPr>
@@ -1784,7 +1784,7 @@
               <w:rPr>
                 <w:noProof/>
               </w:rPr>
-              <w:t>9</w:t>
+              <w:t>10</w:t>
             </w:r>
             <w:r>
               <w:rPr>
@@ -1809,7 +1809,7 @@
               <w14:ligatures w14:val="standardContextual"/>
             </w:rPr>
           </w:pPr>
-          <w:hyperlink w:anchor="_Toc242114146" w:history="1">
+          <w:hyperlink w:anchor="_Toc242125788" w:history="1">
             <w:r>
               <w:rPr>
                 <w:rStyle w:val="Lienhypertexte"/>
@@ -1833,7 +1833,7 @@
               <w:rPr>
                 <w:noProof/>
               </w:rPr>
-              <w:instrText xml:space="preserve"> PAGEREF _Toc242114146 \h </w:instrText>
+              <w:instrText xml:space="preserve"> PAGEREF _Toc242125788 \h </w:instrText>
             </w:r>
             <w:r>
               <w:rPr>
@@ -1850,7 +1850,7 @@
               <w:rPr>
                 <w:noProof/>
               </w:rPr>
-              <w:t>9</w:t>
+              <w:t>10</w:t>
             </w:r>
             <w:r>
               <w:rPr>
@@ -1876,7 +1876,7 @@
       <w:pPr>
         <w:pStyle w:val="Titre1"/>
       </w:pPr>
-      <w:bookmarkStart w:id="0" w:name="_Toc242114127"/>
+      <w:bookmarkStart w:id="0" w:name="_Toc242125769"/>
       <w:r>
         <w:t>1. Objet et périmètre</w:t>
       </w:r>
@@ -2009,7 +2009,7 @@
       <w:pPr>
         <w:pStyle w:val="Titre1"/>
       </w:pPr>
-      <w:bookmarkStart w:id="1" w:name="_Toc242114128"/>
+      <w:bookmarkStart w:id="1" w:name="_Toc242125770"/>
       <w:r>
         <w:t>2. Méthode</w:t>
       </w:r>
@@ -2035,7 +2035,7 @@
       <w:pPr>
         <w:pStyle w:val="Titre1"/>
       </w:pPr>
-      <w:bookmarkStart w:id="2" w:name="_Toc242114129"/>
+      <w:bookmarkStart w:id="2" w:name="_Toc242125771"/>
       <w:r>
         <w:t>3. Synthèse</w:t>
       </w:r>
@@ -3418,7 +3418,7 @@
       <w:pPr>
         <w:pStyle w:val="Titre1"/>
       </w:pPr>
-      <w:bookmarkStart w:id="3" w:name="_Toc242114130"/>
+      <w:bookmarkStart w:id="3" w:name="_Toc242125772"/>
       <w:r>
         <w:t>4. Constats et actions correctives</w:t>
       </w:r>
@@ -3428,7 +3428,7 @@
       <w:pPr>
         <w:pStyle w:val="Titre2"/>
       </w:pPr>
-      <w:bookmarkStart w:id="4" w:name="_Toc242114131"/>
+      <w:bookmarkStart w:id="4" w:name="_Toc242125773"/>
       <w:r>
         <w:t>AUD-01 : Modification du workflow devis/commande par le client</w:t>
       </w:r>
@@ -3920,7 +3920,7 @@
       <w:pPr>
         <w:pStyle w:val="Titre2"/>
       </w:pPr>
-      <w:bookmarkStart w:id="5" w:name="_Toc242114132"/>
+      <w:bookmarkStart w:id="5" w:name="_Toc242125774"/>
       <w:r>
         <w:t>AUD-02 : Tarification calculée côté navigateur</w:t>
       </w:r>
@@ -4412,7 +4412,7 @@
       <w:pPr>
         <w:pStyle w:val="Titre2"/>
       </w:pPr>
-      <w:bookmarkStart w:id="6" w:name="_Toc242114133"/>
+      <w:bookmarkStart w:id="6" w:name="_Toc242125775"/>
       <w:r>
         <w:t>AUD-03 : Suppression de la fiche client par le client</w:t>
       </w:r>
@@ -4904,7 +4904,7 @@
       <w:pPr>
         <w:pStyle w:val="Titre2"/>
       </w:pPr>
-      <w:bookmarkStart w:id="7" w:name="_Toc242114134"/>
+      <w:bookmarkStart w:id="7" w:name="_Toc242125776"/>
       <w:r>
         <w:t>AUD-04 : Chemins de fichiers Storage non contrôlés</w:t>
       </w:r>
@@ -5396,7 +5396,7 @@
       <w:pPr>
         <w:pStyle w:val="Titre2"/>
       </w:pPr>
-      <w:bookmarkStart w:id="8" w:name="_Toc242114135"/>
+      <w:bookmarkStart w:id="8" w:name="_Toc242125777"/>
       <w:r>
         <w:t>AUD-05 : Absence de limitation sur la route d'email de commande</w:t>
       </w:r>
@@ -5888,7 +5888,7 @@
       <w:pPr>
         <w:pStyle w:val="Titre2"/>
       </w:pPr>
-      <w:bookmarkStart w:id="9" w:name="_Toc242114136"/>
+      <w:bookmarkStart w:id="9" w:name="_Toc242125778"/>
       <w:r>
         <w:t>AUD-06 : Bucket Storage sans restriction de type ni de taille</w:t>
       </w:r>
@@ -6380,7 +6380,7 @@
       <w:pPr>
         <w:pStyle w:val="Titre2"/>
       </w:pPr>
-      <w:bookmarkStart w:id="10" w:name="_Toc242114137"/>
+      <w:bookmarkStart w:id="10" w:name="_Toc242125779"/>
       <w:r>
         <w:t>AUD-07 : En-têtes HTTP de sécurité absents</w:t>
       </w:r>
@@ -6872,7 +6872,7 @@
       <w:pPr>
         <w:pStyle w:val="Titre2"/>
       </w:pPr>
-      <w:bookmarkStart w:id="11" w:name="_Toc242114138"/>
+      <w:bookmarkStart w:id="11" w:name="_Toc242125780"/>
       <w:r>
         <w:t>AUD-08 : Alertes de l'advisor Supabase et privilèges</w:t>
       </w:r>
@@ -7364,7 +7364,7 @@
       <w:pPr>
         <w:pStyle w:val="Titre2"/>
       </w:pPr>
-      <w:bookmarkStart w:id="12" w:name="_Toc242114139"/>
+      <w:bookmarkStart w:id="12" w:name="_Toc242125781"/>
       <w:r>
         <w:t>AUD-09 : Plusieurs commandes possibles sur un même devis</w:t>
       </w:r>
@@ -7856,7 +7856,7 @@
       <w:pPr>
         <w:pStyle w:val="Titre2"/>
       </w:pPr>
-      <w:bookmarkStart w:id="13" w:name="_Toc242114140"/>
+      <w:bookmarkStart w:id="13" w:name="_Toc242125782"/>
       <w:r>
         <w:t>AUD-10 : Dépendances vulnérables</w:t>
       </w:r>
@@ -8348,23 +8348,2825 @@
       <w:pPr>
         <w:pStyle w:val="Titre1"/>
       </w:pPr>
-      <w:bookmarkStart w:id="14" w:name="_Toc242114141"/>
+      <w:bookmarkStart w:id="14" w:name="_Toc242125783"/>
       <w:r>
-        <w:t>5. Points vérifiés conformes</w:t>
+        <w:t>5. Points vérifiés conformes et bonnes pratiques</w:t>
       </w:r>
       <w:bookmarkEnd w:id="14"/>
     </w:p>
     <w:p>
       <w:pPr>
-        <w:pStyle w:val="Paragraphedeliste"/>
-        <w:numPr>
-          <w:ilvl w:val="0"/>
-          <w:numId w:val="2"/>
-        </w:numPr>
-        <w:spacing w:after="60"/>
+        <w:spacing w:after="120"/>
       </w:pPr>
       <w:r>
-        <w:t>RLS activée sur les 5 tables du schéma public (admins, clients, commandes, devis, devis_pieces).</w:t>
+        <w:t>Éléments contrôlés au cours de l'audit et jugés conformes aux bonnes pratiques de développement sécurisé. Chaque ligne indique la méthode de contrôle (base : requête sur l'état réel de Supabase ; code : lecture du code source ; outil : exécution d'un outil ; prod : vérification sur l'application en ligne).</w:t>
+      </w:r>
+    </w:p>
+    <w:tbl>
+      <w:tblPr>
+        <w:tblW w:w="9638" w:type="dxa"/>
+        <w:tblBorders>
+          <w:top w:val="single" w:sz="4" w:space="0" w:color="auto"/>
+          <w:left w:val="single" w:sz="4" w:space="0" w:color="auto"/>
+          <w:bottom w:val="single" w:sz="4" w:space="0" w:color="auto"/>
+          <w:right w:val="single" w:sz="4" w:space="0" w:color="auto"/>
+          <w:insideH w:val="single" w:sz="4" w:space="0" w:color="auto"/>
+          <w:insideV w:val="single" w:sz="4" w:space="0" w:color="auto"/>
+        </w:tblBorders>
+        <w:tblCellMar>
+          <w:left w:w="10" w:type="dxa"/>
+          <w:right w:w="10" w:type="dxa"/>
+        </w:tblCellMar>
+        <w:tblLook w:val="04A0" w:firstRow="1" w:lastRow="0" w:firstColumn="1" w:lastColumn="0" w:noHBand="0" w:noVBand="1"/>
+      </w:tblPr>
+      <w:tblGrid>
+        <w:gridCol w:w="2000"/>
+        <w:gridCol w:w="5338"/>
+        <w:gridCol w:w="2300"/>
+      </w:tblGrid>
+      <w:tr>
+        <w:tblPrEx>
+          <w:tblCellMar>
+            <w:top w:w="0" w:type="dxa"/>
+            <w:bottom w:w="0" w:type="dxa"/>
+          </w:tblCellMar>
+        </w:tblPrEx>
+        <w:trPr>
+          <w:tblHeader/>
+        </w:trPr>
+        <w:tc>
+          <w:tcPr>
+            <w:tcW w:w="2000" w:type="dxa"/>
+            <w:tcBorders>
+              <w:top w:val="single" w:sz="4" w:space="0" w:color="E2DED2"/>
+              <w:left w:val="single" w:sz="4" w:space="0" w:color="E2DED2"/>
+              <w:bottom w:val="single" w:sz="4" w:space="0" w:color="E2DED2"/>
+              <w:right w:val="single" w:sz="4" w:space="0" w:color="E2DED2"/>
+            </w:tcBorders>
+            <w:shd w:val="clear" w:color="auto" w:fill="004B32"/>
+            <w:tcMar>
+              <w:top w:w="70" w:type="dxa"/>
+              <w:left w:w="110" w:type="dxa"/>
+              <w:bottom w:w="70" w:type="dxa"/>
+              <w:right w:w="110" w:type="dxa"/>
+            </w:tcMar>
+          </w:tcPr>
+          <w:p>
+            <w:r>
+              <w:rPr>
+                <w:b/>
+                <w:bCs/>
+                <w:color w:val="FFFFFF"/>
+                <w:sz w:val="19"/>
+                <w:szCs w:val="19"/>
+              </w:rPr>
+              <w:t>Domaine</w:t>
+            </w:r>
+          </w:p>
+        </w:tc>
+        <w:tc>
+          <w:tcPr>
+            <w:tcW w:w="5338" w:type="dxa"/>
+            <w:tcBorders>
+              <w:top w:val="single" w:sz="4" w:space="0" w:color="E2DED2"/>
+              <w:left w:val="single" w:sz="4" w:space="0" w:color="E2DED2"/>
+              <w:bottom w:val="single" w:sz="4" w:space="0" w:color="E2DED2"/>
+              <w:right w:val="single" w:sz="4" w:space="0" w:color="E2DED2"/>
+            </w:tcBorders>
+            <w:shd w:val="clear" w:color="auto" w:fill="004B32"/>
+            <w:tcMar>
+              <w:top w:w="70" w:type="dxa"/>
+              <w:left w:w="110" w:type="dxa"/>
+              <w:bottom w:w="70" w:type="dxa"/>
+              <w:right w:w="110" w:type="dxa"/>
+            </w:tcMar>
+          </w:tcPr>
+          <w:p>
+            <w:r>
+              <w:rPr>
+                <w:b/>
+                <w:bCs/>
+                <w:color w:val="FFFFFF"/>
+                <w:sz w:val="19"/>
+                <w:szCs w:val="19"/>
+              </w:rPr>
+              <w:t>Contrôle et constat</w:t>
+            </w:r>
+          </w:p>
+        </w:tc>
+        <w:tc>
+          <w:tcPr>
+            <w:tcW w:w="2300" w:type="dxa"/>
+            <w:tcBorders>
+              <w:top w:val="single" w:sz="4" w:space="0" w:color="E2DED2"/>
+              <w:left w:val="single" w:sz="4" w:space="0" w:color="E2DED2"/>
+              <w:bottom w:val="single" w:sz="4" w:space="0" w:color="E2DED2"/>
+              <w:right w:val="single" w:sz="4" w:space="0" w:color="E2DED2"/>
+            </w:tcBorders>
+            <w:shd w:val="clear" w:color="auto" w:fill="004B32"/>
+            <w:tcMar>
+              <w:top w:w="70" w:type="dxa"/>
+              <w:left w:w="110" w:type="dxa"/>
+              <w:bottom w:w="70" w:type="dxa"/>
+              <w:right w:w="110" w:type="dxa"/>
+            </w:tcMar>
+          </w:tcPr>
+          <w:p>
+            <w:r>
+              <w:rPr>
+                <w:b/>
+                <w:bCs/>
+                <w:color w:val="FFFFFF"/>
+                <w:sz w:val="19"/>
+                <w:szCs w:val="19"/>
+              </w:rPr>
+              <w:t>Méthode</w:t>
+            </w:r>
+          </w:p>
+        </w:tc>
+      </w:tr>
+      <w:tr>
+        <w:tblPrEx>
+          <w:tblCellMar>
+            <w:top w:w="0" w:type="dxa"/>
+            <w:bottom w:w="0" w:type="dxa"/>
+          </w:tblCellMar>
+        </w:tblPrEx>
+        <w:tc>
+          <w:tcPr>
+            <w:tcW w:w="2000" w:type="dxa"/>
+            <w:tcBorders>
+              <w:top w:val="single" w:sz="4" w:space="0" w:color="E2DED2"/>
+              <w:left w:val="single" w:sz="4" w:space="0" w:color="E2DED2"/>
+              <w:bottom w:val="single" w:sz="4" w:space="0" w:color="E2DED2"/>
+              <w:right w:val="single" w:sz="4" w:space="0" w:color="E2DED2"/>
+            </w:tcBorders>
+            <w:tcMar>
+              <w:top w:w="70" w:type="dxa"/>
+              <w:left w:w="110" w:type="dxa"/>
+              <w:bottom w:w="70" w:type="dxa"/>
+              <w:right w:w="110" w:type="dxa"/>
+            </w:tcMar>
+          </w:tcPr>
+          <w:p>
+            <w:r>
+              <w:rPr>
+                <w:sz w:val="19"/>
+                <w:szCs w:val="19"/>
+              </w:rPr>
+              <w:t>Contrôle d'accès</w:t>
+            </w:r>
+          </w:p>
+        </w:tc>
+        <w:tc>
+          <w:tcPr>
+            <w:tcW w:w="5338" w:type="dxa"/>
+            <w:tcBorders>
+              <w:top w:val="single" w:sz="4" w:space="0" w:color="E2DED2"/>
+              <w:left w:val="single" w:sz="4" w:space="0" w:color="E2DED2"/>
+              <w:bottom w:val="single" w:sz="4" w:space="0" w:color="E2DED2"/>
+              <w:right w:val="single" w:sz="4" w:space="0" w:color="E2DED2"/>
+            </w:tcBorders>
+            <w:tcMar>
+              <w:top w:w="70" w:type="dxa"/>
+              <w:left w:w="110" w:type="dxa"/>
+              <w:bottom w:w="70" w:type="dxa"/>
+              <w:right w:w="110" w:type="dxa"/>
+            </w:tcMar>
+          </w:tcPr>
+          <w:p>
+            <w:r>
+              <w:rPr>
+                <w:sz w:val="19"/>
+                <w:szCs w:val="19"/>
+              </w:rPr>
+              <w:t>RLS activée sur les 5 tables du schéma public (admins, clients, commandes, devis, devis_pieces) : aucun accès aux données sans politique explicite.</w:t>
+            </w:r>
+          </w:p>
+        </w:tc>
+        <w:tc>
+          <w:tcPr>
+            <w:tcW w:w="2300" w:type="dxa"/>
+            <w:tcBorders>
+              <w:top w:val="single" w:sz="4" w:space="0" w:color="E2DED2"/>
+              <w:left w:val="single" w:sz="4" w:space="0" w:color="E2DED2"/>
+              <w:bottom w:val="single" w:sz="4" w:space="0" w:color="E2DED2"/>
+              <w:right w:val="single" w:sz="4" w:space="0" w:color="E2DED2"/>
+            </w:tcBorders>
+            <w:tcMar>
+              <w:top w:w="70" w:type="dxa"/>
+              <w:left w:w="110" w:type="dxa"/>
+              <w:bottom w:w="70" w:type="dxa"/>
+              <w:right w:w="110" w:type="dxa"/>
+            </w:tcMar>
+          </w:tcPr>
+          <w:p>
+            <w:r>
+              <w:rPr>
+                <w:sz w:val="19"/>
+                <w:szCs w:val="19"/>
+              </w:rPr>
+              <w:t>base (pg_class)</w:t>
+            </w:r>
+          </w:p>
+        </w:tc>
+      </w:tr>
+      <w:tr>
+        <w:tblPrEx>
+          <w:tblCellMar>
+            <w:top w:w="0" w:type="dxa"/>
+            <w:bottom w:w="0" w:type="dxa"/>
+          </w:tblCellMar>
+        </w:tblPrEx>
+        <w:tc>
+          <w:tcPr>
+            <w:tcW w:w="2000" w:type="dxa"/>
+            <w:tcBorders>
+              <w:top w:val="single" w:sz="4" w:space="0" w:color="E2DED2"/>
+              <w:left w:val="single" w:sz="4" w:space="0" w:color="E2DED2"/>
+              <w:bottom w:val="single" w:sz="4" w:space="0" w:color="E2DED2"/>
+              <w:right w:val="single" w:sz="4" w:space="0" w:color="E2DED2"/>
+            </w:tcBorders>
+            <w:tcMar>
+              <w:top w:w="70" w:type="dxa"/>
+              <w:left w:w="110" w:type="dxa"/>
+              <w:bottom w:w="70" w:type="dxa"/>
+              <w:right w:w="110" w:type="dxa"/>
+            </w:tcMar>
+          </w:tcPr>
+          <w:p>
+            <w:r>
+              <w:rPr>
+                <w:sz w:val="19"/>
+                <w:szCs w:val="19"/>
+              </w:rPr>
+              <w:t>Contrôle d'accès</w:t>
+            </w:r>
+          </w:p>
+        </w:tc>
+        <w:tc>
+          <w:tcPr>
+            <w:tcW w:w="5338" w:type="dxa"/>
+            <w:tcBorders>
+              <w:top w:val="single" w:sz="4" w:space="0" w:color="E2DED2"/>
+              <w:left w:val="single" w:sz="4" w:space="0" w:color="E2DED2"/>
+              <w:bottom w:val="single" w:sz="4" w:space="0" w:color="E2DED2"/>
+              <w:right w:val="single" w:sz="4" w:space="0" w:color="E2DED2"/>
+            </w:tcBorders>
+            <w:tcMar>
+              <w:top w:w="70" w:type="dxa"/>
+              <w:left w:w="110" w:type="dxa"/>
+              <w:bottom w:w="70" w:type="dxa"/>
+              <w:right w:w="110" w:type="dxa"/>
+            </w:tcMar>
+          </w:tcPr>
+          <w:p>
+            <w:r>
+              <w:rPr>
+                <w:sz w:val="19"/>
+                <w:szCs w:val="19"/>
+              </w:rPr>
+              <w:t>Principe du moindre privilège : après correction, un client ne peut que lire ses données et en créer ; toute modification de statut passe par un admin.</w:t>
+            </w:r>
+          </w:p>
+        </w:tc>
+        <w:tc>
+          <w:tcPr>
+            <w:tcW w:w="2300" w:type="dxa"/>
+            <w:tcBorders>
+              <w:top w:val="single" w:sz="4" w:space="0" w:color="E2DED2"/>
+              <w:left w:val="single" w:sz="4" w:space="0" w:color="E2DED2"/>
+              <w:bottom w:val="single" w:sz="4" w:space="0" w:color="E2DED2"/>
+              <w:right w:val="single" w:sz="4" w:space="0" w:color="E2DED2"/>
+            </w:tcBorders>
+            <w:tcMar>
+              <w:top w:w="70" w:type="dxa"/>
+              <w:left w:w="110" w:type="dxa"/>
+              <w:bottom w:w="70" w:type="dxa"/>
+              <w:right w:w="110" w:type="dxa"/>
+            </w:tcMar>
+          </w:tcPr>
+          <w:p>
+            <w:r>
+              <w:rPr>
+                <w:sz w:val="19"/>
+                <w:szCs w:val="19"/>
+              </w:rPr>
+              <w:t>base (pg_policies)</w:t>
+            </w:r>
+          </w:p>
+        </w:tc>
+      </w:tr>
+      <w:tr>
+        <w:tblPrEx>
+          <w:tblCellMar>
+            <w:top w:w="0" w:type="dxa"/>
+            <w:bottom w:w="0" w:type="dxa"/>
+          </w:tblCellMar>
+        </w:tblPrEx>
+        <w:tc>
+          <w:tcPr>
+            <w:tcW w:w="2000" w:type="dxa"/>
+            <w:tcBorders>
+              <w:top w:val="single" w:sz="4" w:space="0" w:color="E2DED2"/>
+              <w:left w:val="single" w:sz="4" w:space="0" w:color="E2DED2"/>
+              <w:bottom w:val="single" w:sz="4" w:space="0" w:color="E2DED2"/>
+              <w:right w:val="single" w:sz="4" w:space="0" w:color="E2DED2"/>
+            </w:tcBorders>
+            <w:tcMar>
+              <w:top w:w="70" w:type="dxa"/>
+              <w:left w:w="110" w:type="dxa"/>
+              <w:bottom w:w="70" w:type="dxa"/>
+              <w:right w:w="110" w:type="dxa"/>
+            </w:tcMar>
+          </w:tcPr>
+          <w:p>
+            <w:r>
+              <w:rPr>
+                <w:sz w:val="19"/>
+                <w:szCs w:val="19"/>
+              </w:rPr>
+              <w:t>Contrôle d'accès</w:t>
+            </w:r>
+          </w:p>
+        </w:tc>
+        <w:tc>
+          <w:tcPr>
+            <w:tcW w:w="5338" w:type="dxa"/>
+            <w:tcBorders>
+              <w:top w:val="single" w:sz="4" w:space="0" w:color="E2DED2"/>
+              <w:left w:val="single" w:sz="4" w:space="0" w:color="E2DED2"/>
+              <w:bottom w:val="single" w:sz="4" w:space="0" w:color="E2DED2"/>
+              <w:right w:val="single" w:sz="4" w:space="0" w:color="E2DED2"/>
+            </w:tcBorders>
+            <w:tcMar>
+              <w:top w:w="70" w:type="dxa"/>
+              <w:left w:w="110" w:type="dxa"/>
+              <w:bottom w:w="70" w:type="dxa"/>
+              <w:right w:w="110" w:type="dxa"/>
+            </w:tcMar>
+          </w:tcPr>
+          <w:p>
+            <w:r>
+              <w:rPr>
+                <w:sz w:val="19"/>
+                <w:szCs w:val="19"/>
+              </w:rPr>
+              <w:t>Pas d'élévation de privilège possible : la table admins n'a qu'une politique de lecture de sa propre ligne, aucun client ne peut s'y inscrire.</w:t>
+            </w:r>
+          </w:p>
+        </w:tc>
+        <w:tc>
+          <w:tcPr>
+            <w:tcW w:w="2300" w:type="dxa"/>
+            <w:tcBorders>
+              <w:top w:val="single" w:sz="4" w:space="0" w:color="E2DED2"/>
+              <w:left w:val="single" w:sz="4" w:space="0" w:color="E2DED2"/>
+              <w:bottom w:val="single" w:sz="4" w:space="0" w:color="E2DED2"/>
+              <w:right w:val="single" w:sz="4" w:space="0" w:color="E2DED2"/>
+            </w:tcBorders>
+            <w:tcMar>
+              <w:top w:w="70" w:type="dxa"/>
+              <w:left w:w="110" w:type="dxa"/>
+              <w:bottom w:w="70" w:type="dxa"/>
+              <w:right w:w="110" w:type="dxa"/>
+            </w:tcMar>
+          </w:tcPr>
+          <w:p>
+            <w:r>
+              <w:rPr>
+                <w:sz w:val="19"/>
+                <w:szCs w:val="19"/>
+              </w:rPr>
+              <w:t>base (pg_policies)</w:t>
+            </w:r>
+          </w:p>
+        </w:tc>
+      </w:tr>
+      <w:tr>
+        <w:tblPrEx>
+          <w:tblCellMar>
+            <w:top w:w="0" w:type="dxa"/>
+            <w:bottom w:w="0" w:type="dxa"/>
+          </w:tblCellMar>
+        </w:tblPrEx>
+        <w:tc>
+          <w:tcPr>
+            <w:tcW w:w="2000" w:type="dxa"/>
+            <w:tcBorders>
+              <w:top w:val="single" w:sz="4" w:space="0" w:color="E2DED2"/>
+              <w:left w:val="single" w:sz="4" w:space="0" w:color="E2DED2"/>
+              <w:bottom w:val="single" w:sz="4" w:space="0" w:color="E2DED2"/>
+              <w:right w:val="single" w:sz="4" w:space="0" w:color="E2DED2"/>
+            </w:tcBorders>
+            <w:tcMar>
+              <w:top w:w="70" w:type="dxa"/>
+              <w:left w:w="110" w:type="dxa"/>
+              <w:bottom w:w="70" w:type="dxa"/>
+              <w:right w:w="110" w:type="dxa"/>
+            </w:tcMar>
+          </w:tcPr>
+          <w:p>
+            <w:r>
+              <w:rPr>
+                <w:sz w:val="19"/>
+                <w:szCs w:val="19"/>
+              </w:rPr>
+              <w:t>Contrôle d'accès</w:t>
+            </w:r>
+          </w:p>
+        </w:tc>
+        <w:tc>
+          <w:tcPr>
+            <w:tcW w:w="5338" w:type="dxa"/>
+            <w:tcBorders>
+              <w:top w:val="single" w:sz="4" w:space="0" w:color="E2DED2"/>
+              <w:left w:val="single" w:sz="4" w:space="0" w:color="E2DED2"/>
+              <w:bottom w:val="single" w:sz="4" w:space="0" w:color="E2DED2"/>
+              <w:right w:val="single" w:sz="4" w:space="0" w:color="E2DED2"/>
+            </w:tcBorders>
+            <w:tcMar>
+              <w:top w:w="70" w:type="dxa"/>
+              <w:left w:w="110" w:type="dxa"/>
+              <w:bottom w:w="70" w:type="dxa"/>
+              <w:right w:w="110" w:type="dxa"/>
+            </w:tcMar>
+          </w:tcPr>
+          <w:p>
+            <w:r>
+              <w:rPr>
+                <w:sz w:val="19"/>
+                <w:szCs w:val="19"/>
+              </w:rPr>
+              <w:t>Fiche client : clients_update impose user_id = auth.uid() en lecture et en écriture, une fiche ne peut pas être réattribuée à un autre compte.</w:t>
+            </w:r>
+          </w:p>
+        </w:tc>
+        <w:tc>
+          <w:tcPr>
+            <w:tcW w:w="2300" w:type="dxa"/>
+            <w:tcBorders>
+              <w:top w:val="single" w:sz="4" w:space="0" w:color="E2DED2"/>
+              <w:left w:val="single" w:sz="4" w:space="0" w:color="E2DED2"/>
+              <w:bottom w:val="single" w:sz="4" w:space="0" w:color="E2DED2"/>
+              <w:right w:val="single" w:sz="4" w:space="0" w:color="E2DED2"/>
+            </w:tcBorders>
+            <w:tcMar>
+              <w:top w:w="70" w:type="dxa"/>
+              <w:left w:w="110" w:type="dxa"/>
+              <w:bottom w:w="70" w:type="dxa"/>
+              <w:right w:w="110" w:type="dxa"/>
+            </w:tcMar>
+          </w:tcPr>
+          <w:p>
+            <w:r>
+              <w:rPr>
+                <w:sz w:val="19"/>
+                <w:szCs w:val="19"/>
+              </w:rPr>
+              <w:t>base (pg_policies)</w:t>
+            </w:r>
+          </w:p>
+        </w:tc>
+      </w:tr>
+      <w:tr>
+        <w:tblPrEx>
+          <w:tblCellMar>
+            <w:top w:w="0" w:type="dxa"/>
+            <w:bottom w:w="0" w:type="dxa"/>
+          </w:tblCellMar>
+        </w:tblPrEx>
+        <w:tc>
+          <w:tcPr>
+            <w:tcW w:w="2000" w:type="dxa"/>
+            <w:tcBorders>
+              <w:top w:val="single" w:sz="4" w:space="0" w:color="E2DED2"/>
+              <w:left w:val="single" w:sz="4" w:space="0" w:color="E2DED2"/>
+              <w:bottom w:val="single" w:sz="4" w:space="0" w:color="E2DED2"/>
+              <w:right w:val="single" w:sz="4" w:space="0" w:color="E2DED2"/>
+            </w:tcBorders>
+            <w:tcMar>
+              <w:top w:w="70" w:type="dxa"/>
+              <w:left w:w="110" w:type="dxa"/>
+              <w:bottom w:w="70" w:type="dxa"/>
+              <w:right w:w="110" w:type="dxa"/>
+            </w:tcMar>
+          </w:tcPr>
+          <w:p>
+            <w:r>
+              <w:rPr>
+                <w:sz w:val="19"/>
+                <w:szCs w:val="19"/>
+              </w:rPr>
+              <w:t>Contrôle d'accès</w:t>
+            </w:r>
+          </w:p>
+        </w:tc>
+        <w:tc>
+          <w:tcPr>
+            <w:tcW w:w="5338" w:type="dxa"/>
+            <w:tcBorders>
+              <w:top w:val="single" w:sz="4" w:space="0" w:color="E2DED2"/>
+              <w:left w:val="single" w:sz="4" w:space="0" w:color="E2DED2"/>
+              <w:bottom w:val="single" w:sz="4" w:space="0" w:color="E2DED2"/>
+              <w:right w:val="single" w:sz="4" w:space="0" w:color="E2DED2"/>
+            </w:tcBorders>
+            <w:tcMar>
+              <w:top w:w="70" w:type="dxa"/>
+              <w:left w:w="110" w:type="dxa"/>
+              <w:bottom w:w="70" w:type="dxa"/>
+              <w:right w:w="110" w:type="dxa"/>
+            </w:tcMar>
+          </w:tcPr>
+          <w:p>
+            <w:r>
+              <w:rPr>
+                <w:sz w:val="19"/>
+                <w:szCs w:val="19"/>
+              </w:rPr>
+              <w:t>Fonction is_admin() : search_path figé (protection contre le détournement de schéma), non SECURITY DEFINER, lecture limitée par la RLS.</w:t>
+            </w:r>
+          </w:p>
+        </w:tc>
+        <w:tc>
+          <w:tcPr>
+            <w:tcW w:w="2300" w:type="dxa"/>
+            <w:tcBorders>
+              <w:top w:val="single" w:sz="4" w:space="0" w:color="E2DED2"/>
+              <w:left w:val="single" w:sz="4" w:space="0" w:color="E2DED2"/>
+              <w:bottom w:val="single" w:sz="4" w:space="0" w:color="E2DED2"/>
+              <w:right w:val="single" w:sz="4" w:space="0" w:color="E2DED2"/>
+            </w:tcBorders>
+            <w:tcMar>
+              <w:top w:w="70" w:type="dxa"/>
+              <w:left w:w="110" w:type="dxa"/>
+              <w:bottom w:w="70" w:type="dxa"/>
+              <w:right w:w="110" w:type="dxa"/>
+            </w:tcMar>
+          </w:tcPr>
+          <w:p>
+            <w:r>
+              <w:rPr>
+                <w:sz w:val="19"/>
+                <w:szCs w:val="19"/>
+              </w:rPr>
+              <w:t>base (pg_proc)</w:t>
+            </w:r>
+          </w:p>
+        </w:tc>
+      </w:tr>
+      <w:tr>
+        <w:tblPrEx>
+          <w:tblCellMar>
+            <w:top w:w="0" w:type="dxa"/>
+            <w:bottom w:w="0" w:type="dxa"/>
+          </w:tblCellMar>
+        </w:tblPrEx>
+        <w:tc>
+          <w:tcPr>
+            <w:tcW w:w="2000" w:type="dxa"/>
+            <w:tcBorders>
+              <w:top w:val="single" w:sz="4" w:space="0" w:color="E2DED2"/>
+              <w:left w:val="single" w:sz="4" w:space="0" w:color="E2DED2"/>
+              <w:bottom w:val="single" w:sz="4" w:space="0" w:color="E2DED2"/>
+              <w:right w:val="single" w:sz="4" w:space="0" w:color="E2DED2"/>
+            </w:tcBorders>
+            <w:tcMar>
+              <w:top w:w="70" w:type="dxa"/>
+              <w:left w:w="110" w:type="dxa"/>
+              <w:bottom w:w="70" w:type="dxa"/>
+              <w:right w:w="110" w:type="dxa"/>
+            </w:tcMar>
+          </w:tcPr>
+          <w:p>
+            <w:r>
+              <w:rPr>
+                <w:sz w:val="19"/>
+                <w:szCs w:val="19"/>
+              </w:rPr>
+              <w:t>Contrôle d'accès</w:t>
+            </w:r>
+          </w:p>
+        </w:tc>
+        <w:tc>
+          <w:tcPr>
+            <w:tcW w:w="5338" w:type="dxa"/>
+            <w:tcBorders>
+              <w:top w:val="single" w:sz="4" w:space="0" w:color="E2DED2"/>
+              <w:left w:val="single" w:sz="4" w:space="0" w:color="E2DED2"/>
+              <w:bottom w:val="single" w:sz="4" w:space="0" w:color="E2DED2"/>
+              <w:right w:val="single" w:sz="4" w:space="0" w:color="E2DED2"/>
+            </w:tcBorders>
+            <w:tcMar>
+              <w:top w:w="70" w:type="dxa"/>
+              <w:left w:w="110" w:type="dxa"/>
+              <w:bottom w:w="70" w:type="dxa"/>
+              <w:right w:w="110" w:type="dxa"/>
+            </w:tcMar>
+          </w:tcPr>
+          <w:p>
+            <w:r>
+              <w:rPr>
+                <w:sz w:val="19"/>
+                <w:szCs w:val="19"/>
+              </w:rPr>
+              <w:t>Back-office : l'interface admin est filtrée côté client, mais toutes les données sont protégées côté serveur par la RLS (politiques *_admin_all fondées sur is_admin()).</w:t>
+            </w:r>
+          </w:p>
+        </w:tc>
+        <w:tc>
+          <w:tcPr>
+            <w:tcW w:w="2300" w:type="dxa"/>
+            <w:tcBorders>
+              <w:top w:val="single" w:sz="4" w:space="0" w:color="E2DED2"/>
+              <w:left w:val="single" w:sz="4" w:space="0" w:color="E2DED2"/>
+              <w:bottom w:val="single" w:sz="4" w:space="0" w:color="E2DED2"/>
+              <w:right w:val="single" w:sz="4" w:space="0" w:color="E2DED2"/>
+            </w:tcBorders>
+            <w:tcMar>
+              <w:top w:w="70" w:type="dxa"/>
+              <w:left w:w="110" w:type="dxa"/>
+              <w:bottom w:w="70" w:type="dxa"/>
+              <w:right w:w="110" w:type="dxa"/>
+            </w:tcMar>
+          </w:tcPr>
+          <w:p>
+            <w:r>
+              <w:rPr>
+                <w:sz w:val="19"/>
+                <w:szCs w:val="19"/>
+              </w:rPr>
+              <w:t>code + base</w:t>
+            </w:r>
+          </w:p>
+        </w:tc>
+      </w:tr>
+      <w:tr>
+        <w:tblPrEx>
+          <w:tblCellMar>
+            <w:top w:w="0" w:type="dxa"/>
+            <w:bottom w:w="0" w:type="dxa"/>
+          </w:tblCellMar>
+        </w:tblPrEx>
+        <w:tc>
+          <w:tcPr>
+            <w:tcW w:w="2000" w:type="dxa"/>
+            <w:tcBorders>
+              <w:top w:val="single" w:sz="4" w:space="0" w:color="E2DED2"/>
+              <w:left w:val="single" w:sz="4" w:space="0" w:color="E2DED2"/>
+              <w:bottom w:val="single" w:sz="4" w:space="0" w:color="E2DED2"/>
+              <w:right w:val="single" w:sz="4" w:space="0" w:color="E2DED2"/>
+            </w:tcBorders>
+            <w:tcMar>
+              <w:top w:w="70" w:type="dxa"/>
+              <w:left w:w="110" w:type="dxa"/>
+              <w:bottom w:w="70" w:type="dxa"/>
+              <w:right w:w="110" w:type="dxa"/>
+            </w:tcMar>
+          </w:tcPr>
+          <w:p>
+            <w:r>
+              <w:rPr>
+                <w:sz w:val="19"/>
+                <w:szCs w:val="19"/>
+              </w:rPr>
+              <w:t>Intégrité des données</w:t>
+            </w:r>
+          </w:p>
+        </w:tc>
+        <w:tc>
+          <w:tcPr>
+            <w:tcW w:w="5338" w:type="dxa"/>
+            <w:tcBorders>
+              <w:top w:val="single" w:sz="4" w:space="0" w:color="E2DED2"/>
+              <w:left w:val="single" w:sz="4" w:space="0" w:color="E2DED2"/>
+              <w:bottom w:val="single" w:sz="4" w:space="0" w:color="E2DED2"/>
+              <w:right w:val="single" w:sz="4" w:space="0" w:color="E2DED2"/>
+            </w:tcBorders>
+            <w:tcMar>
+              <w:top w:w="70" w:type="dxa"/>
+              <w:left w:w="110" w:type="dxa"/>
+              <w:bottom w:w="70" w:type="dxa"/>
+              <w:right w:w="110" w:type="dxa"/>
+            </w:tcMar>
+          </w:tcPr>
+          <w:p>
+            <w:r>
+              <w:rPr>
+                <w:sz w:val="19"/>
+                <w:szCs w:val="19"/>
+              </w:rPr>
+              <w:t>Clés étrangères sur toutes les relations ; suppression d'un devis commandé bloquée (commandes.devis_id ON DELETE RESTRICT).</w:t>
+            </w:r>
+          </w:p>
+        </w:tc>
+        <w:tc>
+          <w:tcPr>
+            <w:tcW w:w="2300" w:type="dxa"/>
+            <w:tcBorders>
+              <w:top w:val="single" w:sz="4" w:space="0" w:color="E2DED2"/>
+              <w:left w:val="single" w:sz="4" w:space="0" w:color="E2DED2"/>
+              <w:bottom w:val="single" w:sz="4" w:space="0" w:color="E2DED2"/>
+              <w:right w:val="single" w:sz="4" w:space="0" w:color="E2DED2"/>
+            </w:tcBorders>
+            <w:tcMar>
+              <w:top w:w="70" w:type="dxa"/>
+              <w:left w:w="110" w:type="dxa"/>
+              <w:bottom w:w="70" w:type="dxa"/>
+              <w:right w:w="110" w:type="dxa"/>
+            </w:tcMar>
+          </w:tcPr>
+          <w:p>
+            <w:r>
+              <w:rPr>
+                <w:sz w:val="19"/>
+                <w:szCs w:val="19"/>
+              </w:rPr>
+              <w:t>base (pg_constraint)</w:t>
+            </w:r>
+          </w:p>
+        </w:tc>
+      </w:tr>
+      <w:tr>
+        <w:tblPrEx>
+          <w:tblCellMar>
+            <w:top w:w="0" w:type="dxa"/>
+            <w:bottom w:w="0" w:type="dxa"/>
+          </w:tblCellMar>
+        </w:tblPrEx>
+        <w:tc>
+          <w:tcPr>
+            <w:tcW w:w="2000" w:type="dxa"/>
+            <w:tcBorders>
+              <w:top w:val="single" w:sz="4" w:space="0" w:color="E2DED2"/>
+              <w:left w:val="single" w:sz="4" w:space="0" w:color="E2DED2"/>
+              <w:bottom w:val="single" w:sz="4" w:space="0" w:color="E2DED2"/>
+              <w:right w:val="single" w:sz="4" w:space="0" w:color="E2DED2"/>
+            </w:tcBorders>
+            <w:tcMar>
+              <w:top w:w="70" w:type="dxa"/>
+              <w:left w:w="110" w:type="dxa"/>
+              <w:bottom w:w="70" w:type="dxa"/>
+              <w:right w:w="110" w:type="dxa"/>
+            </w:tcMar>
+          </w:tcPr>
+          <w:p>
+            <w:r>
+              <w:rPr>
+                <w:sz w:val="19"/>
+                <w:szCs w:val="19"/>
+              </w:rPr>
+              <w:t>Intégrité des données</w:t>
+            </w:r>
+          </w:p>
+        </w:tc>
+        <w:tc>
+          <w:tcPr>
+            <w:tcW w:w="5338" w:type="dxa"/>
+            <w:tcBorders>
+              <w:top w:val="single" w:sz="4" w:space="0" w:color="E2DED2"/>
+              <w:left w:val="single" w:sz="4" w:space="0" w:color="E2DED2"/>
+              <w:bottom w:val="single" w:sz="4" w:space="0" w:color="E2DED2"/>
+              <w:right w:val="single" w:sz="4" w:space="0" w:color="E2DED2"/>
+            </w:tcBorders>
+            <w:tcMar>
+              <w:top w:w="70" w:type="dxa"/>
+              <w:left w:w="110" w:type="dxa"/>
+              <w:bottom w:w="70" w:type="dxa"/>
+              <w:right w:w="110" w:type="dxa"/>
+            </w:tcMar>
+          </w:tcPr>
+          <w:p>
+            <w:r>
+              <w:rPr>
+                <w:sz w:val="19"/>
+                <w:szCs w:val="19"/>
+              </w:rPr>
+              <w:t>Contraintes métier : quantité de pièce &gt; 0, numéro de devis unique, une seule commande par devis, référence client limitée à 50 caractères.</w:t>
+            </w:r>
+          </w:p>
+        </w:tc>
+        <w:tc>
+          <w:tcPr>
+            <w:tcW w:w="2300" w:type="dxa"/>
+            <w:tcBorders>
+              <w:top w:val="single" w:sz="4" w:space="0" w:color="E2DED2"/>
+              <w:left w:val="single" w:sz="4" w:space="0" w:color="E2DED2"/>
+              <w:bottom w:val="single" w:sz="4" w:space="0" w:color="E2DED2"/>
+              <w:right w:val="single" w:sz="4" w:space="0" w:color="E2DED2"/>
+            </w:tcBorders>
+            <w:tcMar>
+              <w:top w:w="70" w:type="dxa"/>
+              <w:left w:w="110" w:type="dxa"/>
+              <w:bottom w:w="70" w:type="dxa"/>
+              <w:right w:w="110" w:type="dxa"/>
+            </w:tcMar>
+          </w:tcPr>
+          <w:p>
+            <w:r>
+              <w:rPr>
+                <w:sz w:val="19"/>
+                <w:szCs w:val="19"/>
+              </w:rPr>
+              <w:t>base (pg_constraint)</w:t>
+            </w:r>
+          </w:p>
+        </w:tc>
+      </w:tr>
+      <w:tr>
+        <w:tblPrEx>
+          <w:tblCellMar>
+            <w:top w:w="0" w:type="dxa"/>
+            <w:bottom w:w="0" w:type="dxa"/>
+          </w:tblCellMar>
+        </w:tblPrEx>
+        <w:tc>
+          <w:tcPr>
+            <w:tcW w:w="2000" w:type="dxa"/>
+            <w:tcBorders>
+              <w:top w:val="single" w:sz="4" w:space="0" w:color="E2DED2"/>
+              <w:left w:val="single" w:sz="4" w:space="0" w:color="E2DED2"/>
+              <w:bottom w:val="single" w:sz="4" w:space="0" w:color="E2DED2"/>
+              <w:right w:val="single" w:sz="4" w:space="0" w:color="E2DED2"/>
+            </w:tcBorders>
+            <w:tcMar>
+              <w:top w:w="70" w:type="dxa"/>
+              <w:left w:w="110" w:type="dxa"/>
+              <w:bottom w:w="70" w:type="dxa"/>
+              <w:right w:w="110" w:type="dxa"/>
+            </w:tcMar>
+          </w:tcPr>
+          <w:p>
+            <w:r>
+              <w:rPr>
+                <w:sz w:val="19"/>
+                <w:szCs w:val="19"/>
+              </w:rPr>
+              <w:t>Intégrité des données</w:t>
+            </w:r>
+          </w:p>
+        </w:tc>
+        <w:tc>
+          <w:tcPr>
+            <w:tcW w:w="5338" w:type="dxa"/>
+            <w:tcBorders>
+              <w:top w:val="single" w:sz="4" w:space="0" w:color="E2DED2"/>
+              <w:left w:val="single" w:sz="4" w:space="0" w:color="E2DED2"/>
+              <w:bottom w:val="single" w:sz="4" w:space="0" w:color="E2DED2"/>
+              <w:right w:val="single" w:sz="4" w:space="0" w:color="E2DED2"/>
+            </w:tcBorders>
+            <w:tcMar>
+              <w:top w:w="70" w:type="dxa"/>
+              <w:left w:w="110" w:type="dxa"/>
+              <w:bottom w:w="70" w:type="dxa"/>
+              <w:right w:w="110" w:type="dxa"/>
+            </w:tcMar>
+          </w:tcPr>
+          <w:p>
+            <w:r>
+              <w:rPr>
+                <w:sz w:val="19"/>
+                <w:szCs w:val="19"/>
+              </w:rPr>
+              <w:t>Checkout idempotent : chaque devis entièrement enregistré est retiré du panier, un nouvel essai après échec ne crée pas de doublon.</w:t>
+            </w:r>
+          </w:p>
+        </w:tc>
+        <w:tc>
+          <w:tcPr>
+            <w:tcW w:w="2300" w:type="dxa"/>
+            <w:tcBorders>
+              <w:top w:val="single" w:sz="4" w:space="0" w:color="E2DED2"/>
+              <w:left w:val="single" w:sz="4" w:space="0" w:color="E2DED2"/>
+              <w:bottom w:val="single" w:sz="4" w:space="0" w:color="E2DED2"/>
+              <w:right w:val="single" w:sz="4" w:space="0" w:color="E2DED2"/>
+            </w:tcBorders>
+            <w:tcMar>
+              <w:top w:w="70" w:type="dxa"/>
+              <w:left w:w="110" w:type="dxa"/>
+              <w:bottom w:w="70" w:type="dxa"/>
+              <w:right w:w="110" w:type="dxa"/>
+            </w:tcMar>
+          </w:tcPr>
+          <w:p>
+            <w:r>
+              <w:rPr>
+                <w:sz w:val="19"/>
+                <w:szCs w:val="19"/>
+              </w:rPr>
+              <w:t>code (lib/checkout.ts)</w:t>
+            </w:r>
+          </w:p>
+        </w:tc>
+      </w:tr>
+      <w:tr>
+        <w:tblPrEx>
+          <w:tblCellMar>
+            <w:top w:w="0" w:type="dxa"/>
+            <w:bottom w:w="0" w:type="dxa"/>
+          </w:tblCellMar>
+        </w:tblPrEx>
+        <w:tc>
+          <w:tcPr>
+            <w:tcW w:w="2000" w:type="dxa"/>
+            <w:tcBorders>
+              <w:top w:val="single" w:sz="4" w:space="0" w:color="E2DED2"/>
+              <w:left w:val="single" w:sz="4" w:space="0" w:color="E2DED2"/>
+              <w:bottom w:val="single" w:sz="4" w:space="0" w:color="E2DED2"/>
+              <w:right w:val="single" w:sz="4" w:space="0" w:color="E2DED2"/>
+            </w:tcBorders>
+            <w:tcMar>
+              <w:top w:w="70" w:type="dxa"/>
+              <w:left w:w="110" w:type="dxa"/>
+              <w:bottom w:w="70" w:type="dxa"/>
+              <w:right w:w="110" w:type="dxa"/>
+            </w:tcMar>
+          </w:tcPr>
+          <w:p>
+            <w:r>
+              <w:rPr>
+                <w:sz w:val="19"/>
+                <w:szCs w:val="19"/>
+              </w:rPr>
+              <w:t>Intégrité des données</w:t>
+            </w:r>
+          </w:p>
+        </w:tc>
+        <w:tc>
+          <w:tcPr>
+            <w:tcW w:w="5338" w:type="dxa"/>
+            <w:tcBorders>
+              <w:top w:val="single" w:sz="4" w:space="0" w:color="E2DED2"/>
+              <w:left w:val="single" w:sz="4" w:space="0" w:color="E2DED2"/>
+              <w:bottom w:val="single" w:sz="4" w:space="0" w:color="E2DED2"/>
+              <w:right w:val="single" w:sz="4" w:space="0" w:color="E2DED2"/>
+            </w:tcBorders>
+            <w:tcMar>
+              <w:top w:w="70" w:type="dxa"/>
+              <w:left w:w="110" w:type="dxa"/>
+              <w:bottom w:w="70" w:type="dxa"/>
+              <w:right w:w="110" w:type="dxa"/>
+            </w:tcMar>
+          </w:tcPr>
+          <w:p>
+            <w:r>
+              <w:rPr>
+                <w:sz w:val="19"/>
+                <w:szCs w:val="19"/>
+              </w:rPr>
+              <w:t>Bon de commande PDF envoyé avant toute écriture en base : un échec d'envoi ne laisse aucun devis orphelin.</w:t>
+            </w:r>
+          </w:p>
+        </w:tc>
+        <w:tc>
+          <w:tcPr>
+            <w:tcW w:w="2300" w:type="dxa"/>
+            <w:tcBorders>
+              <w:top w:val="single" w:sz="4" w:space="0" w:color="E2DED2"/>
+              <w:left w:val="single" w:sz="4" w:space="0" w:color="E2DED2"/>
+              <w:bottom w:val="single" w:sz="4" w:space="0" w:color="E2DED2"/>
+              <w:right w:val="single" w:sz="4" w:space="0" w:color="E2DED2"/>
+            </w:tcBorders>
+            <w:tcMar>
+              <w:top w:w="70" w:type="dxa"/>
+              <w:left w:w="110" w:type="dxa"/>
+              <w:bottom w:w="70" w:type="dxa"/>
+              <w:right w:w="110" w:type="dxa"/>
+            </w:tcMar>
+          </w:tcPr>
+          <w:p>
+            <w:r>
+              <w:rPr>
+                <w:sz w:val="19"/>
+                <w:szCs w:val="19"/>
+              </w:rPr>
+              <w:t>code (lib/checkout.ts)</w:t>
+            </w:r>
+          </w:p>
+        </w:tc>
+      </w:tr>
+      <w:tr>
+        <w:tblPrEx>
+          <w:tblCellMar>
+            <w:top w:w="0" w:type="dxa"/>
+            <w:bottom w:w="0" w:type="dxa"/>
+          </w:tblCellMar>
+        </w:tblPrEx>
+        <w:tc>
+          <w:tcPr>
+            <w:tcW w:w="2000" w:type="dxa"/>
+            <w:tcBorders>
+              <w:top w:val="single" w:sz="4" w:space="0" w:color="E2DED2"/>
+              <w:left w:val="single" w:sz="4" w:space="0" w:color="E2DED2"/>
+              <w:bottom w:val="single" w:sz="4" w:space="0" w:color="E2DED2"/>
+              <w:right w:val="single" w:sz="4" w:space="0" w:color="E2DED2"/>
+            </w:tcBorders>
+            <w:tcMar>
+              <w:top w:w="70" w:type="dxa"/>
+              <w:left w:w="110" w:type="dxa"/>
+              <w:bottom w:w="70" w:type="dxa"/>
+              <w:right w:w="110" w:type="dxa"/>
+            </w:tcMar>
+          </w:tcPr>
+          <w:p>
+            <w:r>
+              <w:rPr>
+                <w:sz w:val="19"/>
+                <w:szCs w:val="19"/>
+              </w:rPr>
+              <w:t>Fichiers et stockage</w:t>
+            </w:r>
+          </w:p>
+        </w:tc>
+        <w:tc>
+          <w:tcPr>
+            <w:tcW w:w="5338" w:type="dxa"/>
+            <w:tcBorders>
+              <w:top w:val="single" w:sz="4" w:space="0" w:color="E2DED2"/>
+              <w:left w:val="single" w:sz="4" w:space="0" w:color="E2DED2"/>
+              <w:bottom w:val="single" w:sz="4" w:space="0" w:color="E2DED2"/>
+              <w:right w:val="single" w:sz="4" w:space="0" w:color="E2DED2"/>
+            </w:tcBorders>
+            <w:tcMar>
+              <w:top w:w="70" w:type="dxa"/>
+              <w:left w:w="110" w:type="dxa"/>
+              <w:bottom w:w="70" w:type="dxa"/>
+              <w:right w:w="110" w:type="dxa"/>
+            </w:tcMar>
+          </w:tcPr>
+          <w:p>
+            <w:r>
+              <w:rPr>
+                <w:sz w:val="19"/>
+                <w:szCs w:val="19"/>
+              </w:rPr>
+              <w:t>Bucket stl-files privé (non public) : aucun fichier accessible sans authentification.</w:t>
+            </w:r>
+          </w:p>
+        </w:tc>
+        <w:tc>
+          <w:tcPr>
+            <w:tcW w:w="2300" w:type="dxa"/>
+            <w:tcBorders>
+              <w:top w:val="single" w:sz="4" w:space="0" w:color="E2DED2"/>
+              <w:left w:val="single" w:sz="4" w:space="0" w:color="E2DED2"/>
+              <w:bottom w:val="single" w:sz="4" w:space="0" w:color="E2DED2"/>
+              <w:right w:val="single" w:sz="4" w:space="0" w:color="E2DED2"/>
+            </w:tcBorders>
+            <w:tcMar>
+              <w:top w:w="70" w:type="dxa"/>
+              <w:left w:w="110" w:type="dxa"/>
+              <w:bottom w:w="70" w:type="dxa"/>
+              <w:right w:w="110" w:type="dxa"/>
+            </w:tcMar>
+          </w:tcPr>
+          <w:p>
+            <w:r>
+              <w:rPr>
+                <w:sz w:val="19"/>
+                <w:szCs w:val="19"/>
+              </w:rPr>
+              <w:t>base (storage.buckets)</w:t>
+            </w:r>
+          </w:p>
+        </w:tc>
+      </w:tr>
+      <w:tr>
+        <w:tblPrEx>
+          <w:tblCellMar>
+            <w:top w:w="0" w:type="dxa"/>
+            <w:bottom w:w="0" w:type="dxa"/>
+          </w:tblCellMar>
+        </w:tblPrEx>
+        <w:tc>
+          <w:tcPr>
+            <w:tcW w:w="2000" w:type="dxa"/>
+            <w:tcBorders>
+              <w:top w:val="single" w:sz="4" w:space="0" w:color="E2DED2"/>
+              <w:left w:val="single" w:sz="4" w:space="0" w:color="E2DED2"/>
+              <w:bottom w:val="single" w:sz="4" w:space="0" w:color="E2DED2"/>
+              <w:right w:val="single" w:sz="4" w:space="0" w:color="E2DED2"/>
+            </w:tcBorders>
+            <w:tcMar>
+              <w:top w:w="70" w:type="dxa"/>
+              <w:left w:w="110" w:type="dxa"/>
+              <w:bottom w:w="70" w:type="dxa"/>
+              <w:right w:w="110" w:type="dxa"/>
+            </w:tcMar>
+          </w:tcPr>
+          <w:p>
+            <w:r>
+              <w:rPr>
+                <w:sz w:val="19"/>
+                <w:szCs w:val="19"/>
+              </w:rPr>
+              <w:t>Fichiers et stockage</w:t>
+            </w:r>
+          </w:p>
+        </w:tc>
+        <w:tc>
+          <w:tcPr>
+            <w:tcW w:w="5338" w:type="dxa"/>
+            <w:tcBorders>
+              <w:top w:val="single" w:sz="4" w:space="0" w:color="E2DED2"/>
+              <w:left w:val="single" w:sz="4" w:space="0" w:color="E2DED2"/>
+              <w:bottom w:val="single" w:sz="4" w:space="0" w:color="E2DED2"/>
+              <w:right w:val="single" w:sz="4" w:space="0" w:color="E2DED2"/>
+            </w:tcBorders>
+            <w:tcMar>
+              <w:top w:w="70" w:type="dxa"/>
+              <w:left w:w="110" w:type="dxa"/>
+              <w:bottom w:w="70" w:type="dxa"/>
+              <w:right w:w="110" w:type="dxa"/>
+            </w:tcMar>
+          </w:tcPr>
+          <w:p>
+            <w:r>
+              <w:rPr>
+                <w:sz w:val="19"/>
+                <w:szCs w:val="19"/>
+              </w:rPr>
+              <w:t>Téléchargement admin par URL signée à durée limitée (1 h), en mode pièce jointe.</w:t>
+            </w:r>
+          </w:p>
+        </w:tc>
+        <w:tc>
+          <w:tcPr>
+            <w:tcW w:w="2300" w:type="dxa"/>
+            <w:tcBorders>
+              <w:top w:val="single" w:sz="4" w:space="0" w:color="E2DED2"/>
+              <w:left w:val="single" w:sz="4" w:space="0" w:color="E2DED2"/>
+              <w:bottom w:val="single" w:sz="4" w:space="0" w:color="E2DED2"/>
+              <w:right w:val="single" w:sz="4" w:space="0" w:color="E2DED2"/>
+            </w:tcBorders>
+            <w:tcMar>
+              <w:top w:w="70" w:type="dxa"/>
+              <w:left w:w="110" w:type="dxa"/>
+              <w:bottom w:w="70" w:type="dxa"/>
+              <w:right w:w="110" w:type="dxa"/>
+            </w:tcMar>
+          </w:tcPr>
+          <w:p>
+            <w:r>
+              <w:rPr>
+                <w:sz w:val="19"/>
+                <w:szCs w:val="19"/>
+              </w:rPr>
+              <w:t>code (lib/admin.ts)</w:t>
+            </w:r>
+          </w:p>
+        </w:tc>
+      </w:tr>
+      <w:tr>
+        <w:tblPrEx>
+          <w:tblCellMar>
+            <w:top w:w="0" w:type="dxa"/>
+            <w:bottom w:w="0" w:type="dxa"/>
+          </w:tblCellMar>
+        </w:tblPrEx>
+        <w:tc>
+          <w:tcPr>
+            <w:tcW w:w="2000" w:type="dxa"/>
+            <w:tcBorders>
+              <w:top w:val="single" w:sz="4" w:space="0" w:color="E2DED2"/>
+              <w:left w:val="single" w:sz="4" w:space="0" w:color="E2DED2"/>
+              <w:bottom w:val="single" w:sz="4" w:space="0" w:color="E2DED2"/>
+              <w:right w:val="single" w:sz="4" w:space="0" w:color="E2DED2"/>
+            </w:tcBorders>
+            <w:tcMar>
+              <w:top w:w="70" w:type="dxa"/>
+              <w:left w:w="110" w:type="dxa"/>
+              <w:bottom w:w="70" w:type="dxa"/>
+              <w:right w:w="110" w:type="dxa"/>
+            </w:tcMar>
+          </w:tcPr>
+          <w:p>
+            <w:r>
+              <w:rPr>
+                <w:sz w:val="19"/>
+                <w:szCs w:val="19"/>
+              </w:rPr>
+              <w:t>Fichiers et stockage</w:t>
+            </w:r>
+          </w:p>
+        </w:tc>
+        <w:tc>
+          <w:tcPr>
+            <w:tcW w:w="5338" w:type="dxa"/>
+            <w:tcBorders>
+              <w:top w:val="single" w:sz="4" w:space="0" w:color="E2DED2"/>
+              <w:left w:val="single" w:sz="4" w:space="0" w:color="E2DED2"/>
+              <w:bottom w:val="single" w:sz="4" w:space="0" w:color="E2DED2"/>
+              <w:right w:val="single" w:sz="4" w:space="0" w:color="E2DED2"/>
+            </w:tcBorders>
+            <w:tcMar>
+              <w:top w:w="70" w:type="dxa"/>
+              <w:left w:w="110" w:type="dxa"/>
+              <w:bottom w:w="70" w:type="dxa"/>
+              <w:right w:w="110" w:type="dxa"/>
+            </w:tcMar>
+          </w:tcPr>
+          <w:p>
+            <w:r>
+              <w:rPr>
+                <w:sz w:val="19"/>
+                <w:szCs w:val="19"/>
+              </w:rPr>
+              <w:t>Noms de fichiers assainis avant stockage (séparateurs de chemin et caractères spéciaux retirés, longueur limitée) : pas de traversée de répertoire.</w:t>
+            </w:r>
+          </w:p>
+        </w:tc>
+        <w:tc>
+          <w:tcPr>
+            <w:tcW w:w="2300" w:type="dxa"/>
+            <w:tcBorders>
+              <w:top w:val="single" w:sz="4" w:space="0" w:color="E2DED2"/>
+              <w:left w:val="single" w:sz="4" w:space="0" w:color="E2DED2"/>
+              <w:bottom w:val="single" w:sz="4" w:space="0" w:color="E2DED2"/>
+              <w:right w:val="single" w:sz="4" w:space="0" w:color="E2DED2"/>
+            </w:tcBorders>
+            <w:tcMar>
+              <w:top w:w="70" w:type="dxa"/>
+              <w:left w:w="110" w:type="dxa"/>
+              <w:bottom w:w="70" w:type="dxa"/>
+              <w:right w:w="110" w:type="dxa"/>
+            </w:tcMar>
+          </w:tcPr>
+          <w:p>
+            <w:r>
+              <w:rPr>
+                <w:sz w:val="19"/>
+                <w:szCs w:val="19"/>
+              </w:rPr>
+              <w:t>code (safeFileName)</w:t>
+            </w:r>
+          </w:p>
+        </w:tc>
+      </w:tr>
+      <w:tr>
+        <w:tblPrEx>
+          <w:tblCellMar>
+            <w:top w:w="0" w:type="dxa"/>
+            <w:bottom w:w="0" w:type="dxa"/>
+          </w:tblCellMar>
+        </w:tblPrEx>
+        <w:tc>
+          <w:tcPr>
+            <w:tcW w:w="2000" w:type="dxa"/>
+            <w:tcBorders>
+              <w:top w:val="single" w:sz="4" w:space="0" w:color="E2DED2"/>
+              <w:left w:val="single" w:sz="4" w:space="0" w:color="E2DED2"/>
+              <w:bottom w:val="single" w:sz="4" w:space="0" w:color="E2DED2"/>
+              <w:right w:val="single" w:sz="4" w:space="0" w:color="E2DED2"/>
+            </w:tcBorders>
+            <w:tcMar>
+              <w:top w:w="70" w:type="dxa"/>
+              <w:left w:w="110" w:type="dxa"/>
+              <w:bottom w:w="70" w:type="dxa"/>
+              <w:right w:w="110" w:type="dxa"/>
+            </w:tcMar>
+          </w:tcPr>
+          <w:p>
+            <w:r>
+              <w:rPr>
+                <w:sz w:val="19"/>
+                <w:szCs w:val="19"/>
+              </w:rPr>
+              <w:t>Fichiers et stockage</w:t>
+            </w:r>
+          </w:p>
+        </w:tc>
+        <w:tc>
+          <w:tcPr>
+            <w:tcW w:w="5338" w:type="dxa"/>
+            <w:tcBorders>
+              <w:top w:val="single" w:sz="4" w:space="0" w:color="E2DED2"/>
+              <w:left w:val="single" w:sz="4" w:space="0" w:color="E2DED2"/>
+              <w:bottom w:val="single" w:sz="4" w:space="0" w:color="E2DED2"/>
+              <w:right w:val="single" w:sz="4" w:space="0" w:color="E2DED2"/>
+            </w:tcBorders>
+            <w:tcMar>
+              <w:top w:w="70" w:type="dxa"/>
+              <w:left w:w="110" w:type="dxa"/>
+              <w:bottom w:w="70" w:type="dxa"/>
+              <w:right w:w="110" w:type="dxa"/>
+            </w:tcMar>
+          </w:tcPr>
+          <w:p>
+            <w:r>
+              <w:rPr>
+                <w:sz w:val="19"/>
+                <w:szCs w:val="19"/>
+              </w:rPr>
+              <w:t>Chemins préfixés par l'index de pièce : deux fichiers homonymes ne s'écrasent pas.</w:t>
+            </w:r>
+          </w:p>
+        </w:tc>
+        <w:tc>
+          <w:tcPr>
+            <w:tcW w:w="2300" w:type="dxa"/>
+            <w:tcBorders>
+              <w:top w:val="single" w:sz="4" w:space="0" w:color="E2DED2"/>
+              <w:left w:val="single" w:sz="4" w:space="0" w:color="E2DED2"/>
+              <w:bottom w:val="single" w:sz="4" w:space="0" w:color="E2DED2"/>
+              <w:right w:val="single" w:sz="4" w:space="0" w:color="E2DED2"/>
+            </w:tcBorders>
+            <w:tcMar>
+              <w:top w:w="70" w:type="dxa"/>
+              <w:left w:w="110" w:type="dxa"/>
+              <w:bottom w:w="70" w:type="dxa"/>
+              <w:right w:w="110" w:type="dxa"/>
+            </w:tcMar>
+          </w:tcPr>
+          <w:p>
+            <w:r>
+              <w:rPr>
+                <w:sz w:val="19"/>
+                <w:szCs w:val="19"/>
+              </w:rPr>
+              <w:t>code (lib/checkout.ts)</w:t>
+            </w:r>
+          </w:p>
+        </w:tc>
+      </w:tr>
+      <w:tr>
+        <w:tblPrEx>
+          <w:tblCellMar>
+            <w:top w:w="0" w:type="dxa"/>
+            <w:bottom w:w="0" w:type="dxa"/>
+          </w:tblCellMar>
+        </w:tblPrEx>
+        <w:tc>
+          <w:tcPr>
+            <w:tcW w:w="2000" w:type="dxa"/>
+            <w:tcBorders>
+              <w:top w:val="single" w:sz="4" w:space="0" w:color="E2DED2"/>
+              <w:left w:val="single" w:sz="4" w:space="0" w:color="E2DED2"/>
+              <w:bottom w:val="single" w:sz="4" w:space="0" w:color="E2DED2"/>
+              <w:right w:val="single" w:sz="4" w:space="0" w:color="E2DED2"/>
+            </w:tcBorders>
+            <w:tcMar>
+              <w:top w:w="70" w:type="dxa"/>
+              <w:left w:w="110" w:type="dxa"/>
+              <w:bottom w:w="70" w:type="dxa"/>
+              <w:right w:w="110" w:type="dxa"/>
+            </w:tcMar>
+          </w:tcPr>
+          <w:p>
+            <w:r>
+              <w:rPr>
+                <w:sz w:val="19"/>
+                <w:szCs w:val="19"/>
+              </w:rPr>
+              <w:t>Fichiers et stockage</w:t>
+            </w:r>
+          </w:p>
+        </w:tc>
+        <w:tc>
+          <w:tcPr>
+            <w:tcW w:w="5338" w:type="dxa"/>
+            <w:tcBorders>
+              <w:top w:val="single" w:sz="4" w:space="0" w:color="E2DED2"/>
+              <w:left w:val="single" w:sz="4" w:space="0" w:color="E2DED2"/>
+              <w:bottom w:val="single" w:sz="4" w:space="0" w:color="E2DED2"/>
+              <w:right w:val="single" w:sz="4" w:space="0" w:color="E2DED2"/>
+            </w:tcBorders>
+            <w:tcMar>
+              <w:top w:w="70" w:type="dxa"/>
+              <w:left w:w="110" w:type="dxa"/>
+              <w:bottom w:w="70" w:type="dxa"/>
+              <w:right w:w="110" w:type="dxa"/>
+            </w:tcMar>
+          </w:tcPr>
+          <w:p>
+            <w:r>
+              <w:rPr>
+                <w:sz w:val="19"/>
+                <w:szCs w:val="19"/>
+              </w:rPr>
+              <w:t>Validation en double niveau du PDF : type et taille contrôlés dans le navigateur, types et taille imposés par le bucket côté serveur.</w:t>
+            </w:r>
+          </w:p>
+        </w:tc>
+        <w:tc>
+          <w:tcPr>
+            <w:tcW w:w="2300" w:type="dxa"/>
+            <w:tcBorders>
+              <w:top w:val="single" w:sz="4" w:space="0" w:color="E2DED2"/>
+              <w:left w:val="single" w:sz="4" w:space="0" w:color="E2DED2"/>
+              <w:bottom w:val="single" w:sz="4" w:space="0" w:color="E2DED2"/>
+              <w:right w:val="single" w:sz="4" w:space="0" w:color="E2DED2"/>
+            </w:tcBorders>
+            <w:tcMar>
+              <w:top w:w="70" w:type="dxa"/>
+              <w:left w:w="110" w:type="dxa"/>
+              <w:bottom w:w="70" w:type="dxa"/>
+              <w:right w:w="110" w:type="dxa"/>
+            </w:tcMar>
+          </w:tcPr>
+          <w:p>
+            <w:r>
+              <w:rPr>
+                <w:sz w:val="19"/>
+                <w:szCs w:val="19"/>
+              </w:rPr>
+              <w:t>code + base</w:t>
+            </w:r>
+          </w:p>
+        </w:tc>
+      </w:tr>
+      <w:tr>
+        <w:tblPrEx>
+          <w:tblCellMar>
+            <w:top w:w="0" w:type="dxa"/>
+            <w:bottom w:w="0" w:type="dxa"/>
+          </w:tblCellMar>
+        </w:tblPrEx>
+        <w:tc>
+          <w:tcPr>
+            <w:tcW w:w="2000" w:type="dxa"/>
+            <w:tcBorders>
+              <w:top w:val="single" w:sz="4" w:space="0" w:color="E2DED2"/>
+              <w:left w:val="single" w:sz="4" w:space="0" w:color="E2DED2"/>
+              <w:bottom w:val="single" w:sz="4" w:space="0" w:color="E2DED2"/>
+              <w:right w:val="single" w:sz="4" w:space="0" w:color="E2DED2"/>
+            </w:tcBorders>
+            <w:tcMar>
+              <w:top w:w="70" w:type="dxa"/>
+              <w:left w:w="110" w:type="dxa"/>
+              <w:bottom w:w="70" w:type="dxa"/>
+              <w:right w:w="110" w:type="dxa"/>
+            </w:tcMar>
+          </w:tcPr>
+          <w:p>
+            <w:r>
+              <w:rPr>
+                <w:sz w:val="19"/>
+                <w:szCs w:val="19"/>
+              </w:rPr>
+              <w:t>Secrets</w:t>
+            </w:r>
+          </w:p>
+        </w:tc>
+        <w:tc>
+          <w:tcPr>
+            <w:tcW w:w="5338" w:type="dxa"/>
+            <w:tcBorders>
+              <w:top w:val="single" w:sz="4" w:space="0" w:color="E2DED2"/>
+              <w:left w:val="single" w:sz="4" w:space="0" w:color="E2DED2"/>
+              <w:bottom w:val="single" w:sz="4" w:space="0" w:color="E2DED2"/>
+              <w:right w:val="single" w:sz="4" w:space="0" w:color="E2DED2"/>
+            </w:tcBorders>
+            <w:tcMar>
+              <w:top w:w="70" w:type="dxa"/>
+              <w:left w:w="110" w:type="dxa"/>
+              <w:bottom w:w="70" w:type="dxa"/>
+              <w:right w:w="110" w:type="dxa"/>
+            </w:tcMar>
+          </w:tcPr>
+          <w:p>
+            <w:r>
+              <w:rPr>
+                <w:sz w:val="19"/>
+                <w:szCs w:val="19"/>
+              </w:rPr>
+              <w:t>Aucune clé service_role dans le code : toutes les requêtes, y compris côté serveur, passent par la clé publique et le jeton de l'utilisateur, la RLS s'applique partout.</w:t>
+            </w:r>
+          </w:p>
+        </w:tc>
+        <w:tc>
+          <w:tcPr>
+            <w:tcW w:w="2300" w:type="dxa"/>
+            <w:tcBorders>
+              <w:top w:val="single" w:sz="4" w:space="0" w:color="E2DED2"/>
+              <w:left w:val="single" w:sz="4" w:space="0" w:color="E2DED2"/>
+              <w:bottom w:val="single" w:sz="4" w:space="0" w:color="E2DED2"/>
+              <w:right w:val="single" w:sz="4" w:space="0" w:color="E2DED2"/>
+            </w:tcBorders>
+            <w:tcMar>
+              <w:top w:w="70" w:type="dxa"/>
+              <w:left w:w="110" w:type="dxa"/>
+              <w:bottom w:w="70" w:type="dxa"/>
+              <w:right w:w="110" w:type="dxa"/>
+            </w:tcMar>
+          </w:tcPr>
+          <w:p>
+            <w:r>
+              <w:rPr>
+                <w:sz w:val="19"/>
+                <w:szCs w:val="19"/>
+              </w:rPr>
+              <w:t>code (grep)</w:t>
+            </w:r>
+          </w:p>
+        </w:tc>
+      </w:tr>
+      <w:tr>
+        <w:tblPrEx>
+          <w:tblCellMar>
+            <w:top w:w="0" w:type="dxa"/>
+            <w:bottom w:w="0" w:type="dxa"/>
+          </w:tblCellMar>
+        </w:tblPrEx>
+        <w:tc>
+          <w:tcPr>
+            <w:tcW w:w="2000" w:type="dxa"/>
+            <w:tcBorders>
+              <w:top w:val="single" w:sz="4" w:space="0" w:color="E2DED2"/>
+              <w:left w:val="single" w:sz="4" w:space="0" w:color="E2DED2"/>
+              <w:bottom w:val="single" w:sz="4" w:space="0" w:color="E2DED2"/>
+              <w:right w:val="single" w:sz="4" w:space="0" w:color="E2DED2"/>
+            </w:tcBorders>
+            <w:tcMar>
+              <w:top w:w="70" w:type="dxa"/>
+              <w:left w:w="110" w:type="dxa"/>
+              <w:bottom w:w="70" w:type="dxa"/>
+              <w:right w:w="110" w:type="dxa"/>
+            </w:tcMar>
+          </w:tcPr>
+          <w:p>
+            <w:r>
+              <w:rPr>
+                <w:sz w:val="19"/>
+                <w:szCs w:val="19"/>
+              </w:rPr>
+              <w:t>Secrets</w:t>
+            </w:r>
+          </w:p>
+        </w:tc>
+        <w:tc>
+          <w:tcPr>
+            <w:tcW w:w="5338" w:type="dxa"/>
+            <w:tcBorders>
+              <w:top w:val="single" w:sz="4" w:space="0" w:color="E2DED2"/>
+              <w:left w:val="single" w:sz="4" w:space="0" w:color="E2DED2"/>
+              <w:bottom w:val="single" w:sz="4" w:space="0" w:color="E2DED2"/>
+              <w:right w:val="single" w:sz="4" w:space="0" w:color="E2DED2"/>
+            </w:tcBorders>
+            <w:tcMar>
+              <w:top w:w="70" w:type="dxa"/>
+              <w:left w:w="110" w:type="dxa"/>
+              <w:bottom w:w="70" w:type="dxa"/>
+              <w:right w:w="110" w:type="dxa"/>
+            </w:tcMar>
+          </w:tcPr>
+          <w:p>
+            <w:r>
+              <w:rPr>
+                <w:sz w:val="19"/>
+                <w:szCs w:val="19"/>
+              </w:rPr>
+              <w:t>Clé Resend lue uniquement côté serveur : le module d'email n'est importé que par les deux routes API, jamais par un composant navigateur.</w:t>
+            </w:r>
+          </w:p>
+        </w:tc>
+        <w:tc>
+          <w:tcPr>
+            <w:tcW w:w="2300" w:type="dxa"/>
+            <w:tcBorders>
+              <w:top w:val="single" w:sz="4" w:space="0" w:color="E2DED2"/>
+              <w:left w:val="single" w:sz="4" w:space="0" w:color="E2DED2"/>
+              <w:bottom w:val="single" w:sz="4" w:space="0" w:color="E2DED2"/>
+              <w:right w:val="single" w:sz="4" w:space="0" w:color="E2DED2"/>
+            </w:tcBorders>
+            <w:tcMar>
+              <w:top w:w="70" w:type="dxa"/>
+              <w:left w:w="110" w:type="dxa"/>
+              <w:bottom w:w="70" w:type="dxa"/>
+              <w:right w:w="110" w:type="dxa"/>
+            </w:tcMar>
+          </w:tcPr>
+          <w:p>
+            <w:r>
+              <w:rPr>
+                <w:sz w:val="19"/>
+                <w:szCs w:val="19"/>
+              </w:rPr>
+              <w:t>code (grep)</w:t>
+            </w:r>
+          </w:p>
+        </w:tc>
+      </w:tr>
+      <w:tr>
+        <w:tblPrEx>
+          <w:tblCellMar>
+            <w:top w:w="0" w:type="dxa"/>
+            <w:bottom w:w="0" w:type="dxa"/>
+          </w:tblCellMar>
+        </w:tblPrEx>
+        <w:tc>
+          <w:tcPr>
+            <w:tcW w:w="2000" w:type="dxa"/>
+            <w:tcBorders>
+              <w:top w:val="single" w:sz="4" w:space="0" w:color="E2DED2"/>
+              <w:left w:val="single" w:sz="4" w:space="0" w:color="E2DED2"/>
+              <w:bottom w:val="single" w:sz="4" w:space="0" w:color="E2DED2"/>
+              <w:right w:val="single" w:sz="4" w:space="0" w:color="E2DED2"/>
+            </w:tcBorders>
+            <w:tcMar>
+              <w:top w:w="70" w:type="dxa"/>
+              <w:left w:w="110" w:type="dxa"/>
+              <w:bottom w:w="70" w:type="dxa"/>
+              <w:right w:w="110" w:type="dxa"/>
+            </w:tcMar>
+          </w:tcPr>
+          <w:p>
+            <w:r>
+              <w:rPr>
+                <w:sz w:val="19"/>
+                <w:szCs w:val="19"/>
+              </w:rPr>
+              <w:t>Secrets</w:t>
+            </w:r>
+          </w:p>
+        </w:tc>
+        <w:tc>
+          <w:tcPr>
+            <w:tcW w:w="5338" w:type="dxa"/>
+            <w:tcBorders>
+              <w:top w:val="single" w:sz="4" w:space="0" w:color="E2DED2"/>
+              <w:left w:val="single" w:sz="4" w:space="0" w:color="E2DED2"/>
+              <w:bottom w:val="single" w:sz="4" w:space="0" w:color="E2DED2"/>
+              <w:right w:val="single" w:sz="4" w:space="0" w:color="E2DED2"/>
+            </w:tcBorders>
+            <w:tcMar>
+              <w:top w:w="70" w:type="dxa"/>
+              <w:left w:w="110" w:type="dxa"/>
+              <w:bottom w:w="70" w:type="dxa"/>
+              <w:right w:w="110" w:type="dxa"/>
+            </w:tcMar>
+          </w:tcPr>
+          <w:p>
+            <w:r>
+              <w:rPr>
+                <w:sz w:val="19"/>
+                <w:szCs w:val="19"/>
+              </w:rPr>
+              <w:t>Fichiers .env* exclus du dépôt ; .env.example ne contient que des noms de variables, sans valeur.</w:t>
+            </w:r>
+          </w:p>
+        </w:tc>
+        <w:tc>
+          <w:tcPr>
+            <w:tcW w:w="2300" w:type="dxa"/>
+            <w:tcBorders>
+              <w:top w:val="single" w:sz="4" w:space="0" w:color="E2DED2"/>
+              <w:left w:val="single" w:sz="4" w:space="0" w:color="E2DED2"/>
+              <w:bottom w:val="single" w:sz="4" w:space="0" w:color="E2DED2"/>
+              <w:right w:val="single" w:sz="4" w:space="0" w:color="E2DED2"/>
+            </w:tcBorders>
+            <w:tcMar>
+              <w:top w:w="70" w:type="dxa"/>
+              <w:left w:w="110" w:type="dxa"/>
+              <w:bottom w:w="70" w:type="dxa"/>
+              <w:right w:w="110" w:type="dxa"/>
+            </w:tcMar>
+          </w:tcPr>
+          <w:p>
+            <w:r>
+              <w:rPr>
+                <w:sz w:val="19"/>
+                <w:szCs w:val="19"/>
+              </w:rPr>
+              <w:t>code (.gitignore)</w:t>
+            </w:r>
+          </w:p>
+        </w:tc>
+      </w:tr>
+      <w:tr>
+        <w:tblPrEx>
+          <w:tblCellMar>
+            <w:top w:w="0" w:type="dxa"/>
+            <w:bottom w:w="0" w:type="dxa"/>
+          </w:tblCellMar>
+        </w:tblPrEx>
+        <w:tc>
+          <w:tcPr>
+            <w:tcW w:w="2000" w:type="dxa"/>
+            <w:tcBorders>
+              <w:top w:val="single" w:sz="4" w:space="0" w:color="E2DED2"/>
+              <w:left w:val="single" w:sz="4" w:space="0" w:color="E2DED2"/>
+              <w:bottom w:val="single" w:sz="4" w:space="0" w:color="E2DED2"/>
+              <w:right w:val="single" w:sz="4" w:space="0" w:color="E2DED2"/>
+            </w:tcBorders>
+            <w:tcMar>
+              <w:top w:w="70" w:type="dxa"/>
+              <w:left w:w="110" w:type="dxa"/>
+              <w:bottom w:w="70" w:type="dxa"/>
+              <w:right w:w="110" w:type="dxa"/>
+            </w:tcMar>
+          </w:tcPr>
+          <w:p>
+            <w:r>
+              <w:rPr>
+                <w:sz w:val="19"/>
+                <w:szCs w:val="19"/>
+              </w:rPr>
+              <w:t>Secrets</w:t>
+            </w:r>
+          </w:p>
+        </w:tc>
+        <w:tc>
+          <w:tcPr>
+            <w:tcW w:w="5338" w:type="dxa"/>
+            <w:tcBorders>
+              <w:top w:val="single" w:sz="4" w:space="0" w:color="E2DED2"/>
+              <w:left w:val="single" w:sz="4" w:space="0" w:color="E2DED2"/>
+              <w:bottom w:val="single" w:sz="4" w:space="0" w:color="E2DED2"/>
+              <w:right w:val="single" w:sz="4" w:space="0" w:color="E2DED2"/>
+            </w:tcBorders>
+            <w:tcMar>
+              <w:top w:w="70" w:type="dxa"/>
+              <w:left w:w="110" w:type="dxa"/>
+              <w:bottom w:w="70" w:type="dxa"/>
+              <w:right w:w="110" w:type="dxa"/>
+            </w:tcMar>
+          </w:tcPr>
+          <w:p>
+            <w:r>
+              <w:rPr>
+                <w:sz w:val="19"/>
+                <w:szCs w:val="19"/>
+              </w:rPr>
+              <w:t>Aucun secret retrouvé dans l'historique git (recherche de clés service_role, Resend, Stripe).</w:t>
+            </w:r>
+          </w:p>
+        </w:tc>
+        <w:tc>
+          <w:tcPr>
+            <w:tcW w:w="2300" w:type="dxa"/>
+            <w:tcBorders>
+              <w:top w:val="single" w:sz="4" w:space="0" w:color="E2DED2"/>
+              <w:left w:val="single" w:sz="4" w:space="0" w:color="E2DED2"/>
+              <w:bottom w:val="single" w:sz="4" w:space="0" w:color="E2DED2"/>
+              <w:right w:val="single" w:sz="4" w:space="0" w:color="E2DED2"/>
+            </w:tcBorders>
+            <w:tcMar>
+              <w:top w:w="70" w:type="dxa"/>
+              <w:left w:w="110" w:type="dxa"/>
+              <w:bottom w:w="70" w:type="dxa"/>
+              <w:right w:w="110" w:type="dxa"/>
+            </w:tcMar>
+          </w:tcPr>
+          <w:p>
+            <w:r>
+              <w:rPr>
+                <w:sz w:val="19"/>
+                <w:szCs w:val="19"/>
+              </w:rPr>
+              <w:t>outil (git log)</w:t>
+            </w:r>
+          </w:p>
+        </w:tc>
+      </w:tr>
+      <w:tr>
+        <w:tblPrEx>
+          <w:tblCellMar>
+            <w:top w:w="0" w:type="dxa"/>
+            <w:bottom w:w="0" w:type="dxa"/>
+          </w:tblCellMar>
+        </w:tblPrEx>
+        <w:tc>
+          <w:tcPr>
+            <w:tcW w:w="2000" w:type="dxa"/>
+            <w:tcBorders>
+              <w:top w:val="single" w:sz="4" w:space="0" w:color="E2DED2"/>
+              <w:left w:val="single" w:sz="4" w:space="0" w:color="E2DED2"/>
+              <w:bottom w:val="single" w:sz="4" w:space="0" w:color="E2DED2"/>
+              <w:right w:val="single" w:sz="4" w:space="0" w:color="E2DED2"/>
+            </w:tcBorders>
+            <w:tcMar>
+              <w:top w:w="70" w:type="dxa"/>
+              <w:left w:w="110" w:type="dxa"/>
+              <w:bottom w:w="70" w:type="dxa"/>
+              <w:right w:w="110" w:type="dxa"/>
+            </w:tcMar>
+          </w:tcPr>
+          <w:p>
+            <w:r>
+              <w:rPr>
+                <w:sz w:val="19"/>
+                <w:szCs w:val="19"/>
+              </w:rPr>
+              <w:t>Injection et XSS</w:t>
+            </w:r>
+          </w:p>
+        </w:tc>
+        <w:tc>
+          <w:tcPr>
+            <w:tcW w:w="5338" w:type="dxa"/>
+            <w:tcBorders>
+              <w:top w:val="single" w:sz="4" w:space="0" w:color="E2DED2"/>
+              <w:left w:val="single" w:sz="4" w:space="0" w:color="E2DED2"/>
+              <w:bottom w:val="single" w:sz="4" w:space="0" w:color="E2DED2"/>
+              <w:right w:val="single" w:sz="4" w:space="0" w:color="E2DED2"/>
+            </w:tcBorders>
+            <w:tcMar>
+              <w:top w:w="70" w:type="dxa"/>
+              <w:left w:w="110" w:type="dxa"/>
+              <w:bottom w:w="70" w:type="dxa"/>
+              <w:right w:w="110" w:type="dxa"/>
+            </w:tcMar>
+          </w:tcPr>
+          <w:p>
+            <w:r>
+              <w:rPr>
+                <w:sz w:val="19"/>
+                <w:szCs w:val="19"/>
+              </w:rPr>
+              <w:t>Requêtes base via le client Supabase paramétré : aucune concaténation SQL dans le code applicatif.</w:t>
+            </w:r>
+          </w:p>
+        </w:tc>
+        <w:tc>
+          <w:tcPr>
+            <w:tcW w:w="2300" w:type="dxa"/>
+            <w:tcBorders>
+              <w:top w:val="single" w:sz="4" w:space="0" w:color="E2DED2"/>
+              <w:left w:val="single" w:sz="4" w:space="0" w:color="E2DED2"/>
+              <w:bottom w:val="single" w:sz="4" w:space="0" w:color="E2DED2"/>
+              <w:right w:val="single" w:sz="4" w:space="0" w:color="E2DED2"/>
+            </w:tcBorders>
+            <w:tcMar>
+              <w:top w:w="70" w:type="dxa"/>
+              <w:left w:w="110" w:type="dxa"/>
+              <w:bottom w:w="70" w:type="dxa"/>
+              <w:right w:w="110" w:type="dxa"/>
+            </w:tcMar>
+          </w:tcPr>
+          <w:p>
+            <w:r>
+              <w:rPr>
+                <w:sz w:val="19"/>
+                <w:szCs w:val="19"/>
+              </w:rPr>
+              <w:t>code</w:t>
+            </w:r>
+          </w:p>
+        </w:tc>
+      </w:tr>
+      <w:tr>
+        <w:tblPrEx>
+          <w:tblCellMar>
+            <w:top w:w="0" w:type="dxa"/>
+            <w:bottom w:w="0" w:type="dxa"/>
+          </w:tblCellMar>
+        </w:tblPrEx>
+        <w:tc>
+          <w:tcPr>
+            <w:tcW w:w="2000" w:type="dxa"/>
+            <w:tcBorders>
+              <w:top w:val="single" w:sz="4" w:space="0" w:color="E2DED2"/>
+              <w:left w:val="single" w:sz="4" w:space="0" w:color="E2DED2"/>
+              <w:bottom w:val="single" w:sz="4" w:space="0" w:color="E2DED2"/>
+              <w:right w:val="single" w:sz="4" w:space="0" w:color="E2DED2"/>
+            </w:tcBorders>
+            <w:tcMar>
+              <w:top w:w="70" w:type="dxa"/>
+              <w:left w:w="110" w:type="dxa"/>
+              <w:bottom w:w="70" w:type="dxa"/>
+              <w:right w:w="110" w:type="dxa"/>
+            </w:tcMar>
+          </w:tcPr>
+          <w:p>
+            <w:r>
+              <w:rPr>
+                <w:sz w:val="19"/>
+                <w:szCs w:val="19"/>
+              </w:rPr>
+              <w:t>Injection et XSS</w:t>
+            </w:r>
+          </w:p>
+        </w:tc>
+        <w:tc>
+          <w:tcPr>
+            <w:tcW w:w="5338" w:type="dxa"/>
+            <w:tcBorders>
+              <w:top w:val="single" w:sz="4" w:space="0" w:color="E2DED2"/>
+              <w:left w:val="single" w:sz="4" w:space="0" w:color="E2DED2"/>
+              <w:bottom w:val="single" w:sz="4" w:space="0" w:color="E2DED2"/>
+              <w:right w:val="single" w:sz="4" w:space="0" w:color="E2DED2"/>
+            </w:tcBorders>
+            <w:tcMar>
+              <w:top w:w="70" w:type="dxa"/>
+              <w:left w:w="110" w:type="dxa"/>
+              <w:bottom w:w="70" w:type="dxa"/>
+              <w:right w:w="110" w:type="dxa"/>
+            </w:tcMar>
+          </w:tcPr>
+          <w:p>
+            <w:r>
+              <w:rPr>
+                <w:sz w:val="19"/>
+                <w:szCs w:val="19"/>
+              </w:rPr>
+              <w:t>Pages Next (panier, espace client, admin) rendues par React, qui échappe le contenu ; aucun dangerouslySetInnerHTML, eval ni new Function.</w:t>
+            </w:r>
+          </w:p>
+        </w:tc>
+        <w:tc>
+          <w:tcPr>
+            <w:tcW w:w="2300" w:type="dxa"/>
+            <w:tcBorders>
+              <w:top w:val="single" w:sz="4" w:space="0" w:color="E2DED2"/>
+              <w:left w:val="single" w:sz="4" w:space="0" w:color="E2DED2"/>
+              <w:bottom w:val="single" w:sz="4" w:space="0" w:color="E2DED2"/>
+              <w:right w:val="single" w:sz="4" w:space="0" w:color="E2DED2"/>
+            </w:tcBorders>
+            <w:tcMar>
+              <w:top w:w="70" w:type="dxa"/>
+              <w:left w:w="110" w:type="dxa"/>
+              <w:bottom w:w="70" w:type="dxa"/>
+              <w:right w:w="110" w:type="dxa"/>
+            </w:tcMar>
+          </w:tcPr>
+          <w:p>
+            <w:r>
+              <w:rPr>
+                <w:sz w:val="19"/>
+                <w:szCs w:val="19"/>
+              </w:rPr>
+              <w:t>code (grep)</w:t>
+            </w:r>
+          </w:p>
+        </w:tc>
+      </w:tr>
+      <w:tr>
+        <w:tblPrEx>
+          <w:tblCellMar>
+            <w:top w:w="0" w:type="dxa"/>
+            <w:bottom w:w="0" w:type="dxa"/>
+          </w:tblCellMar>
+        </w:tblPrEx>
+        <w:tc>
+          <w:tcPr>
+            <w:tcW w:w="2000" w:type="dxa"/>
+            <w:tcBorders>
+              <w:top w:val="single" w:sz="4" w:space="0" w:color="E2DED2"/>
+              <w:left w:val="single" w:sz="4" w:space="0" w:color="E2DED2"/>
+              <w:bottom w:val="single" w:sz="4" w:space="0" w:color="E2DED2"/>
+              <w:right w:val="single" w:sz="4" w:space="0" w:color="E2DED2"/>
+            </w:tcBorders>
+            <w:tcMar>
+              <w:top w:w="70" w:type="dxa"/>
+              <w:left w:w="110" w:type="dxa"/>
+              <w:bottom w:w="70" w:type="dxa"/>
+              <w:right w:w="110" w:type="dxa"/>
+            </w:tcMar>
+          </w:tcPr>
+          <w:p>
+            <w:r>
+              <w:rPr>
+                <w:sz w:val="19"/>
+                <w:szCs w:val="19"/>
+              </w:rPr>
+              <w:t>Injection et XSS</w:t>
+            </w:r>
+          </w:p>
+        </w:tc>
+        <w:tc>
+          <w:tcPr>
+            <w:tcW w:w="5338" w:type="dxa"/>
+            <w:tcBorders>
+              <w:top w:val="single" w:sz="4" w:space="0" w:color="E2DED2"/>
+              <w:left w:val="single" w:sz="4" w:space="0" w:color="E2DED2"/>
+              <w:bottom w:val="single" w:sz="4" w:space="0" w:color="E2DED2"/>
+              <w:right w:val="single" w:sz="4" w:space="0" w:color="E2DED2"/>
+            </w:tcBorders>
+            <w:tcMar>
+              <w:top w:w="70" w:type="dxa"/>
+              <w:left w:w="110" w:type="dxa"/>
+              <w:bottom w:w="70" w:type="dxa"/>
+              <w:right w:w="110" w:type="dxa"/>
+            </w:tcMar>
+          </w:tcPr>
+          <w:p>
+            <w:r>
+              <w:rPr>
+                <w:sz w:val="19"/>
+                <w:szCs w:val="19"/>
+              </w:rPr>
+              <w:t>Données client échappées (escapeHtml) dans les emails HTML.</w:t>
+            </w:r>
+          </w:p>
+        </w:tc>
+        <w:tc>
+          <w:tcPr>
+            <w:tcW w:w="2300" w:type="dxa"/>
+            <w:tcBorders>
+              <w:top w:val="single" w:sz="4" w:space="0" w:color="E2DED2"/>
+              <w:left w:val="single" w:sz="4" w:space="0" w:color="E2DED2"/>
+              <w:bottom w:val="single" w:sz="4" w:space="0" w:color="E2DED2"/>
+              <w:right w:val="single" w:sz="4" w:space="0" w:color="E2DED2"/>
+            </w:tcBorders>
+            <w:tcMar>
+              <w:top w:w="70" w:type="dxa"/>
+              <w:left w:w="110" w:type="dxa"/>
+              <w:bottom w:w="70" w:type="dxa"/>
+              <w:right w:w="110" w:type="dxa"/>
+            </w:tcMar>
+          </w:tcPr>
+          <w:p>
+            <w:r>
+              <w:rPr>
+                <w:sz w:val="19"/>
+                <w:szCs w:val="19"/>
+              </w:rPr>
+              <w:t>code (lib/email.ts)</w:t>
+            </w:r>
+          </w:p>
+        </w:tc>
+      </w:tr>
+      <w:tr>
+        <w:tblPrEx>
+          <w:tblCellMar>
+            <w:top w:w="0" w:type="dxa"/>
+            <w:bottom w:w="0" w:type="dxa"/>
+          </w:tblCellMar>
+        </w:tblPrEx>
+        <w:tc>
+          <w:tcPr>
+            <w:tcW w:w="2000" w:type="dxa"/>
+            <w:tcBorders>
+              <w:top w:val="single" w:sz="4" w:space="0" w:color="E2DED2"/>
+              <w:left w:val="single" w:sz="4" w:space="0" w:color="E2DED2"/>
+              <w:bottom w:val="single" w:sz="4" w:space="0" w:color="E2DED2"/>
+              <w:right w:val="single" w:sz="4" w:space="0" w:color="E2DED2"/>
+            </w:tcBorders>
+            <w:tcMar>
+              <w:top w:w="70" w:type="dxa"/>
+              <w:left w:w="110" w:type="dxa"/>
+              <w:bottom w:w="70" w:type="dxa"/>
+              <w:right w:w="110" w:type="dxa"/>
+            </w:tcMar>
+          </w:tcPr>
+          <w:p>
+            <w:r>
+              <w:rPr>
+                <w:sz w:val="19"/>
+                <w:szCs w:val="19"/>
+              </w:rPr>
+              <w:t>Injection et XSS</w:t>
+            </w:r>
+          </w:p>
+        </w:tc>
+        <w:tc>
+          <w:tcPr>
+            <w:tcW w:w="5338" w:type="dxa"/>
+            <w:tcBorders>
+              <w:top w:val="single" w:sz="4" w:space="0" w:color="E2DED2"/>
+              <w:left w:val="single" w:sz="4" w:space="0" w:color="E2DED2"/>
+              <w:bottom w:val="single" w:sz="4" w:space="0" w:color="E2DED2"/>
+              <w:right w:val="single" w:sz="4" w:space="0" w:color="E2DED2"/>
+            </w:tcBorders>
+            <w:tcMar>
+              <w:top w:w="70" w:type="dxa"/>
+              <w:left w:w="110" w:type="dxa"/>
+              <w:bottom w:w="70" w:type="dxa"/>
+              <w:right w:w="110" w:type="dxa"/>
+            </w:tcMar>
+          </w:tcPr>
+          <w:p>
+            <w:r>
+              <w:rPr>
+                <w:sz w:val="19"/>
+                <w:szCs w:val="19"/>
+              </w:rPr>
+              <w:t>Route order-status : seuls les statuts d'une liste blanche déclenchent un email.</w:t>
+            </w:r>
+          </w:p>
+        </w:tc>
+        <w:tc>
+          <w:tcPr>
+            <w:tcW w:w="2300" w:type="dxa"/>
+            <w:tcBorders>
+              <w:top w:val="single" w:sz="4" w:space="0" w:color="E2DED2"/>
+              <w:left w:val="single" w:sz="4" w:space="0" w:color="E2DED2"/>
+              <w:bottom w:val="single" w:sz="4" w:space="0" w:color="E2DED2"/>
+              <w:right w:val="single" w:sz="4" w:space="0" w:color="E2DED2"/>
+            </w:tcBorders>
+            <w:tcMar>
+              <w:top w:w="70" w:type="dxa"/>
+              <w:left w:w="110" w:type="dxa"/>
+              <w:bottom w:w="70" w:type="dxa"/>
+              <w:right w:w="110" w:type="dxa"/>
+            </w:tcMar>
+          </w:tcPr>
+          <w:p>
+            <w:r>
+              <w:rPr>
+                <w:sz w:val="19"/>
+                <w:szCs w:val="19"/>
+              </w:rPr>
+              <w:t>code</w:t>
+            </w:r>
+          </w:p>
+        </w:tc>
+      </w:tr>
+      <w:tr>
+        <w:tblPrEx>
+          <w:tblCellMar>
+            <w:top w:w="0" w:type="dxa"/>
+            <w:bottom w:w="0" w:type="dxa"/>
+          </w:tblCellMar>
+        </w:tblPrEx>
+        <w:tc>
+          <w:tcPr>
+            <w:tcW w:w="2000" w:type="dxa"/>
+            <w:tcBorders>
+              <w:top w:val="single" w:sz="4" w:space="0" w:color="E2DED2"/>
+              <w:left w:val="single" w:sz="4" w:space="0" w:color="E2DED2"/>
+              <w:bottom w:val="single" w:sz="4" w:space="0" w:color="E2DED2"/>
+              <w:right w:val="single" w:sz="4" w:space="0" w:color="E2DED2"/>
+            </w:tcBorders>
+            <w:tcMar>
+              <w:top w:w="70" w:type="dxa"/>
+              <w:left w:w="110" w:type="dxa"/>
+              <w:bottom w:w="70" w:type="dxa"/>
+              <w:right w:w="110" w:type="dxa"/>
+            </w:tcMar>
+          </w:tcPr>
+          <w:p>
+            <w:r>
+              <w:rPr>
+                <w:sz w:val="19"/>
+                <w:szCs w:val="19"/>
+              </w:rPr>
+              <w:t>API et transport</w:t>
+            </w:r>
+          </w:p>
+        </w:tc>
+        <w:tc>
+          <w:tcPr>
+            <w:tcW w:w="5338" w:type="dxa"/>
+            <w:tcBorders>
+              <w:top w:val="single" w:sz="4" w:space="0" w:color="E2DED2"/>
+              <w:left w:val="single" w:sz="4" w:space="0" w:color="E2DED2"/>
+              <w:bottom w:val="single" w:sz="4" w:space="0" w:color="E2DED2"/>
+              <w:right w:val="single" w:sz="4" w:space="0" w:color="E2DED2"/>
+            </w:tcBorders>
+            <w:tcMar>
+              <w:top w:w="70" w:type="dxa"/>
+              <w:left w:w="110" w:type="dxa"/>
+              <w:bottom w:w="70" w:type="dxa"/>
+              <w:right w:w="110" w:type="dxa"/>
+            </w:tcMar>
+          </w:tcPr>
+          <w:p>
+            <w:r>
+              <w:rPr>
+                <w:sz w:val="19"/>
+                <w:szCs w:val="19"/>
+              </w:rPr>
+              <w:t>Routes API : appel sans jeton refusé (401), autorisation déléguée à la RLS sous l'identité de l'appelant.</w:t>
+            </w:r>
+          </w:p>
+        </w:tc>
+        <w:tc>
+          <w:tcPr>
+            <w:tcW w:w="2300" w:type="dxa"/>
+            <w:tcBorders>
+              <w:top w:val="single" w:sz="4" w:space="0" w:color="E2DED2"/>
+              <w:left w:val="single" w:sz="4" w:space="0" w:color="E2DED2"/>
+              <w:bottom w:val="single" w:sz="4" w:space="0" w:color="E2DED2"/>
+              <w:right w:val="single" w:sz="4" w:space="0" w:color="E2DED2"/>
+            </w:tcBorders>
+            <w:tcMar>
+              <w:top w:w="70" w:type="dxa"/>
+              <w:left w:w="110" w:type="dxa"/>
+              <w:bottom w:w="70" w:type="dxa"/>
+              <w:right w:w="110" w:type="dxa"/>
+            </w:tcMar>
+          </w:tcPr>
+          <w:p>
+            <w:r>
+              <w:rPr>
+                <w:sz w:val="19"/>
+                <w:szCs w:val="19"/>
+              </w:rPr>
+              <w:t>prod (curl)</w:t>
+            </w:r>
+          </w:p>
+        </w:tc>
+      </w:tr>
+      <w:tr>
+        <w:tblPrEx>
+          <w:tblCellMar>
+            <w:top w:w="0" w:type="dxa"/>
+            <w:bottom w:w="0" w:type="dxa"/>
+          </w:tblCellMar>
+        </w:tblPrEx>
+        <w:tc>
+          <w:tcPr>
+            <w:tcW w:w="2000" w:type="dxa"/>
+            <w:tcBorders>
+              <w:top w:val="single" w:sz="4" w:space="0" w:color="E2DED2"/>
+              <w:left w:val="single" w:sz="4" w:space="0" w:color="E2DED2"/>
+              <w:bottom w:val="single" w:sz="4" w:space="0" w:color="E2DED2"/>
+              <w:right w:val="single" w:sz="4" w:space="0" w:color="E2DED2"/>
+            </w:tcBorders>
+            <w:tcMar>
+              <w:top w:w="70" w:type="dxa"/>
+              <w:left w:w="110" w:type="dxa"/>
+              <w:bottom w:w="70" w:type="dxa"/>
+              <w:right w:w="110" w:type="dxa"/>
+            </w:tcMar>
+          </w:tcPr>
+          <w:p>
+            <w:r>
+              <w:rPr>
+                <w:sz w:val="19"/>
+                <w:szCs w:val="19"/>
+              </w:rPr>
+              <w:t>API et transport</w:t>
+            </w:r>
+          </w:p>
+        </w:tc>
+        <w:tc>
+          <w:tcPr>
+            <w:tcW w:w="5338" w:type="dxa"/>
+            <w:tcBorders>
+              <w:top w:val="single" w:sz="4" w:space="0" w:color="E2DED2"/>
+              <w:left w:val="single" w:sz="4" w:space="0" w:color="E2DED2"/>
+              <w:bottom w:val="single" w:sz="4" w:space="0" w:color="E2DED2"/>
+              <w:right w:val="single" w:sz="4" w:space="0" w:color="E2DED2"/>
+            </w:tcBorders>
+            <w:tcMar>
+              <w:top w:w="70" w:type="dxa"/>
+              <w:left w:w="110" w:type="dxa"/>
+              <w:bottom w:w="70" w:type="dxa"/>
+              <w:right w:w="110" w:type="dxa"/>
+            </w:tcMar>
+          </w:tcPr>
+          <w:p>
+            <w:r>
+              <w:rPr>
+                <w:sz w:val="19"/>
+                <w:szCs w:val="19"/>
+              </w:rPr>
+              <w:t>HTTPS imposé (Strict-Transport-Security) et en-têtes nosniff, Referrer-Policy et Permissions-Policy présents en production.</w:t>
+            </w:r>
+          </w:p>
+        </w:tc>
+        <w:tc>
+          <w:tcPr>
+            <w:tcW w:w="2300" w:type="dxa"/>
+            <w:tcBorders>
+              <w:top w:val="single" w:sz="4" w:space="0" w:color="E2DED2"/>
+              <w:left w:val="single" w:sz="4" w:space="0" w:color="E2DED2"/>
+              <w:bottom w:val="single" w:sz="4" w:space="0" w:color="E2DED2"/>
+              <w:right w:val="single" w:sz="4" w:space="0" w:color="E2DED2"/>
+            </w:tcBorders>
+            <w:tcMar>
+              <w:top w:w="70" w:type="dxa"/>
+              <w:left w:w="110" w:type="dxa"/>
+              <w:bottom w:w="70" w:type="dxa"/>
+              <w:right w:w="110" w:type="dxa"/>
+            </w:tcMar>
+          </w:tcPr>
+          <w:p>
+            <w:r>
+              <w:rPr>
+                <w:sz w:val="19"/>
+                <w:szCs w:val="19"/>
+              </w:rPr>
+              <w:t>prod (curl)</w:t>
+            </w:r>
+          </w:p>
+        </w:tc>
+      </w:tr>
+      <w:tr>
+        <w:tblPrEx>
+          <w:tblCellMar>
+            <w:top w:w="0" w:type="dxa"/>
+            <w:bottom w:w="0" w:type="dxa"/>
+          </w:tblCellMar>
+        </w:tblPrEx>
+        <w:tc>
+          <w:tcPr>
+            <w:tcW w:w="2000" w:type="dxa"/>
+            <w:tcBorders>
+              <w:top w:val="single" w:sz="4" w:space="0" w:color="E2DED2"/>
+              <w:left w:val="single" w:sz="4" w:space="0" w:color="E2DED2"/>
+              <w:bottom w:val="single" w:sz="4" w:space="0" w:color="E2DED2"/>
+              <w:right w:val="single" w:sz="4" w:space="0" w:color="E2DED2"/>
+            </w:tcBorders>
+            <w:tcMar>
+              <w:top w:w="70" w:type="dxa"/>
+              <w:left w:w="110" w:type="dxa"/>
+              <w:bottom w:w="70" w:type="dxa"/>
+              <w:right w:w="110" w:type="dxa"/>
+            </w:tcMar>
+          </w:tcPr>
+          <w:p>
+            <w:r>
+              <w:rPr>
+                <w:sz w:val="19"/>
+                <w:szCs w:val="19"/>
+              </w:rPr>
+              <w:t>Authentification</w:t>
+            </w:r>
+          </w:p>
+        </w:tc>
+        <w:tc>
+          <w:tcPr>
+            <w:tcW w:w="5338" w:type="dxa"/>
+            <w:tcBorders>
+              <w:top w:val="single" w:sz="4" w:space="0" w:color="E2DED2"/>
+              <w:left w:val="single" w:sz="4" w:space="0" w:color="E2DED2"/>
+              <w:bottom w:val="single" w:sz="4" w:space="0" w:color="E2DED2"/>
+              <w:right w:val="single" w:sz="4" w:space="0" w:color="E2DED2"/>
+            </w:tcBorders>
+            <w:tcMar>
+              <w:top w:w="70" w:type="dxa"/>
+              <w:left w:w="110" w:type="dxa"/>
+              <w:bottom w:w="70" w:type="dxa"/>
+              <w:right w:w="110" w:type="dxa"/>
+            </w:tcMar>
+          </w:tcPr>
+          <w:p>
+            <w:r>
+              <w:rPr>
+                <w:sz w:val="19"/>
+                <w:szCs w:val="19"/>
+              </w:rPr>
+              <w:t>Authentification déléguée à Supabase Auth (mots de passe hachés bcrypt, jamais stockés en clair).</w:t>
+            </w:r>
+          </w:p>
+        </w:tc>
+        <w:tc>
+          <w:tcPr>
+            <w:tcW w:w="2300" w:type="dxa"/>
+            <w:tcBorders>
+              <w:top w:val="single" w:sz="4" w:space="0" w:color="E2DED2"/>
+              <w:left w:val="single" w:sz="4" w:space="0" w:color="E2DED2"/>
+              <w:bottom w:val="single" w:sz="4" w:space="0" w:color="E2DED2"/>
+              <w:right w:val="single" w:sz="4" w:space="0" w:color="E2DED2"/>
+            </w:tcBorders>
+            <w:tcMar>
+              <w:top w:w="70" w:type="dxa"/>
+              <w:left w:w="110" w:type="dxa"/>
+              <w:bottom w:w="70" w:type="dxa"/>
+              <w:right w:w="110" w:type="dxa"/>
+            </w:tcMar>
+          </w:tcPr>
+          <w:p>
+            <w:r>
+              <w:rPr>
+                <w:sz w:val="19"/>
+                <w:szCs w:val="19"/>
+              </w:rPr>
+              <w:t>documentation Supabase</w:t>
+            </w:r>
+          </w:p>
+        </w:tc>
+      </w:tr>
+      <w:tr>
+        <w:tblPrEx>
+          <w:tblCellMar>
+            <w:top w:w="0" w:type="dxa"/>
+            <w:bottom w:w="0" w:type="dxa"/>
+          </w:tblCellMar>
+        </w:tblPrEx>
+        <w:tc>
+          <w:tcPr>
+            <w:tcW w:w="2000" w:type="dxa"/>
+            <w:tcBorders>
+              <w:top w:val="single" w:sz="4" w:space="0" w:color="E2DED2"/>
+              <w:left w:val="single" w:sz="4" w:space="0" w:color="E2DED2"/>
+              <w:bottom w:val="single" w:sz="4" w:space="0" w:color="E2DED2"/>
+              <w:right w:val="single" w:sz="4" w:space="0" w:color="E2DED2"/>
+            </w:tcBorders>
+            <w:tcMar>
+              <w:top w:w="70" w:type="dxa"/>
+              <w:left w:w="110" w:type="dxa"/>
+              <w:bottom w:w="70" w:type="dxa"/>
+              <w:right w:w="110" w:type="dxa"/>
+            </w:tcMar>
+          </w:tcPr>
+          <w:p>
+            <w:r>
+              <w:rPr>
+                <w:sz w:val="19"/>
+                <w:szCs w:val="19"/>
+              </w:rPr>
+              <w:t>Authentification</w:t>
+            </w:r>
+          </w:p>
+        </w:tc>
+        <w:tc>
+          <w:tcPr>
+            <w:tcW w:w="5338" w:type="dxa"/>
+            <w:tcBorders>
+              <w:top w:val="single" w:sz="4" w:space="0" w:color="E2DED2"/>
+              <w:left w:val="single" w:sz="4" w:space="0" w:color="E2DED2"/>
+              <w:bottom w:val="single" w:sz="4" w:space="0" w:color="E2DED2"/>
+              <w:right w:val="single" w:sz="4" w:space="0" w:color="E2DED2"/>
+            </w:tcBorders>
+            <w:tcMar>
+              <w:top w:w="70" w:type="dxa"/>
+              <w:left w:w="110" w:type="dxa"/>
+              <w:bottom w:w="70" w:type="dxa"/>
+              <w:right w:w="110" w:type="dxa"/>
+            </w:tcMar>
+          </w:tcPr>
+          <w:p>
+            <w:r>
+              <w:rPr>
+                <w:sz w:val="19"/>
+                <w:szCs w:val="19"/>
+              </w:rPr>
+              <w:t>Règles de mot de passe appliquées côté serveur (8 caractères minimum, chiffres, minuscules, majuscules et symboles) en plus du contrôle dans le navigateur.</w:t>
+            </w:r>
+          </w:p>
+        </w:tc>
+        <w:tc>
+          <w:tcPr>
+            <w:tcW w:w="2300" w:type="dxa"/>
+            <w:tcBorders>
+              <w:top w:val="single" w:sz="4" w:space="0" w:color="E2DED2"/>
+              <w:left w:val="single" w:sz="4" w:space="0" w:color="E2DED2"/>
+              <w:bottom w:val="single" w:sz="4" w:space="0" w:color="E2DED2"/>
+              <w:right w:val="single" w:sz="4" w:space="0" w:color="E2DED2"/>
+            </w:tcBorders>
+            <w:tcMar>
+              <w:top w:w="70" w:type="dxa"/>
+              <w:left w:w="110" w:type="dxa"/>
+              <w:bottom w:w="70" w:type="dxa"/>
+              <w:right w:w="110" w:type="dxa"/>
+            </w:tcMar>
+          </w:tcPr>
+          <w:p>
+            <w:r>
+              <w:rPr>
+                <w:sz w:val="19"/>
+                <w:szCs w:val="19"/>
+              </w:rPr>
+              <w:t>tableau de bord (déclaratif)</w:t>
+            </w:r>
+          </w:p>
+        </w:tc>
+      </w:tr>
+      <w:tr>
+        <w:tblPrEx>
+          <w:tblCellMar>
+            <w:top w:w="0" w:type="dxa"/>
+            <w:bottom w:w="0" w:type="dxa"/>
+          </w:tblCellMar>
+        </w:tblPrEx>
+        <w:tc>
+          <w:tcPr>
+            <w:tcW w:w="2000" w:type="dxa"/>
+            <w:tcBorders>
+              <w:top w:val="single" w:sz="4" w:space="0" w:color="E2DED2"/>
+              <w:left w:val="single" w:sz="4" w:space="0" w:color="E2DED2"/>
+              <w:bottom w:val="single" w:sz="4" w:space="0" w:color="E2DED2"/>
+              <w:right w:val="single" w:sz="4" w:space="0" w:color="E2DED2"/>
+            </w:tcBorders>
+            <w:tcMar>
+              <w:top w:w="70" w:type="dxa"/>
+              <w:left w:w="110" w:type="dxa"/>
+              <w:bottom w:w="70" w:type="dxa"/>
+              <w:right w:w="110" w:type="dxa"/>
+            </w:tcMar>
+          </w:tcPr>
+          <w:p>
+            <w:r>
+              <w:rPr>
+                <w:sz w:val="19"/>
+                <w:szCs w:val="19"/>
+              </w:rPr>
+              <w:t>Qualité du code</w:t>
+            </w:r>
+          </w:p>
+        </w:tc>
+        <w:tc>
+          <w:tcPr>
+            <w:tcW w:w="5338" w:type="dxa"/>
+            <w:tcBorders>
+              <w:top w:val="single" w:sz="4" w:space="0" w:color="E2DED2"/>
+              <w:left w:val="single" w:sz="4" w:space="0" w:color="E2DED2"/>
+              <w:bottom w:val="single" w:sz="4" w:space="0" w:color="E2DED2"/>
+              <w:right w:val="single" w:sz="4" w:space="0" w:color="E2DED2"/>
+            </w:tcBorders>
+            <w:tcMar>
+              <w:top w:w="70" w:type="dxa"/>
+              <w:left w:w="110" w:type="dxa"/>
+              <w:bottom w:w="70" w:type="dxa"/>
+              <w:right w:w="110" w:type="dxa"/>
+            </w:tcMar>
+          </w:tcPr>
+          <w:p>
+            <w:r>
+              <w:rPr>
+                <w:sz w:val="19"/>
+                <w:szCs w:val="19"/>
+              </w:rPr>
+              <w:t>TypeScript en mode strict ; vérification de types sans erreur.</w:t>
+            </w:r>
+          </w:p>
+        </w:tc>
+        <w:tc>
+          <w:tcPr>
+            <w:tcW w:w="2300" w:type="dxa"/>
+            <w:tcBorders>
+              <w:top w:val="single" w:sz="4" w:space="0" w:color="E2DED2"/>
+              <w:left w:val="single" w:sz="4" w:space="0" w:color="E2DED2"/>
+              <w:bottom w:val="single" w:sz="4" w:space="0" w:color="E2DED2"/>
+              <w:right w:val="single" w:sz="4" w:space="0" w:color="E2DED2"/>
+            </w:tcBorders>
+            <w:tcMar>
+              <w:top w:w="70" w:type="dxa"/>
+              <w:left w:w="110" w:type="dxa"/>
+              <w:bottom w:w="70" w:type="dxa"/>
+              <w:right w:w="110" w:type="dxa"/>
+            </w:tcMar>
+          </w:tcPr>
+          <w:p>
+            <w:r>
+              <w:rPr>
+                <w:sz w:val="19"/>
+                <w:szCs w:val="19"/>
+              </w:rPr>
+              <w:t>outil (tsc)</w:t>
+            </w:r>
+          </w:p>
+        </w:tc>
+      </w:tr>
+      <w:tr>
+        <w:tblPrEx>
+          <w:tblCellMar>
+            <w:top w:w="0" w:type="dxa"/>
+            <w:bottom w:w="0" w:type="dxa"/>
+          </w:tblCellMar>
+        </w:tblPrEx>
+        <w:tc>
+          <w:tcPr>
+            <w:tcW w:w="2000" w:type="dxa"/>
+            <w:tcBorders>
+              <w:top w:val="single" w:sz="4" w:space="0" w:color="E2DED2"/>
+              <w:left w:val="single" w:sz="4" w:space="0" w:color="E2DED2"/>
+              <w:bottom w:val="single" w:sz="4" w:space="0" w:color="E2DED2"/>
+              <w:right w:val="single" w:sz="4" w:space="0" w:color="E2DED2"/>
+            </w:tcBorders>
+            <w:tcMar>
+              <w:top w:w="70" w:type="dxa"/>
+              <w:left w:w="110" w:type="dxa"/>
+              <w:bottom w:w="70" w:type="dxa"/>
+              <w:right w:w="110" w:type="dxa"/>
+            </w:tcMar>
+          </w:tcPr>
+          <w:p>
+            <w:r>
+              <w:rPr>
+                <w:sz w:val="19"/>
+                <w:szCs w:val="19"/>
+              </w:rPr>
+              <w:t>Qualité du code</w:t>
+            </w:r>
+          </w:p>
+        </w:tc>
+        <w:tc>
+          <w:tcPr>
+            <w:tcW w:w="5338" w:type="dxa"/>
+            <w:tcBorders>
+              <w:top w:val="single" w:sz="4" w:space="0" w:color="E2DED2"/>
+              <w:left w:val="single" w:sz="4" w:space="0" w:color="E2DED2"/>
+              <w:bottom w:val="single" w:sz="4" w:space="0" w:color="E2DED2"/>
+              <w:right w:val="single" w:sz="4" w:space="0" w:color="E2DED2"/>
+            </w:tcBorders>
+            <w:tcMar>
+              <w:top w:w="70" w:type="dxa"/>
+              <w:left w:w="110" w:type="dxa"/>
+              <w:bottom w:w="70" w:type="dxa"/>
+              <w:right w:w="110" w:type="dxa"/>
+            </w:tcMar>
+          </w:tcPr>
+          <w:p>
+            <w:r>
+              <w:rPr>
+                <w:sz w:val="19"/>
+                <w:szCs w:val="19"/>
+              </w:rPr>
+              <w:t>Build de production sans erreur (compilation, types, 14 routes générées).</w:t>
+            </w:r>
+          </w:p>
+        </w:tc>
+        <w:tc>
+          <w:tcPr>
+            <w:tcW w:w="2300" w:type="dxa"/>
+            <w:tcBorders>
+              <w:top w:val="single" w:sz="4" w:space="0" w:color="E2DED2"/>
+              <w:left w:val="single" w:sz="4" w:space="0" w:color="E2DED2"/>
+              <w:bottom w:val="single" w:sz="4" w:space="0" w:color="E2DED2"/>
+              <w:right w:val="single" w:sz="4" w:space="0" w:color="E2DED2"/>
+            </w:tcBorders>
+            <w:tcMar>
+              <w:top w:w="70" w:type="dxa"/>
+              <w:left w:w="110" w:type="dxa"/>
+              <w:bottom w:w="70" w:type="dxa"/>
+              <w:right w:w="110" w:type="dxa"/>
+            </w:tcMar>
+          </w:tcPr>
+          <w:p>
+            <w:r>
+              <w:rPr>
+                <w:sz w:val="19"/>
+                <w:szCs w:val="19"/>
+              </w:rPr>
+              <w:t>outil (next build)</w:t>
+            </w:r>
+          </w:p>
+        </w:tc>
+      </w:tr>
+      <w:tr>
+        <w:tblPrEx>
+          <w:tblCellMar>
+            <w:top w:w="0" w:type="dxa"/>
+            <w:bottom w:w="0" w:type="dxa"/>
+          </w:tblCellMar>
+        </w:tblPrEx>
+        <w:tc>
+          <w:tcPr>
+            <w:tcW w:w="2000" w:type="dxa"/>
+            <w:tcBorders>
+              <w:top w:val="single" w:sz="4" w:space="0" w:color="E2DED2"/>
+              <w:left w:val="single" w:sz="4" w:space="0" w:color="E2DED2"/>
+              <w:bottom w:val="single" w:sz="4" w:space="0" w:color="E2DED2"/>
+              <w:right w:val="single" w:sz="4" w:space="0" w:color="E2DED2"/>
+            </w:tcBorders>
+            <w:tcMar>
+              <w:top w:w="70" w:type="dxa"/>
+              <w:left w:w="110" w:type="dxa"/>
+              <w:bottom w:w="70" w:type="dxa"/>
+              <w:right w:w="110" w:type="dxa"/>
+            </w:tcMar>
+          </w:tcPr>
+          <w:p>
+            <w:r>
+              <w:rPr>
+                <w:sz w:val="19"/>
+                <w:szCs w:val="19"/>
+              </w:rPr>
+              <w:t>Dépendances</w:t>
+            </w:r>
+          </w:p>
+        </w:tc>
+        <w:tc>
+          <w:tcPr>
+            <w:tcW w:w="5338" w:type="dxa"/>
+            <w:tcBorders>
+              <w:top w:val="single" w:sz="4" w:space="0" w:color="E2DED2"/>
+              <w:left w:val="single" w:sz="4" w:space="0" w:color="E2DED2"/>
+              <w:bottom w:val="single" w:sz="4" w:space="0" w:color="E2DED2"/>
+              <w:right w:val="single" w:sz="4" w:space="0" w:color="E2DED2"/>
+            </w:tcBorders>
+            <w:tcMar>
+              <w:top w:w="70" w:type="dxa"/>
+              <w:left w:w="110" w:type="dxa"/>
+              <w:bottom w:w="70" w:type="dxa"/>
+              <w:right w:w="110" w:type="dxa"/>
+            </w:tcMar>
+          </w:tcPr>
+          <w:p>
+            <w:r>
+              <w:rPr>
+                <w:sz w:val="19"/>
+                <w:szCs w:val="19"/>
+              </w:rPr>
+              <w:t>Fichier de verrouillage package-lock.json versionné (versions reproductibles) ; npm audit : 0 vulnérabilité.</w:t>
+            </w:r>
+          </w:p>
+        </w:tc>
+        <w:tc>
+          <w:tcPr>
+            <w:tcW w:w="2300" w:type="dxa"/>
+            <w:tcBorders>
+              <w:top w:val="single" w:sz="4" w:space="0" w:color="E2DED2"/>
+              <w:left w:val="single" w:sz="4" w:space="0" w:color="E2DED2"/>
+              <w:bottom w:val="single" w:sz="4" w:space="0" w:color="E2DED2"/>
+              <w:right w:val="single" w:sz="4" w:space="0" w:color="E2DED2"/>
+            </w:tcBorders>
+            <w:tcMar>
+              <w:top w:w="70" w:type="dxa"/>
+              <w:left w:w="110" w:type="dxa"/>
+              <w:bottom w:w="70" w:type="dxa"/>
+              <w:right w:w="110" w:type="dxa"/>
+            </w:tcMar>
+          </w:tcPr>
+          <w:p>
+            <w:r>
+              <w:rPr>
+                <w:sz w:val="19"/>
+                <w:szCs w:val="19"/>
+              </w:rPr>
+              <w:t>outil (npm audit)</w:t>
+            </w:r>
+          </w:p>
+        </w:tc>
+      </w:tr>
+      <w:tr>
+        <w:tblPrEx>
+          <w:tblCellMar>
+            <w:top w:w="0" w:type="dxa"/>
+            <w:bottom w:w="0" w:type="dxa"/>
+          </w:tblCellMar>
+        </w:tblPrEx>
+        <w:tc>
+          <w:tcPr>
+            <w:tcW w:w="2000" w:type="dxa"/>
+            <w:tcBorders>
+              <w:top w:val="single" w:sz="4" w:space="0" w:color="E2DED2"/>
+              <w:left w:val="single" w:sz="4" w:space="0" w:color="E2DED2"/>
+              <w:bottom w:val="single" w:sz="4" w:space="0" w:color="E2DED2"/>
+              <w:right w:val="single" w:sz="4" w:space="0" w:color="E2DED2"/>
+            </w:tcBorders>
+            <w:tcMar>
+              <w:top w:w="70" w:type="dxa"/>
+              <w:left w:w="110" w:type="dxa"/>
+              <w:bottom w:w="70" w:type="dxa"/>
+              <w:right w:w="110" w:type="dxa"/>
+            </w:tcMar>
+          </w:tcPr>
+          <w:p>
+            <w:r>
+              <w:rPr>
+                <w:sz w:val="19"/>
+                <w:szCs w:val="19"/>
+              </w:rPr>
+              <w:t>Traçabilité</w:t>
+            </w:r>
+          </w:p>
+        </w:tc>
+        <w:tc>
+          <w:tcPr>
+            <w:tcW w:w="5338" w:type="dxa"/>
+            <w:tcBorders>
+              <w:top w:val="single" w:sz="4" w:space="0" w:color="E2DED2"/>
+              <w:left w:val="single" w:sz="4" w:space="0" w:color="E2DED2"/>
+              <w:bottom w:val="single" w:sz="4" w:space="0" w:color="E2DED2"/>
+              <w:right w:val="single" w:sz="4" w:space="0" w:color="E2DED2"/>
+            </w:tcBorders>
+            <w:tcMar>
+              <w:top w:w="70" w:type="dxa"/>
+              <w:left w:w="110" w:type="dxa"/>
+              <w:bottom w:w="70" w:type="dxa"/>
+              <w:right w:w="110" w:type="dxa"/>
+            </w:tcMar>
+          </w:tcPr>
+          <w:p>
+            <w:r>
+              <w:rPr>
+                <w:sz w:val="19"/>
+                <w:szCs w:val="19"/>
+              </w:rPr>
+              <w:t>Migrations SQL versionnées dans supabase/migrations/, CHANGELOG et documentation d'architecture à jour, commits horodatés et décrits.</w:t>
+            </w:r>
+          </w:p>
+        </w:tc>
+        <w:tc>
+          <w:tcPr>
+            <w:tcW w:w="2300" w:type="dxa"/>
+            <w:tcBorders>
+              <w:top w:val="single" w:sz="4" w:space="0" w:color="E2DED2"/>
+              <w:left w:val="single" w:sz="4" w:space="0" w:color="E2DED2"/>
+              <w:bottom w:val="single" w:sz="4" w:space="0" w:color="E2DED2"/>
+              <w:right w:val="single" w:sz="4" w:space="0" w:color="E2DED2"/>
+            </w:tcBorders>
+            <w:tcMar>
+              <w:top w:w="70" w:type="dxa"/>
+              <w:left w:w="110" w:type="dxa"/>
+              <w:bottom w:w="70" w:type="dxa"/>
+              <w:right w:w="110" w:type="dxa"/>
+            </w:tcMar>
+          </w:tcPr>
+          <w:p>
+            <w:r>
+              <w:rPr>
+                <w:sz w:val="19"/>
+                <w:szCs w:val="19"/>
+              </w:rPr>
+              <w:t>code (git)</w:t>
+            </w:r>
+          </w:p>
+        </w:tc>
+      </w:tr>
+    </w:tbl>
+    <w:p>
+      <w:pPr>
+        <w:spacing w:after="120"/>
+      </w:pPr>
+    </w:p>
+    <w:p>
+      <w:pPr>
+        <w:spacing w:after="120"/>
+      </w:pPr>
+      <w:r>
+        <w:rPr>
+          <w:b/>
+          <w:bCs/>
+        </w:rPr>
+        <w:t>Observations mineures hors périmètre des corrections (non bloquantes) :</w:t>
       </w:r>
     </w:p>
     <w:p>
@@ -8377,7 +11179,7 @@
         <w:spacing w:after="60"/>
       </w:pPr>
       <w:r>
-        <w:t>Fonction is_admin() : search_path figé, lecture limitée à la ligne de l'appelant (admins_select_self).</w:t>
+        <w:t>Lint : 4 erreurs « set-state-in-effect » préexistantes (React), sans impact sécurité ; à corriger lors d'une prochaine passe qualité.</w:t>
       </w:r>
     </w:p>
     <w:p>
@@ -8390,66 +11192,14 @@
         <w:spacing w:after="60"/>
       </w:pPr>
       <w:r>
-        <w:t>Storage : écriture client limitée au préfixe {user_id}/, lecture limitée au propriétaire ou à l'admin, suppression réservée à l'admin.</w:t>
-      </w:r>
-    </w:p>
-    <w:p>
-      <w:pPr>
-        <w:pStyle w:val="Paragraphedeliste"/>
-        <w:numPr>
-          <w:ilvl w:val="0"/>
-          <w:numId w:val="2"/>
-        </w:numPr>
-        <w:spacing w:after="60"/>
-      </w:pPr>
-      <w:r>
-        <w:t>Route /api/emails/order-status réservée aux admins (vérification via la table admins sous le token de l'appelant).</w:t>
-      </w:r>
-    </w:p>
-    <w:p>
-      <w:pPr>
-        <w:pStyle w:val="Paragraphedeliste"/>
-        <w:numPr>
-          <w:ilvl w:val="0"/>
-          <w:numId w:val="2"/>
-        </w:numPr>
-        <w:spacing w:after="60"/>
-      </w:pPr>
-      <w:r>
-        <w:t>Routes serveur exécutées sous le token utilisateur avec la clé anon : aucune clé service_role dans le code.</w:t>
-      </w:r>
-    </w:p>
-    <w:p>
-      <w:pPr>
-        <w:pStyle w:val="Paragraphedeliste"/>
-        <w:numPr>
-          <w:ilvl w:val="0"/>
-          <w:numId w:val="2"/>
-        </w:numPr>
-        <w:spacing w:after="60"/>
-      </w:pPr>
-      <w:r>
-        <w:t>Échappement HTML des données client dans les emails.</w:t>
-      </w:r>
-    </w:p>
-    <w:p>
-      <w:pPr>
-        <w:pStyle w:val="Paragraphedeliste"/>
-        <w:numPr>
-          <w:ilvl w:val="0"/>
-          <w:numId w:val="2"/>
-        </w:numPr>
-        <w:spacing w:after="60"/>
-      </w:pPr>
-      <w:r>
-        <w:t>Aucun secret dans l'historique git ; fichiers .env* exclus du dépôt (sauf .env.example).</w:t>
+        <w:t>Configurateur : le nom du fichier STL était inséré sans échappement dans la liste des pièces (seul l'utilisateur qui charge son propre fichier était concerné ; l'admin et les emails échappent ce nom). Corrigé le 05/10/2026 : nom échappé avant affichage (fonction escHtml), vérifié avec un nom de fichier contenant du HTML, affiché comme texte sans injection.</w:t>
       </w:r>
     </w:p>
     <w:p>
       <w:pPr>
         <w:pStyle w:val="Titre1"/>
       </w:pPr>
-      <w:bookmarkStart w:id="15" w:name="_Toc242114142"/>
+      <w:bookmarkStart w:id="15" w:name="_Toc242125784"/>
       <w:r>
         <w:t>6. Actions réalisées et conformité</w:t>
       </w:r>
@@ -9200,7 +11950,7 @@
       <w:pPr>
         <w:pStyle w:val="Titre1"/>
       </w:pPr>
-      <w:bookmarkStart w:id="16" w:name="_Toc242114143"/>
+      <w:bookmarkStart w:id="16" w:name="_Toc242125785"/>
       <w:r>
         <w:t>7. Actions restantes</w:t>
       </w:r>
@@ -9769,7 +12519,7 @@
       <w:pPr>
         <w:pStyle w:val="Titre1"/>
       </w:pPr>
-      <w:bookmarkStart w:id="17" w:name="_Toc242114144"/>
+      <w:bookmarkStart w:id="17" w:name="_Toc242125786"/>
       <w:r>
         <w:t>Annexe A. Fichiers modifiés</w:t>
       </w:r>
@@ -10190,7 +12940,7 @@
       <w:pPr>
         <w:pStyle w:val="Titre1"/>
       </w:pPr>
-      <w:bookmarkStart w:id="18" w:name="_Toc242114145"/>
+      <w:bookmarkStart w:id="18" w:name="_Toc242125787"/>
       <w:r>
         <w:t>Annexe B. Script de test des politiques RLS</w:t>
       </w:r>
@@ -10493,7 +13243,7 @@
       <w:pPr>
         <w:pStyle w:val="Titre1"/>
       </w:pPr>
-      <w:bookmarkStart w:id="19" w:name="_Toc242114146"/>
+      <w:bookmarkStart w:id="19" w:name="_Toc242125788"/>
       <w:r>
         <w:t>Annexe C. État des politiques RLS après correction</w:t>
       </w:r>
@@ -11580,7 +14330,7 @@
         <w:sz w:val="16"/>
         <w:szCs w:val="16"/>
       </w:rPr>
-      <w:t>AUD-SEC-2026-10-05 · v1.2</w:t>
+      <w:t>AUD-SEC-2026-10-05 · v1.3</w:t>
     </w:r>
   </w:p>
 </w:hdr>
@@ -11589,10 +14339,10 @@
 <file path=word/numbering.xml><?xml version="1.0" encoding="utf-8"?>
 <w:numbering xmlns:wpc="http://schemas.microsoft.com/office/word/2010/wordprocessingCanvas" xmlns:cx="http://schemas.microsoft.com/office/drawing/2014/chartex" xmlns:cx1="http://schemas.microsoft.com/office/drawing/2015/9/8/chartex" xmlns:cx2="http://schemas.microsoft.com/office/drawing/2015/10/21/chartex" xmlns:cx3="http://schemas.microsoft.com/office/drawing/2016/5/9/chartex" xmlns:cx4="http://schemas.microsoft.com/office/drawing/2016/5/10/chartex" xmlns:cx5="http://schemas.microsoft.com/office/drawing/2016/5/11/chartex" xmlns:cx6="http://schemas.microsoft.com/office/drawing/2016/5/12/chartex" xmlns:cx7="http://schemas.microsoft.com/office/drawing/2016/5/13/chartex" xmlns:cx8="http://schemas.microsoft.com/office/drawing/2016/5/14/chartex" xmlns:mc="http://schemas.openxmlformats.org/markup-compatibility/2006" xmlns:aink="http://schemas.microsoft.com/office/drawing/2016/ink" xmlns:am3d="http://schemas.microsoft.com/office/drawing/2017/model3d" xmlns:o="urn:schemas-microsoft-com:office:office" xmlns:oel="http://schemas.microsoft.com/office/2019/extlst" xmlns:r="http://schemas.openxmlformats.org/officeDocument/2006/relationships" xmlns:m="http://schemas.openxmlformats.org/officeDocument/2006/math" xmlns:v="urn:schemas-microsoft-com:vml" xmlns:wp14="http://schemas.microsoft.com/office/word/2010/wordprocessingDrawing" xmlns:wp="http://schemas.openxmlformats.org/drawingml/2006/wordprocessingDrawing" xmlns:w10="urn:schemas-microsoft-com:office:word" xmlns:w="http://schemas.openxmlformats.org/wordprocessingml/2006/main" xmlns:w14="http://schemas.microsoft.com/office/word/2010/wordml" xmlns:w15="http://schemas.microsoft.com/office/word/2012/wordml" xmlns:w16cex="http://schemas.microsoft.com/office/word/2018/wordml/cex" xmlns:w16cid="http://schemas.microsoft.com/office/word/2016/wordml/cid" xmlns:w16="http://schemas.microsoft.com/office/word/2018/wordml" xmlns:w16du="http://schemas.microsoft.com/office/word/2023/wordml/word16du" xmlns:w16sdtdh="http://schemas.microsoft.com/office/word/2020/wordml/sdtdatahash" xmlns:w16sdtfl="http://schemas.microsoft.com/office/word/2024/wordml/sdtformatlock" xmlns:w16se="http://schemas.microsoft.com/office/word/2015/wordml/symex" xmlns:wpg="http://schemas.microsoft.com/office/word/2010/wordprocessingGroup" xmlns:wpi="http://schemas.microsoft.com/office/word/2010/wordprocessingInk" xmlns:wne="http://schemas.microsoft.com/office/word/2006/wordml" xmlns:wps="http://schemas.microsoft.com/office/word/2010/wordprocessingShape" mc:Ignorable="w14 w15 w16se w16cid w16 w16cex w16sdtdh w16sdtfl w16du wp14">
   <w:abstractNum w:abstractNumId="0" w15:restartNumberingAfterBreak="0">
-    <w:nsid w:val="2D514710"/>
+    <w:nsid w:val="116D2342"/>
     <w:multiLevelType w:val="hybridMultilevel"/>
-    <w:tmpl w:val="B0B2477C"/>
-    <w:lvl w:ilvl="0" w:tplc="AF865474" w:tentative="1">
+    <w:tmpl w:val="7116E6C8"/>
+    <w:lvl w:ilvl="0" w:tplc="49F8278A" w:tentative="1">
       <w:start w:val="1"/>
       <w:numFmt w:val="bullet"/>
       <w:lvlText w:val="●"/>
@@ -11601,7 +14351,7 @@
         <w:ind w:left="720" w:hanging="360"/>
       </w:pPr>
     </w:lvl>
-    <w:lvl w:ilvl="1" w:tplc="6216594C" w:tentative="1">
+    <w:lvl w:ilvl="1" w:tplc="2C701216" w:tentative="1">
       <w:start w:val="1"/>
       <w:numFmt w:val="bullet"/>
       <w:lvlText w:val="○"/>
@@ -11610,7 +14360,7 @@
         <w:ind w:left="1440" w:hanging="360"/>
       </w:pPr>
     </w:lvl>
-    <w:lvl w:ilvl="2" w:tplc="1BD05902" w:tentative="1">
+    <w:lvl w:ilvl="2" w:tplc="2E18DF56" w:tentative="1">
       <w:start w:val="1"/>
       <w:numFmt w:val="bullet"/>
       <w:lvlText w:val="■"/>
@@ -11619,7 +14369,7 @@
         <w:ind w:left="2160" w:hanging="360"/>
       </w:pPr>
     </w:lvl>
-    <w:lvl w:ilvl="3" w:tplc="272C3F22" w:tentative="1">
+    <w:lvl w:ilvl="3" w:tplc="62EC5F32" w:tentative="1">
       <w:start w:val="1"/>
       <w:numFmt w:val="bullet"/>
       <w:lvlText w:val="●"/>
@@ -11628,7 +14378,7 @@
         <w:ind w:left="2880" w:hanging="360"/>
       </w:pPr>
     </w:lvl>
-    <w:lvl w:ilvl="4" w:tplc="84321006" w:tentative="1">
+    <w:lvl w:ilvl="4" w:tplc="5C94F13C" w:tentative="1">
       <w:start w:val="1"/>
       <w:numFmt w:val="bullet"/>
       <w:lvlText w:val="○"/>
@@ -11637,7 +14387,7 @@
         <w:ind w:left="3600" w:hanging="360"/>
       </w:pPr>
     </w:lvl>
-    <w:lvl w:ilvl="5" w:tplc="00680C6C" w:tentative="1">
+    <w:lvl w:ilvl="5" w:tplc="3E3838D2" w:tentative="1">
       <w:start w:val="1"/>
       <w:numFmt w:val="bullet"/>
       <w:lvlText w:val="■"/>
@@ -11646,7 +14396,7 @@
         <w:ind w:left="4320" w:hanging="360"/>
       </w:pPr>
     </w:lvl>
-    <w:lvl w:ilvl="6" w:tplc="FAA4FBAC" w:tentative="1">
+    <w:lvl w:ilvl="6" w:tplc="19764CB2" w:tentative="1">
       <w:start w:val="1"/>
       <w:numFmt w:val="bullet"/>
       <w:lvlText w:val="●"/>
@@ -11655,7 +14405,7 @@
         <w:ind w:left="5040" w:hanging="360"/>
       </w:pPr>
     </w:lvl>
-    <w:lvl w:ilvl="7" w:tplc="B846C386" w:tentative="1">
+    <w:lvl w:ilvl="7" w:tplc="DC86B85E" w:tentative="1">
       <w:start w:val="1"/>
       <w:numFmt w:val="bullet"/>
       <w:lvlText w:val="●"/>
@@ -11664,7 +14414,7 @@
         <w:ind w:left="5760" w:hanging="360"/>
       </w:pPr>
     </w:lvl>
-    <w:lvl w:ilvl="8" w:tplc="6548E20A" w:tentative="1">
+    <w:lvl w:ilvl="8" w:tplc="8FE0E918" w:tentative="1">
       <w:start w:val="1"/>
       <w:numFmt w:val="bullet"/>
       <w:lvlText w:val="●"/>
@@ -11675,10 +14425,10 @@
     </w:lvl>
   </w:abstractNum>
   <w:abstractNum w:abstractNumId="1" w15:restartNumberingAfterBreak="0">
-    <w:nsid w:val="432356B6"/>
+    <w:nsid w:val="6804269F"/>
     <w:multiLevelType w:val="hybridMultilevel"/>
-    <w:tmpl w:val="B090185E"/>
-    <w:lvl w:ilvl="0" w:tplc="45368B5A">
+    <w:tmpl w:val="DCD21CCC"/>
+    <w:lvl w:ilvl="0" w:tplc="0E6EEB4E">
       <w:start w:val="1"/>
       <w:numFmt w:val="bullet"/>
       <w:lvlText w:val="•"/>
@@ -11687,54 +14437,54 @@
         <w:ind w:left="540" w:hanging="270"/>
       </w:pPr>
     </w:lvl>
-    <w:lvl w:ilvl="1" w:tplc="71AE819E">
+    <w:lvl w:ilvl="1" w:tplc="C2749578">
       <w:numFmt w:val="decimal"/>
       <w:lvlText w:val=""/>
       <w:lvlJc w:val="left"/>
     </w:lvl>
-    <w:lvl w:ilvl="2" w:tplc="FDDCA060">
+    <w:lvl w:ilvl="2" w:tplc="B532DD1C">
       <w:numFmt w:val="decimal"/>
       <w:lvlText w:val=""/>
       <w:lvlJc w:val="left"/>
     </w:lvl>
-    <w:lvl w:ilvl="3" w:tplc="006221C8">
+    <w:lvl w:ilvl="3" w:tplc="020CC55C">
       <w:numFmt w:val="decimal"/>
       <w:lvlText w:val=""/>
       <w:lvlJc w:val="left"/>
     </w:lvl>
-    <w:lvl w:ilvl="4" w:tplc="5EB4B09C">
+    <w:lvl w:ilvl="4" w:tplc="EE445730">
       <w:numFmt w:val="decimal"/>
       <w:lvlText w:val=""/>
       <w:lvlJc w:val="left"/>
     </w:lvl>
-    <w:lvl w:ilvl="5" w:tplc="DF484F92">
+    <w:lvl w:ilvl="5" w:tplc="672A4CE0">
       <w:numFmt w:val="decimal"/>
       <w:lvlText w:val=""/>
       <w:lvlJc w:val="left"/>
     </w:lvl>
-    <w:lvl w:ilvl="6" w:tplc="EE34FF82">
+    <w:lvl w:ilvl="6" w:tplc="B98CA796">
       <w:numFmt w:val="decimal"/>
       <w:lvlText w:val=""/>
       <w:lvlJc w:val="left"/>
     </w:lvl>
-    <w:lvl w:ilvl="7" w:tplc="BBB21494">
+    <w:lvl w:ilvl="7" w:tplc="AFAE3B1A">
       <w:numFmt w:val="decimal"/>
       <w:lvlText w:val=""/>
       <w:lvlJc w:val="left"/>
     </w:lvl>
-    <w:lvl w:ilvl="8" w:tplc="F1FA9890">
+    <w:lvl w:ilvl="8" w:tplc="B80677BC">
       <w:numFmt w:val="decimal"/>
       <w:lvlText w:val=""/>
       <w:lvlJc w:val="left"/>
     </w:lvl>
   </w:abstractNum>
-  <w:num w:numId="1" w16cid:durableId="1536964226">
+  <w:num w:numId="1" w16cid:durableId="570042663">
     <w:abstractNumId w:val="0"/>
     <w:lvlOverride w:ilvl="0">
       <w:startOverride w:val="1"/>
     </w:lvlOverride>
   </w:num>
-  <w:num w:numId="2" w16cid:durableId="632251331">
+  <w:num w:numId="2" w16cid:durableId="231429347">
     <w:abstractNumId w:val="1"/>
     <w:lvlOverride w:ilvl="0">
       <w:startOverride w:val="1"/>
@@ -12364,7 +15114,7 @@
     <w:autoRedefine/>
     <w:uiPriority w:val="39"/>
     <w:unhideWhenUsed/>
-    <w:rsid w:val="000E3827"/>
+    <w:rsid w:val="007B1687"/>
     <w:pPr>
       <w:spacing w:after="100"/>
     </w:pPr>
@@ -12376,7 +15126,7 @@
     <w:autoRedefine/>
     <w:uiPriority w:val="39"/>
     <w:unhideWhenUsed/>
-    <w:rsid w:val="000E3827"/>
+    <w:rsid w:val="007B1687"/>
     <w:pPr>
       <w:spacing w:after="100"/>
       <w:ind w:left="200"/>

</xml_diff>